<commit_message>
Correct two counts in the Power Four FY2025 benchmarks brief
Co-Authored-By: Claude Fable 5.1 <noreply@anthropic.com>
Claude-Session: https://claude.ai/code/session_01VKikRW5GBV3qSjTxYi5jff
</commit_message>
<xml_diff>
--- a/reports/Power Four FY2025 benchmarks.docx
+++ b/reports/Power Four FY2025 benchmarks.docx
@@ -52,7 +52,7 @@
         </w:rPr>
         <w:t xml:space="preserve">Source links: </w:t>
       </w:r>
-      <w:hyperlink w:history="1" r:id="rIdnwqi44dh8ulnenmbupsqh">
+      <w:hyperlink w:history="1" r:id="rIdusavl5fu77ydk47dxoluy">
         <w:r>
           <w:rPr>
             <w:rFonts w:ascii="Arial" w:cs="Arial" w:eastAsia="Arial" w:hAnsi="Arial"/>
@@ -71,7 +71,7 @@
         </w:rPr>
         <w:t xml:space="preserve">; </w:t>
       </w:r>
-      <w:hyperlink w:history="1" r:id="rIdtdbawo0iyprqevp82jdle">
+      <w:hyperlink w:history="1" r:id="rIds27bvteleuwey4jimqh_o">
         <w:r>
           <w:rPr>
             <w:rFonts w:ascii="Arial" w:cs="Arial" w:eastAsia="Arial" w:hAnsi="Arial"/>
@@ -90,7 +90,7 @@
         </w:rPr>
         <w:t xml:space="preserve">; </w:t>
       </w:r>
-      <w:hyperlink w:history="1" r:id="rIdppwvp4px3flrtxnv2qjhx">
+      <w:hyperlink w:history="1" r:id="rIdpvwwktyrabbkgz9da8ogv">
         <w:r>
           <w:rPr>
             <w:rFonts w:ascii="Arial" w:cs="Arial" w:eastAsia="Arial" w:hAnsi="Arial"/>
@@ -109,7 +109,7 @@
         </w:rPr>
         <w:t xml:space="preserve">; </w:t>
       </w:r>
-      <w:hyperlink w:history="1" r:id="rId614bwrvjsjgnljtwu4uhs">
+      <w:hyperlink w:history="1" r:id="rIdsxf0puecxwd3fpc0-yksi">
         <w:r>
           <w:rPr>
             <w:rFonts w:ascii="Arial" w:cs="Arial" w:eastAsia="Arial" w:hAnsi="Arial"/>
@@ -128,7 +128,7 @@
         </w:rPr>
         <w:t xml:space="preserve">; </w:t>
       </w:r>
-      <w:hyperlink w:history="1" r:id="rIdvfhv0fuajbdybfpynfwnz">
+      <w:hyperlink w:history="1" r:id="rIdp_kdorsijm2j3vrkscpcp">
         <w:r>
           <w:rPr>
             <w:rFonts w:ascii="Arial" w:cs="Arial" w:eastAsia="Arial" w:hAnsi="Arial"/>
@@ -147,7 +147,7 @@
         </w:rPr>
         <w:t xml:space="preserve">; </w:t>
       </w:r>
-      <w:hyperlink w:history="1" r:id="rId-b1qtdwciz64nz7fvchdw">
+      <w:hyperlink w:history="1" r:id="rId8l5ixi0p4loka8pnzrqw8">
         <w:r>
           <w:rPr>
             <w:rFonts w:ascii="Arial" w:cs="Arial" w:eastAsia="Arial" w:hAnsi="Arial"/>
@@ -166,7 +166,7 @@
         </w:rPr>
         <w:t xml:space="preserve">; </w:t>
       </w:r>
-      <w:hyperlink w:history="1" r:id="rIdoqzntiwe51nnvywrwq2st">
+      <w:hyperlink w:history="1" r:id="rIdlik_bkdshnieq5i2rwnqk">
         <w:r>
           <w:rPr>
             <w:rFonts w:ascii="Arial" w:cs="Arial" w:eastAsia="Arial" w:hAnsi="Arial"/>
@@ -213,7 +213,7 @@
         </w:rPr>
         <w:t xml:space="preserve">Source links: </w:t>
       </w:r>
-      <w:hyperlink w:history="1" r:id="rIdzq1tbbfpf38qr0pnbpeeb">
+      <w:hyperlink w:history="1" r:id="rIdm8fsnaxideadrqt-vsvgn">
         <w:r>
           <w:rPr>
             <w:rFonts w:ascii="Arial" w:cs="Arial" w:eastAsia="Arial" w:hAnsi="Arial"/>
@@ -232,7 +232,7 @@
         </w:rPr>
         <w:t xml:space="preserve">; </w:t>
       </w:r>
-      <w:hyperlink w:history="1" r:id="rId7hhtusmdzqxl2frmm1ibr">
+      <w:hyperlink w:history="1" r:id="rId_buzac5tiqr9kntsx5rxz">
         <w:r>
           <w:rPr>
             <w:rFonts w:ascii="Arial" w:cs="Arial" w:eastAsia="Arial" w:hAnsi="Arial"/>
@@ -279,7 +279,7 @@
         </w:rPr>
         <w:t xml:space="preserve">Source link: </w:t>
       </w:r>
-      <w:hyperlink w:history="1" r:id="rIdstxjtygtuzvkg2i-ebfe2">
+      <w:hyperlink w:history="1" r:id="rIdjztnn-k9l5lonm6beicjm">
         <w:r>
           <w:rPr>
             <w:rFonts w:ascii="Arial" w:cs="Arial" w:eastAsia="Arial" w:hAnsi="Arial"/>
@@ -326,7 +326,7 @@
         </w:rPr>
         <w:t xml:space="preserve">Source links: </w:t>
       </w:r>
-      <w:hyperlink w:history="1" r:id="rIdb_jygt-3a_nw08pb9cozt">
+      <w:hyperlink w:history="1" r:id="rIdzn3b06nn7lcl3xpuj7nrh">
         <w:r>
           <w:rPr>
             <w:rFonts w:ascii="Arial" w:cs="Arial" w:eastAsia="Arial" w:hAnsi="Arial"/>
@@ -345,7 +345,7 @@
         </w:rPr>
         <w:t xml:space="preserve">; </w:t>
       </w:r>
-      <w:hyperlink w:history="1" r:id="rIdpbmtq8buyqclakmibt7if">
+      <w:hyperlink w:history="1" r:id="rIduyszpjlbgdrkh3tb3xojj">
         <w:r>
           <w:rPr>
             <w:rFonts w:ascii="Arial" w:cs="Arial" w:eastAsia="Arial" w:hAnsi="Arial"/>
@@ -407,7 +407,7 @@
         </w:rPr>
         <w:t xml:space="preserve">Source link: </w:t>
       </w:r>
-      <w:hyperlink w:history="1" r:id="rIdbvblwmdhax42a0iituont">
+      <w:hyperlink w:history="1" r:id="rIdlvkjkgwo02-ett8lx2iqb">
         <w:r>
           <w:rPr>
             <w:rFonts w:ascii="Arial" w:cs="Arial" w:eastAsia="Arial" w:hAnsi="Arial"/>
@@ -454,7 +454,7 @@
         </w:rPr>
         <w:t xml:space="preserve">Source links: </w:t>
       </w:r>
-      <w:hyperlink w:history="1" r:id="rIduuw2hihikhiawjkkmoc4g">
+      <w:hyperlink w:history="1" r:id="rIdmsw2i2uizu_hferr8yzhk">
         <w:r>
           <w:rPr>
             <w:rFonts w:ascii="Arial" w:cs="Arial" w:eastAsia="Arial" w:hAnsi="Arial"/>
@@ -473,7 +473,7 @@
         </w:rPr>
         <w:t xml:space="preserve">; </w:t>
       </w:r>
-      <w:hyperlink w:history="1" r:id="rIduzaf3qmbo1vvpaycysbxp">
+      <w:hyperlink w:history="1" r:id="rIdbcko8y2h5bn5wx-ifepvl">
         <w:r>
           <w:rPr>
             <w:rFonts w:ascii="Arial" w:cs="Arial" w:eastAsia="Arial" w:hAnsi="Arial"/>
@@ -492,7 +492,7 @@
         </w:rPr>
         <w:t xml:space="preserve">; </w:t>
       </w:r>
-      <w:hyperlink w:history="1" r:id="rIdfl-lnkt7wmyvosmr46r2b">
+      <w:hyperlink w:history="1" r:id="rIdejukokof6kco6x_5e8ubu">
         <w:r>
           <w:rPr>
             <w:rFonts w:ascii="Arial" w:cs="Arial" w:eastAsia="Arial" w:hAnsi="Arial"/>
@@ -539,7 +539,7 @@
         </w:rPr>
         <w:t xml:space="preserve">Source links: </w:t>
       </w:r>
-      <w:hyperlink w:history="1" r:id="rIduftt_2qf3xzepwlv_whic">
+      <w:hyperlink w:history="1" r:id="rIdqg0sa4n0qop4wq4mlq_tl">
         <w:r>
           <w:rPr>
             <w:rFonts w:ascii="Arial" w:cs="Arial" w:eastAsia="Arial" w:hAnsi="Arial"/>
@@ -558,7 +558,7 @@
         </w:rPr>
         <w:t xml:space="preserve">; </w:t>
       </w:r>
-      <w:hyperlink w:history="1" r:id="rId6rknkz5brlhlc03mbehsh">
+      <w:hyperlink w:history="1" r:id="rIdxw-tov9qclt0jm0mzu-nl">
         <w:r>
           <w:rPr>
             <w:rFonts w:ascii="Arial" w:cs="Arial" w:eastAsia="Arial" w:hAnsi="Arial"/>
@@ -605,7 +605,7 @@
         </w:rPr>
         <w:t xml:space="preserve">Source links: </w:t>
       </w:r>
-      <w:hyperlink w:history="1" r:id="rId8kadlrl_ob1_-9piy93y9">
+      <w:hyperlink w:history="1" r:id="rIdichgoe8-47x7hffkxm8js">
         <w:r>
           <w:rPr>
             <w:rFonts w:ascii="Arial" w:cs="Arial" w:eastAsia="Arial" w:hAnsi="Arial"/>
@@ -624,7 +624,7 @@
         </w:rPr>
         <w:t xml:space="preserve">; </w:t>
       </w:r>
-      <w:hyperlink w:history="1" r:id="rIdfdzhn5doazxtfq9gl3sxz">
+      <w:hyperlink w:history="1" r:id="rIdybaoa7rkcvvq_ckc5s_we">
         <w:r>
           <w:rPr>
             <w:rFonts w:ascii="Arial" w:cs="Arial" w:eastAsia="Arial" w:hAnsi="Arial"/>
@@ -671,7 +671,7 @@
         </w:rPr>
         <w:t xml:space="preserve">Source link: </w:t>
       </w:r>
-      <w:hyperlink w:history="1" r:id="rIdftrbu9kvqpjzwbi2ms_cv">
+      <w:hyperlink w:history="1" r:id="rId2m4lsgvqtdkez1vvq0ylf">
         <w:r>
           <w:rPr>
             <w:rFonts w:ascii="Arial" w:cs="Arial" w:eastAsia="Arial" w:hAnsi="Arial"/>
@@ -718,7 +718,7 @@
         </w:rPr>
         <w:t xml:space="preserve">Source links: </w:t>
       </w:r>
-      <w:hyperlink w:history="1" r:id="rIdiloii3qj9cwdcborfznjk">
+      <w:hyperlink w:history="1" r:id="rId0irlliitrsrln402awd9c">
         <w:r>
           <w:rPr>
             <w:rFonts w:ascii="Arial" w:cs="Arial" w:eastAsia="Arial" w:hAnsi="Arial"/>
@@ -737,7 +737,7 @@
         </w:rPr>
         <w:t xml:space="preserve">; </w:t>
       </w:r>
-      <w:hyperlink w:history="1" r:id="rIdffehv__0n4d4ew5e1gwir">
+      <w:hyperlink w:history="1" r:id="rIdo94d5ondr5v6pdos8yuwb">
         <w:r>
           <w:rPr>
             <w:rFonts w:ascii="Arial" w:cs="Arial" w:eastAsia="Arial" w:hAnsi="Arial"/>
@@ -784,7 +784,7 @@
         </w:rPr>
         <w:t xml:space="preserve">Source links: </w:t>
       </w:r>
-      <w:hyperlink w:history="1" r:id="rIdisfd24u3ydrbjlxc658gy">
+      <w:hyperlink w:history="1" r:id="rIdmnhrnrlrw_64kbrq7j0sz">
         <w:r>
           <w:rPr>
             <w:rFonts w:ascii="Arial" w:cs="Arial" w:eastAsia="Arial" w:hAnsi="Arial"/>
@@ -803,7 +803,7 @@
         </w:rPr>
         <w:t xml:space="preserve">; </w:t>
       </w:r>
-      <w:hyperlink w:history="1" r:id="rIddq5wlk3ce-uisimcjqq16">
+      <w:hyperlink w:history="1" r:id="rIdipigkdzqa8qekcukgfhqt">
         <w:r>
           <w:rPr>
             <w:rFonts w:ascii="Arial" w:cs="Arial" w:eastAsia="Arial" w:hAnsi="Arial"/>
@@ -822,7 +822,7 @@
         </w:rPr>
         <w:t xml:space="preserve">; </w:t>
       </w:r>
-      <w:hyperlink w:history="1" r:id="rId2y6ukq6d_u9lybb_7z7e5">
+      <w:hyperlink w:history="1" r:id="rIdqopkwrn-m97rsmp9wxrky">
         <w:r>
           <w:rPr>
             <w:rFonts w:ascii="Arial" w:cs="Arial" w:eastAsia="Arial" w:hAnsi="Arial"/>
@@ -841,7 +841,7 @@
         </w:rPr>
         <w:t xml:space="preserve">; </w:t>
       </w:r>
-      <w:hyperlink w:history="1" r:id="rIdom_i9ebmsotdivbkb7cna">
+      <w:hyperlink w:history="1" r:id="rIdar6h63_lyayacapipskwl">
         <w:r>
           <w:rPr>
             <w:rFonts w:ascii="Arial" w:cs="Arial" w:eastAsia="Arial" w:hAnsi="Arial"/>
@@ -888,7 +888,7 @@
         </w:rPr>
         <w:t xml:space="preserve">Source links: </w:t>
       </w:r>
-      <w:hyperlink w:history="1" r:id="rId_r1j6jui8vkafxldubgzz">
+      <w:hyperlink w:history="1" r:id="rId-vnapomrjkragaozbjywd">
         <w:r>
           <w:rPr>
             <w:rFonts w:ascii="Arial" w:cs="Arial" w:eastAsia="Arial" w:hAnsi="Arial"/>
@@ -907,7 +907,7 @@
         </w:rPr>
         <w:t xml:space="preserve">; </w:t>
       </w:r>
-      <w:hyperlink w:history="1" r:id="rIdsqdsf5fwm0sebbmnkfljc">
+      <w:hyperlink w:history="1" r:id="rIdibwg0yao052rlknlm4jua">
         <w:r>
           <w:rPr>
             <w:rFonts w:ascii="Arial" w:cs="Arial" w:eastAsia="Arial" w:hAnsi="Arial"/>
@@ -926,7 +926,7 @@
         </w:rPr>
         <w:t xml:space="preserve">; </w:t>
       </w:r>
-      <w:hyperlink w:history="1" r:id="rIdvq8-q_5pq_xl88pix3h-i">
+      <w:hyperlink w:history="1" r:id="rIdvdaosrxjzaerbkhijr1me">
         <w:r>
           <w:rPr>
             <w:rFonts w:ascii="Arial" w:cs="Arial" w:eastAsia="Arial" w:hAnsi="Arial"/>
@@ -945,7 +945,7 @@
         </w:rPr>
         <w:t xml:space="preserve">; </w:t>
       </w:r>
-      <w:hyperlink w:history="1" r:id="rIdnishbnkckfcmul6pili1v">
+      <w:hyperlink w:history="1" r:id="rIdl4jf7a4uymk4p5nprv7wj">
         <w:r>
           <w:rPr>
             <w:rFonts w:ascii="Arial" w:cs="Arial" w:eastAsia="Arial" w:hAnsi="Arial"/>
@@ -964,7 +964,7 @@
         </w:rPr>
         <w:t xml:space="preserve">; </w:t>
       </w:r>
-      <w:hyperlink w:history="1" r:id="rIdluon0_w1a3khsqvvepshy">
+      <w:hyperlink w:history="1" r:id="rId8nexh6ikfxbbjcztywtdj">
         <w:r>
           <w:rPr>
             <w:rFonts w:ascii="Arial" w:cs="Arial" w:eastAsia="Arial" w:hAnsi="Arial"/>
@@ -983,7 +983,7 @@
         </w:rPr>
         <w:t xml:space="preserve">; </w:t>
       </w:r>
-      <w:hyperlink w:history="1" r:id="rIdltf2se-6bjpjs_d4nsvaq">
+      <w:hyperlink w:history="1" r:id="rIdoespt41rxwhjn1ymfag2h">
         <w:r>
           <w:rPr>
             <w:rFonts w:ascii="Arial" w:cs="Arial" w:eastAsia="Arial" w:hAnsi="Arial"/>
@@ -1002,7 +1002,7 @@
         </w:rPr>
         <w:t xml:space="preserve">; </w:t>
       </w:r>
-      <w:hyperlink w:history="1" r:id="rId74n-j3mddroyoekdlhi4r">
+      <w:hyperlink w:history="1" r:id="rId3st8lxncib9vkiyni0-fq">
         <w:r>
           <w:rPr>
             <w:rFonts w:ascii="Arial" w:cs="Arial" w:eastAsia="Arial" w:hAnsi="Arial"/>
@@ -1021,7 +1021,7 @@
         </w:rPr>
         <w:t xml:space="preserve">; </w:t>
       </w:r>
-      <w:hyperlink w:history="1" r:id="rIdntc3g5blcnvggjqwbk0d7">
+      <w:hyperlink w:history="1" r:id="rId9v-sncjvdodsjyvdcochf">
         <w:r>
           <w:rPr>
             <w:rFonts w:ascii="Arial" w:cs="Arial" w:eastAsia="Arial" w:hAnsi="Arial"/>
@@ -1083,7 +1083,7 @@
         </w:rPr>
         <w:t xml:space="preserve">Source link: </w:t>
       </w:r>
-      <w:hyperlink w:history="1" r:id="rIddbisdpvelticesl-wrleu">
+      <w:hyperlink w:history="1" r:id="rId12o9jgswllscla0ogzwge">
         <w:r>
           <w:rPr>
             <w:rFonts w:ascii="Arial" w:cs="Arial" w:eastAsia="Arial" w:hAnsi="Arial"/>
@@ -1130,7 +1130,7 @@
         </w:rPr>
         <w:t xml:space="preserve">Source link: </w:t>
       </w:r>
-      <w:hyperlink w:history="1" r:id="rIdfxq78no3i6su0wzhaqq75">
+      <w:hyperlink w:history="1" r:id="rId-d2-pkg7z-5chv6c87x6b">
         <w:r>
           <w:rPr>
             <w:rFonts w:ascii="Arial" w:cs="Arial" w:eastAsia="Arial" w:hAnsi="Arial"/>
@@ -1177,7 +1177,7 @@
         </w:rPr>
         <w:t xml:space="preserve">Source links: </w:t>
       </w:r>
-      <w:hyperlink w:history="1" r:id="rIdjpg0xs1ljvu__3kxtgpbu">
+      <w:hyperlink w:history="1" r:id="rIdp_fwt1ug3uluhhn8l2btn">
         <w:r>
           <w:rPr>
             <w:rFonts w:ascii="Arial" w:cs="Arial" w:eastAsia="Arial" w:hAnsi="Arial"/>
@@ -1196,7 +1196,7 @@
         </w:rPr>
         <w:t xml:space="preserve">; </w:t>
       </w:r>
-      <w:hyperlink w:history="1" r:id="rIduwwsmqdqafxknho9spjx8">
+      <w:hyperlink w:history="1" r:id="rIdqxhuk00dgzot1cpykg1g0">
         <w:r>
           <w:rPr>
             <w:rFonts w:ascii="Arial" w:cs="Arial" w:eastAsia="Arial" w:hAnsi="Arial"/>
@@ -1243,7 +1243,7 @@
         </w:rPr>
         <w:t xml:space="preserve">Source link: </w:t>
       </w:r>
-      <w:hyperlink w:history="1" r:id="rIdbttxonfg4miqqvlj_k6jm">
+      <w:hyperlink w:history="1" r:id="rIdnw2q9gdd9sn8ynfoitzjv">
         <w:r>
           <w:rPr>
             <w:rFonts w:ascii="Arial" w:cs="Arial" w:eastAsia="Arial" w:hAnsi="Arial"/>
@@ -1290,7 +1290,7 @@
         </w:rPr>
         <w:t xml:space="preserve">Source links: </w:t>
       </w:r>
-      <w:hyperlink w:history="1" r:id="rIdnptewcljz4unlykyjtvhh">
+      <w:hyperlink w:history="1" r:id="rIdwhtqjziq0ikuzbc5erdts">
         <w:r>
           <w:rPr>
             <w:rFonts w:ascii="Arial" w:cs="Arial" w:eastAsia="Arial" w:hAnsi="Arial"/>
@@ -1309,7 +1309,7 @@
         </w:rPr>
         <w:t xml:space="preserve">; </w:t>
       </w:r>
-      <w:hyperlink w:history="1" r:id="rIdowm3okmja3txyoma3vqgx">
+      <w:hyperlink w:history="1" r:id="rIdfx9out1m9ajsm8sjemega">
         <w:r>
           <w:rPr>
             <w:rFonts w:ascii="Arial" w:cs="Arial" w:eastAsia="Arial" w:hAnsi="Arial"/>
@@ -1356,7 +1356,7 @@
         </w:rPr>
         <w:t xml:space="preserve">Source links: </w:t>
       </w:r>
-      <w:hyperlink w:history="1" r:id="rIdnkrk3wrpn96e0jdn0bvdd">
+      <w:hyperlink w:history="1" r:id="rIdmdszd3w44fnbmjkd84a5q">
         <w:r>
           <w:rPr>
             <w:rFonts w:ascii="Arial" w:cs="Arial" w:eastAsia="Arial" w:hAnsi="Arial"/>
@@ -1375,7 +1375,7 @@
         </w:rPr>
         <w:t xml:space="preserve">; </w:t>
       </w:r>
-      <w:hyperlink w:history="1" r:id="rIdk4zcpvnnnxzwrmhskgwxy">
+      <w:hyperlink w:history="1" r:id="rIdw3fxhvoime6hiqhx-gj0j">
         <w:r>
           <w:rPr>
             <w:rFonts w:ascii="Arial" w:cs="Arial" w:eastAsia="Arial" w:hAnsi="Arial"/>
@@ -1394,7 +1394,7 @@
         </w:rPr>
         <w:t xml:space="preserve">; </w:t>
       </w:r>
-      <w:hyperlink w:history="1" r:id="rIdjlcqjoipf1uh5xtoqazj4">
+      <w:hyperlink w:history="1" r:id="rIdjhp2sg_tj41oof_-ts0l1">
         <w:r>
           <w:rPr>
             <w:rFonts w:ascii="Arial" w:cs="Arial" w:eastAsia="Arial" w:hAnsi="Arial"/>
@@ -1413,7 +1413,7 @@
         </w:rPr>
         <w:t xml:space="preserve">; </w:t>
       </w:r>
-      <w:hyperlink w:history="1" r:id="rIddlwtjhd7qo2mnldjbzn2l">
+      <w:hyperlink w:history="1" r:id="rIdvvz4iq3hu4qkaf4ybenyk">
         <w:r>
           <w:rPr>
             <w:rFonts w:ascii="Arial" w:cs="Arial" w:eastAsia="Arial" w:hAnsi="Arial"/>
@@ -1460,7 +1460,7 @@
         </w:rPr>
         <w:t xml:space="preserve">Source link: </w:t>
       </w:r>
-      <w:hyperlink w:history="1" r:id="rIdtg_cqv22hr2ejh-gvuqdo">
+      <w:hyperlink w:history="1" r:id="rIdstt1ru_d-guk57vramyci">
         <w:r>
           <w:rPr>
             <w:rFonts w:ascii="Arial" w:cs="Arial" w:eastAsia="Arial" w:hAnsi="Arial"/>
@@ -1522,7 +1522,7 @@
         </w:rPr>
         <w:t xml:space="preserve">Source link: </w:t>
       </w:r>
-      <w:hyperlink w:history="1" r:id="rIdtc1dj_lyvpur-vzbcryxf">
+      <w:hyperlink w:history="1" r:id="rIdfqh79cmcdw5dybk696ayd">
         <w:r>
           <w:rPr>
             <w:rFonts w:ascii="Arial" w:cs="Arial" w:eastAsia="Arial" w:hAnsi="Arial"/>
@@ -1569,7 +1569,7 @@
         </w:rPr>
         <w:t xml:space="preserve">Source link: </w:t>
       </w:r>
-      <w:hyperlink w:history="1" r:id="rId7lbn3cyniwlswtnh26k07">
+      <w:hyperlink w:history="1" r:id="rIdr8w__kv46f1mnxfpuqyjl">
         <w:r>
           <w:rPr>
             <w:rFonts w:ascii="Arial" w:cs="Arial" w:eastAsia="Arial" w:hAnsi="Arial"/>
@@ -1596,7 +1596,7 @@
           <w:sz w:val="20"/>
           <w:szCs w:val="20"/>
         </w:rPr>
-        <w:t xml:space="preserve">Top of the table: Texas $352.5M, Ohio State $336.1M, Tennessee $304.1M, Michigan $275.8M, Alabama $267.4M, Penn State $254.9M, Texas A&amp;M $235.5M, Georgia $233.5M, LSU $223.5M, Florida $221.0M. Ten public schools now clear $200M; none did five years ago.</w:t>
+        <w:t xml:space="preserve">Top of the table: Texas $352.5M, Ohio State $336.1M, Tennessee $304.1M, Michigan $275.8M, Alabama $267.4M, Penn State $254.9M, Texas A&amp;M $235.5M, Georgia $233.5M, LSU $223.5M, Florida $221.0M. Fifteen public schools cleared $200M in FY2025.</w:t>
       </w:r>
     </w:p>
     <w:p>
@@ -1616,7 +1616,7 @@
         </w:rPr>
         <w:t xml:space="preserve">Source links: </w:t>
       </w:r>
-      <w:hyperlink w:history="1" r:id="rIdoq9dc2srgeyhgjj9sk4l8">
+      <w:hyperlink w:history="1" r:id="rId9plpusitmsxsp7qt_rds3">
         <w:r>
           <w:rPr>
             <w:rFonts w:ascii="Arial" w:cs="Arial" w:eastAsia="Arial" w:hAnsi="Arial"/>
@@ -1635,7 +1635,7 @@
         </w:rPr>
         <w:t xml:space="preserve">; </w:t>
       </w:r>
-      <w:hyperlink w:history="1" r:id="rIdsv3kbonnoxh9uo_lyahra">
+      <w:hyperlink w:history="1" r:id="rIdu0fmr2lt88cqbokpbq2tb">
         <w:r>
           <w:rPr>
             <w:rFonts w:ascii="Arial" w:cs="Arial" w:eastAsia="Arial" w:hAnsi="Arial"/>
@@ -1682,7 +1682,7 @@
         </w:rPr>
         <w:t xml:space="preserve">Source link: </w:t>
       </w:r>
-      <w:hyperlink w:history="1" r:id="rIdfadq6toiruzeq9wk4mff0">
+      <w:hyperlink w:history="1" r:id="rIdxor-yhbw9kenkd8acwekk">
         <w:r>
           <w:rPr>
             <w:rFonts w:ascii="Arial" w:cs="Arial" w:eastAsia="Arial" w:hAnsi="Arial"/>
@@ -1729,7 +1729,7 @@
         </w:rPr>
         <w:t xml:space="preserve">Source link: </w:t>
       </w:r>
-      <w:hyperlink w:history="1" r:id="rIdccx_mw94abcuv6ngt-lwx">
+      <w:hyperlink w:history="1" r:id="rIddhosmbdqt-ddaew--zupv">
         <w:r>
           <w:rPr>
             <w:rFonts w:ascii="Arial" w:cs="Arial" w:eastAsia="Arial" w:hAnsi="Arial"/>
@@ -1776,7 +1776,7 @@
         </w:rPr>
         <w:t xml:space="preserve">Source links: </w:t>
       </w:r>
-      <w:hyperlink w:history="1" r:id="rIdnv5qd2orfpjue_2-irwuj">
+      <w:hyperlink w:history="1" r:id="rIdhekxymb7w8-n9aq_ksx-s">
         <w:r>
           <w:rPr>
             <w:rFonts w:ascii="Arial" w:cs="Arial" w:eastAsia="Arial" w:hAnsi="Arial"/>
@@ -1795,7 +1795,7 @@
         </w:rPr>
         <w:t xml:space="preserve">; </w:t>
       </w:r>
-      <w:hyperlink w:history="1" r:id="rIdpqmcnvvn306kfzzx6gabn">
+      <w:hyperlink w:history="1" r:id="rIdzxhdirup2wmu_kywsj_yl">
         <w:r>
           <w:rPr>
             <w:rFonts w:ascii="Arial" w:cs="Arial" w:eastAsia="Arial" w:hAnsi="Arial"/>
@@ -1814,7 +1814,7 @@
         </w:rPr>
         <w:t xml:space="preserve">; </w:t>
       </w:r>
-      <w:hyperlink w:history="1" r:id="rIdo7oxbub6frystg4t3qpiu">
+      <w:hyperlink w:history="1" r:id="rId61r6slf9rold12qd1uezq">
         <w:r>
           <w:rPr>
             <w:rFonts w:ascii="Arial" w:cs="Arial" w:eastAsia="Arial" w:hAnsi="Arial"/>
@@ -1861,7 +1861,7 @@
         </w:rPr>
         <w:t xml:space="preserve">Source link: </w:t>
       </w:r>
-      <w:hyperlink w:history="1" r:id="rIdryjf0w_qpdof3i0oqj4cn">
+      <w:hyperlink w:history="1" r:id="rIdr_dvg1tkanjtizybaoxf4">
         <w:r>
           <w:rPr>
             <w:rFonts w:ascii="Arial" w:cs="Arial" w:eastAsia="Arial" w:hAnsi="Arial"/>
@@ -1908,7 +1908,7 @@
         </w:rPr>
         <w:t xml:space="preserve">Source links: </w:t>
       </w:r>
-      <w:hyperlink w:history="1" r:id="rId57k0w6wffiqb8jwh2npke">
+      <w:hyperlink w:history="1" r:id="rIdtiz2hz13vzospn-349rj1">
         <w:r>
           <w:rPr>
             <w:rFonts w:ascii="Arial" w:cs="Arial" w:eastAsia="Arial" w:hAnsi="Arial"/>
@@ -1927,7 +1927,7 @@
         </w:rPr>
         <w:t xml:space="preserve">; </w:t>
       </w:r>
-      <w:hyperlink w:history="1" r:id="rIdnpqjuw5hko8gjxy1qpmxg">
+      <w:hyperlink w:history="1" r:id="rIdzz-h-ykzottxuz7f1rjbp">
         <w:r>
           <w:rPr>
             <w:rFonts w:ascii="Arial" w:cs="Arial" w:eastAsia="Arial" w:hAnsi="Arial"/>
@@ -1969,7 +1969,7 @@
           <w:sz w:val="20"/>
           <w:szCs w:val="20"/>
         </w:rPr>
-        <w:t xml:space="preserve">About 22. Per the NCAA membership directory's "sponsored sports" listing for 2026-27, the 68 Power Four schools sponsor a mean of 21.7 and a median of 21 varsity sports, ranging from 16 (Kansas State, UCF, Mississippi State) to 37 (Stanford). We pulled all 68 school pages on Oct 27, 2026.</w:t>
+        <w:t xml:space="preserve">About 22. Per the NCAA membership directory's "sponsored sports" listing for 2026-27, the 68 Power Four schools sponsor a mean of 21.7 and a median of 21 varsity sports, ranging from 16 (Kansas State, UCF, Mississippi State) to 37 (Stanford, which its own site counts as 36). We pulled all 68 school pages on Oct 27, 2026.</w:t>
       </w:r>
     </w:p>
     <w:p>
@@ -1989,7 +1989,7 @@
         </w:rPr>
         <w:t xml:space="preserve">Source links: </w:t>
       </w:r>
-      <w:hyperlink w:history="1" r:id="rIdidmixcip667yp6liqc-6g">
+      <w:hyperlink w:history="1" r:id="rId9w8_1e8lhega18kgtbdpl">
         <w:r>
           <w:rPr>
             <w:rFonts w:ascii="Arial" w:cs="Arial" w:eastAsia="Arial" w:hAnsi="Arial"/>
@@ -2008,7 +2008,7 @@
         </w:rPr>
         <w:t xml:space="preserve">; </w:t>
       </w:r>
-      <w:hyperlink w:history="1" r:id="rIddogwebjdjiglycfvjdsvs">
+      <w:hyperlink w:history="1" r:id="rId2tvxk1a2mcftzcxnn7fhp">
         <w:r>
           <w:rPr>
             <w:rFonts w:ascii="Arial" w:cs="Arial" w:eastAsia="Arial" w:hAnsi="Arial"/>
@@ -2027,7 +2027,7 @@
         </w:rPr>
         <w:t xml:space="preserve">; </w:t>
       </w:r>
-      <w:hyperlink w:history="1" r:id="rIdqehyn7wdcuggoke0sve_s">
+      <w:hyperlink w:history="1" r:id="rIdrq5md-k897m26nlmh3jp9">
         <w:r>
           <w:rPr>
             <w:rFonts w:ascii="Arial" w:cs="Arial" w:eastAsia="Arial" w:hAnsi="Arial"/>
@@ -2074,7 +2074,7 @@
         </w:rPr>
         <w:t xml:space="preserve">Source link: </w:t>
       </w:r>
-      <w:hyperlink w:history="1" r:id="rIdmbrn0de6j7gu1glsg9lq6">
+      <w:hyperlink w:history="1" r:id="rIdt4g7jprooi40givetg79x">
         <w:r>
           <w:rPr>
             <w:rFonts w:ascii="Arial" w:cs="Arial" w:eastAsia="Arial" w:hAnsi="Arial"/>
@@ -2121,7 +2121,7 @@
         </w:rPr>
         <w:t xml:space="preserve">Source link: </w:t>
       </w:r>
-      <w:hyperlink w:history="1" r:id="rIdrlss3p-oygd-blldymepz">
+      <w:hyperlink w:history="1" r:id="rIdonmei1xom8vyl6hqmes-a">
         <w:r>
           <w:rPr>
             <w:rFonts w:ascii="Arial" w:cs="Arial" w:eastAsia="Arial" w:hAnsi="Arial"/>
@@ -2148,7 +2148,7 @@
           <w:sz w:val="20"/>
           <w:szCs w:val="20"/>
         </w:rPr>
-        <w:t xml:space="preserve">The floor is 16. FBS members must sponsor at least 16 varsity sports including football, with at least six men's or mixed and eight women's sports, and the bylaw allows no waivers. Fifteen Power Four schools sit at 16 to 18, with little room to cut.</w:t>
+        <w:t xml:space="preserve">The floor is 16. FBS members must sponsor at least 16 varsity sports including football, with at least six men's or mixed and eight women's sports, and the bylaw allows no waivers. Seventeen Power Four schools sit at 16 to 18 sports, with little room to cut.</w:t>
       </w:r>
     </w:p>
     <w:p>
@@ -2168,7 +2168,7 @@
         </w:rPr>
         <w:t xml:space="preserve">Source link: </w:t>
       </w:r>
-      <w:hyperlink w:history="1" r:id="rIdnhiidmr7ymg8poadwgdua">
+      <w:hyperlink w:history="1" r:id="rIdv8hfpfxl4npnaklemoiya">
         <w:r>
           <w:rPr>
             <w:rFonts w:ascii="Arial" w:cs="Arial" w:eastAsia="Arial" w:hAnsi="Arial"/>
@@ -2215,7 +2215,7 @@
         </w:rPr>
         <w:t xml:space="preserve">Source links: </w:t>
       </w:r>
-      <w:hyperlink w:history="1" r:id="rIdiahet2pn9v2bw-6ez7wvy">
+      <w:hyperlink w:history="1" r:id="rIdkjxso4os5heo_ogda9mo4">
         <w:r>
           <w:rPr>
             <w:rFonts w:ascii="Arial" w:cs="Arial" w:eastAsia="Arial" w:hAnsi="Arial"/>
@@ -2234,7 +2234,7 @@
         </w:rPr>
         <w:t xml:space="preserve">; </w:t>
       </w:r>
-      <w:hyperlink w:history="1" r:id="rId8fonxvvjq5hmp4fqqaail">
+      <w:hyperlink w:history="1" r:id="rIdmgjb14jymknq7lw9ocpgt">
         <w:r>
           <w:rPr>
             <w:rFonts w:ascii="Arial" w:cs="Arial" w:eastAsia="Arial" w:hAnsi="Arial"/>
@@ -2253,7 +2253,7 @@
         </w:rPr>
         <w:t xml:space="preserve">; </w:t>
       </w:r>
-      <w:hyperlink w:history="1" r:id="rId-3eqpi7bnbzfwhjqgxtnc">
+      <w:hyperlink w:history="1" r:id="rIdoskxlilgiw7-fr8sik76n">
         <w:r>
           <w:rPr>
             <w:rFonts w:ascii="Arial" w:cs="Arial" w:eastAsia="Arial" w:hAnsi="Arial"/>
@@ -2300,7 +2300,7 @@
         </w:rPr>
         <w:t xml:space="preserve">Source link: </w:t>
       </w:r>
-      <w:hyperlink w:history="1" r:id="rIddwrdjkzlctvcpsysjqjfr">
+      <w:hyperlink w:history="1" r:id="rIdhwvmvcxaml1khicfti17z">
         <w:r>
           <w:rPr>
             <w:rFonts w:ascii="Arial" w:cs="Arial" w:eastAsia="Arial" w:hAnsi="Arial"/>
@@ -2347,7 +2347,7 @@
         </w:rPr>
         <w:t xml:space="preserve">Source links: </w:t>
       </w:r>
-      <w:hyperlink w:history="1" r:id="rIdwf-xftsfz0ldsjmbteo_-">
+      <w:hyperlink w:history="1" r:id="rIdpa65ghex9y3f29ooff1hy">
         <w:r>
           <w:rPr>
             <w:rFonts w:ascii="Arial" w:cs="Arial" w:eastAsia="Arial" w:hAnsi="Arial"/>
@@ -2366,7 +2366,7 @@
         </w:rPr>
         <w:t xml:space="preserve">; </w:t>
       </w:r>
-      <w:hyperlink w:history="1" r:id="rIdiw4ntvrotwal2zna5kd5i">
+      <w:hyperlink w:history="1" r:id="rIdizw158aace-wuplsxzycg">
         <w:r>
           <w:rPr>
             <w:rFonts w:ascii="Arial" w:cs="Arial" w:eastAsia="Arial" w:hAnsi="Arial"/>
@@ -2385,7 +2385,7 @@
         </w:rPr>
         <w:t xml:space="preserve">; </w:t>
       </w:r>
-      <w:hyperlink w:history="1" r:id="rIdeg6jejsee_nzyzaqr6pts">
+      <w:hyperlink w:history="1" r:id="rId1lxujavnjh8a1fmzvklek">
         <w:r>
           <w:rPr>
             <w:rFonts w:ascii="Arial" w:cs="Arial" w:eastAsia="Arial" w:hAnsi="Arial"/>
@@ -2404,7 +2404,7 @@
         </w:rPr>
         <w:t xml:space="preserve">; </w:t>
       </w:r>
-      <w:hyperlink w:history="1" r:id="rIdehsoz4u-mbl2g45jbyhdk">
+      <w:hyperlink w:history="1" r:id="rIdpn4hrreos5qvbnbjrsiie">
         <w:r>
           <w:rPr>
             <w:rFonts w:ascii="Arial" w:cs="Arial" w:eastAsia="Arial" w:hAnsi="Arial"/>
@@ -2871,7 +2871,7 @@
             </w:tcMar>
           </w:tcPr>
           <w:p>
-            <w:hyperlink w:history="1" r:id="rIdf6vzavy23mholemk98fup">
+            <w:hyperlink w:history="1" r:id="rIdcmhk_yoeovxtryuutxao-">
               <w:r>
                 <w:rPr>
                   <w:rFonts w:ascii="Arial" w:cs="Arial" w:eastAsia="Arial" w:hAnsi="Arial"/>
@@ -3081,7 +3081,7 @@
             </w:tcMar>
           </w:tcPr>
           <w:p>
-            <w:hyperlink w:history="1" r:id="rIdf0x-vgzcvws6jjin5zknt">
+            <w:hyperlink w:history="1" r:id="rIdc48bkuczk7pt9kn9oo3wx">
               <w:r>
                 <w:rPr>
                   <w:rFonts w:ascii="Arial" w:cs="Arial" w:eastAsia="Arial" w:hAnsi="Arial"/>
@@ -3291,7 +3291,7 @@
             </w:tcMar>
           </w:tcPr>
           <w:p>
-            <w:hyperlink w:history="1" r:id="rIdxnuprr0rrtjrleshck9ek">
+            <w:hyperlink w:history="1" r:id="rIdedlfy9pcxypmnhe9zxjxq">
               <w:r>
                 <w:rPr>
                   <w:rFonts w:ascii="Arial" w:cs="Arial" w:eastAsia="Arial" w:hAnsi="Arial"/>
@@ -3501,7 +3501,7 @@
             </w:tcMar>
           </w:tcPr>
           <w:p>
-            <w:hyperlink w:history="1" r:id="rIdw2ad7dr5plhqnapajusmq">
+            <w:hyperlink w:history="1" r:id="rIdib9acvnf2ts3vvrtclx6s">
               <w:r>
                 <w:rPr>
                   <w:rFonts w:ascii="Arial" w:cs="Arial" w:eastAsia="Arial" w:hAnsi="Arial"/>
@@ -3711,7 +3711,7 @@
             </w:tcMar>
           </w:tcPr>
           <w:p>
-            <w:hyperlink w:history="1" r:id="rIdrwygygklfrbcrlmnm1gkf">
+            <w:hyperlink w:history="1" r:id="rIdbgfyyjajdhtrehloawvnq">
               <w:r>
                 <w:rPr>
                   <w:rFonts w:ascii="Arial" w:cs="Arial" w:eastAsia="Arial" w:hAnsi="Arial"/>
@@ -3921,7 +3921,7 @@
             </w:tcMar>
           </w:tcPr>
           <w:p>
-            <w:hyperlink w:history="1" r:id="rIdeppklsvegppo9xq0zo-hh">
+            <w:hyperlink w:history="1" r:id="rIdoyhri-oel-wxdbiww55vg">
               <w:r>
                 <w:rPr>
                   <w:rFonts w:ascii="Arial" w:cs="Arial" w:eastAsia="Arial" w:hAnsi="Arial"/>
@@ -4131,7 +4131,7 @@
             </w:tcMar>
           </w:tcPr>
           <w:p>
-            <w:hyperlink w:history="1" r:id="rIdr5jrm1km7qomt3q1awhto">
+            <w:hyperlink w:history="1" r:id="rIdvd3r7f-tmoohdnv_9b9au">
               <w:r>
                 <w:rPr>
                   <w:rFonts w:ascii="Arial" w:cs="Arial" w:eastAsia="Arial" w:hAnsi="Arial"/>
@@ -4341,7 +4341,7 @@
             </w:tcMar>
           </w:tcPr>
           <w:p>
-            <w:hyperlink w:history="1" r:id="rIdyqqdack5ziy6pmlfiqcwt">
+            <w:hyperlink w:history="1" r:id="rIddsuroa1gv0dcpqephoyxh">
               <w:r>
                 <w:rPr>
                   <w:rFonts w:ascii="Arial" w:cs="Arial" w:eastAsia="Arial" w:hAnsi="Arial"/>
@@ -4551,7 +4551,7 @@
             </w:tcMar>
           </w:tcPr>
           <w:p>
-            <w:hyperlink w:history="1" r:id="rIdlhi8rcnu5tbye0xbxwao9">
+            <w:hyperlink w:history="1" r:id="rId6ea4ilw5q6r1mxp9pbm1s">
               <w:r>
                 <w:rPr>
                   <w:rFonts w:ascii="Arial" w:cs="Arial" w:eastAsia="Arial" w:hAnsi="Arial"/>
@@ -4761,7 +4761,7 @@
             </w:tcMar>
           </w:tcPr>
           <w:p>
-            <w:hyperlink w:history="1" r:id="rIduthcrsfgzjn1n2_i6ky9e">
+            <w:hyperlink w:history="1" r:id="rId8q2vrj8mjgtxggk0vykic">
               <w:r>
                 <w:rPr>
                   <w:rFonts w:ascii="Arial" w:cs="Arial" w:eastAsia="Arial" w:hAnsi="Arial"/>
@@ -4971,7 +4971,7 @@
             </w:tcMar>
           </w:tcPr>
           <w:p>
-            <w:hyperlink w:history="1" r:id="rIdhgvxad4sa0vmobxqt9zvh">
+            <w:hyperlink w:history="1" r:id="rIdve2meycwqi_uvjoqg1w4l">
               <w:r>
                 <w:rPr>
                   <w:rFonts w:ascii="Arial" w:cs="Arial" w:eastAsia="Arial" w:hAnsi="Arial"/>
@@ -5181,7 +5181,7 @@
             </w:tcMar>
           </w:tcPr>
           <w:p>
-            <w:hyperlink w:history="1" r:id="rIdnf1uji-skivcg7jqajnkg">
+            <w:hyperlink w:history="1" r:id="rIddx_ltt0kf3td_bxjnbioo">
               <w:r>
                 <w:rPr>
                   <w:rFonts w:ascii="Arial" w:cs="Arial" w:eastAsia="Arial" w:hAnsi="Arial"/>
@@ -5391,7 +5391,7 @@
             </w:tcMar>
           </w:tcPr>
           <w:p>
-            <w:hyperlink w:history="1" r:id="rIdmgmjivxwipiayuttupzdo">
+            <w:hyperlink w:history="1" r:id="rIdrxq_waggr6urnfboyphmt">
               <w:r>
                 <w:rPr>
                   <w:rFonts w:ascii="Arial" w:cs="Arial" w:eastAsia="Arial" w:hAnsi="Arial"/>
@@ -5601,7 +5601,7 @@
             </w:tcMar>
           </w:tcPr>
           <w:p>
-            <w:hyperlink w:history="1" r:id="rIdeelfcpw1xcvnj40eqxqdn">
+            <w:hyperlink w:history="1" r:id="rIdp1kgiqvmy9j_hyftsfvr_">
               <w:r>
                 <w:rPr>
                   <w:rFonts w:ascii="Arial" w:cs="Arial" w:eastAsia="Arial" w:hAnsi="Arial"/>
@@ -5811,7 +5811,7 @@
             </w:tcMar>
           </w:tcPr>
           <w:p>
-            <w:hyperlink w:history="1" r:id="rId8g6mgjz7tb-hirlzok7rb">
+            <w:hyperlink w:history="1" r:id="rIduo29wkavlazwh-w8--r3w">
               <w:r>
                 <w:rPr>
                   <w:rFonts w:ascii="Arial" w:cs="Arial" w:eastAsia="Arial" w:hAnsi="Arial"/>
@@ -6021,7 +6021,7 @@
             </w:tcMar>
           </w:tcPr>
           <w:p>
-            <w:hyperlink w:history="1" r:id="rId-uur3czbkqw_fhaiwvvyv">
+            <w:hyperlink w:history="1" r:id="rIdsosu7zbsrpn8vpsg445pj">
               <w:r>
                 <w:rPr>
                   <w:rFonts w:ascii="Arial" w:cs="Arial" w:eastAsia="Arial" w:hAnsi="Arial"/>
@@ -6231,7 +6231,7 @@
             </w:tcMar>
           </w:tcPr>
           <w:p>
-            <w:hyperlink w:history="1" r:id="rIdt28hkw5klg21bhdjgnlvl">
+            <w:hyperlink w:history="1" r:id="rIdudg1h0wguaa-ifi3a0xbr">
               <w:r>
                 <w:rPr>
                   <w:rFonts w:ascii="Arial" w:cs="Arial" w:eastAsia="Arial" w:hAnsi="Arial"/>
@@ -6441,7 +6441,7 @@
             </w:tcMar>
           </w:tcPr>
           <w:p>
-            <w:hyperlink w:history="1" r:id="rIdeakpnhl8j3jic-3lnk-jo">
+            <w:hyperlink w:history="1" r:id="rIdjx01bbrqowt1mcunp3act">
               <w:r>
                 <w:rPr>
                   <w:rFonts w:ascii="Arial" w:cs="Arial" w:eastAsia="Arial" w:hAnsi="Arial"/>
@@ -6651,7 +6651,7 @@
             </w:tcMar>
           </w:tcPr>
           <w:p>
-            <w:hyperlink w:history="1" r:id="rIdde1yr5o8vunzyovjbhath">
+            <w:hyperlink w:history="1" r:id="rIdvsfuisjd1nqxhrcdlnrwg">
               <w:r>
                 <w:rPr>
                   <w:rFonts w:ascii="Arial" w:cs="Arial" w:eastAsia="Arial" w:hAnsi="Arial"/>
@@ -6861,7 +6861,7 @@
             </w:tcMar>
           </w:tcPr>
           <w:p>
-            <w:hyperlink w:history="1" r:id="rIdcu7qk9wugshhi7khkhovi">
+            <w:hyperlink w:history="1" r:id="rId_dj3thkvjahk_qkzu7f4q">
               <w:r>
                 <w:rPr>
                   <w:rFonts w:ascii="Arial" w:cs="Arial" w:eastAsia="Arial" w:hAnsi="Arial"/>
@@ -7071,7 +7071,7 @@
             </w:tcMar>
           </w:tcPr>
           <w:p>
-            <w:hyperlink w:history="1" r:id="rIdkeix66mwuw3eckvzc214v">
+            <w:hyperlink w:history="1" r:id="rIdflbacxwoebr9wpfzhp3zt">
               <w:r>
                 <w:rPr>
                   <w:rFonts w:ascii="Arial" w:cs="Arial" w:eastAsia="Arial" w:hAnsi="Arial"/>
@@ -7281,7 +7281,7 @@
             </w:tcMar>
           </w:tcPr>
           <w:p>
-            <w:hyperlink w:history="1" r:id="rIdvv_o079hlbr0revv9rz0i">
+            <w:hyperlink w:history="1" r:id="rIdsdx8nuvblnqkg4djb4vwe">
               <w:r>
                 <w:rPr>
                   <w:rFonts w:ascii="Arial" w:cs="Arial" w:eastAsia="Arial" w:hAnsi="Arial"/>
@@ -7491,7 +7491,7 @@
             </w:tcMar>
           </w:tcPr>
           <w:p>
-            <w:hyperlink w:history="1" r:id="rIdeeneactmj0ow3dxzbjlga">
+            <w:hyperlink w:history="1" r:id="rId9jax_y3h3vxh7jstm4-5l">
               <w:r>
                 <w:rPr>
                   <w:rFonts w:ascii="Arial" w:cs="Arial" w:eastAsia="Arial" w:hAnsi="Arial"/>
@@ -7701,7 +7701,7 @@
             </w:tcMar>
           </w:tcPr>
           <w:p>
-            <w:hyperlink w:history="1" r:id="rIddgosgpymexnolqftgu5um">
+            <w:hyperlink w:history="1" r:id="rIdrmpc4de2gsabxshd9c33i">
               <w:r>
                 <w:rPr>
                   <w:rFonts w:ascii="Arial" w:cs="Arial" w:eastAsia="Arial" w:hAnsi="Arial"/>
@@ -7911,7 +7911,7 @@
             </w:tcMar>
           </w:tcPr>
           <w:p>
-            <w:hyperlink w:history="1" r:id="rIdc4pszfxva5e2p9zp_aezi">
+            <w:hyperlink w:history="1" r:id="rIdb21pdye314odqapgo9l4p">
               <w:r>
                 <w:rPr>
                   <w:rFonts w:ascii="Arial" w:cs="Arial" w:eastAsia="Arial" w:hAnsi="Arial"/>
@@ -8121,7 +8121,7 @@
             </w:tcMar>
           </w:tcPr>
           <w:p>
-            <w:hyperlink w:history="1" r:id="rIdjbzwei3lyps7zs0hmdmjs">
+            <w:hyperlink w:history="1" r:id="rIdvcbrokuj_saunoy2fjjui">
               <w:r>
                 <w:rPr>
                   <w:rFonts w:ascii="Arial" w:cs="Arial" w:eastAsia="Arial" w:hAnsi="Arial"/>
@@ -8331,7 +8331,7 @@
             </w:tcMar>
           </w:tcPr>
           <w:p>
-            <w:hyperlink w:history="1" r:id="rId7-euqk4qjjffajxn4k5wv">
+            <w:hyperlink w:history="1" r:id="rIdi_rax0nwre1wzhgayqw2j">
               <w:r>
                 <w:rPr>
                   <w:rFonts w:ascii="Arial" w:cs="Arial" w:eastAsia="Arial" w:hAnsi="Arial"/>
@@ -8541,7 +8541,7 @@
             </w:tcMar>
           </w:tcPr>
           <w:p>
-            <w:hyperlink w:history="1" r:id="rIdaj-kgigrdv0xdsnamfucd">
+            <w:hyperlink w:history="1" r:id="rIdh02koxsaac6g7g5hw8-cd">
               <w:r>
                 <w:rPr>
                   <w:rFonts w:ascii="Arial" w:cs="Arial" w:eastAsia="Arial" w:hAnsi="Arial"/>
@@ -8751,7 +8751,7 @@
             </w:tcMar>
           </w:tcPr>
           <w:p>
-            <w:hyperlink w:history="1" r:id="rIdqf5tcs_vxv9yvxvqbgqp_">
+            <w:hyperlink w:history="1" r:id="rIdl_qyo5rnskwezfaf7ai99">
               <w:r>
                 <w:rPr>
                   <w:rFonts w:ascii="Arial" w:cs="Arial" w:eastAsia="Arial" w:hAnsi="Arial"/>
@@ -8961,7 +8961,7 @@
             </w:tcMar>
           </w:tcPr>
           <w:p>
-            <w:hyperlink w:history="1" r:id="rIdxtfquxbru9exrwexodptf">
+            <w:hyperlink w:history="1" r:id="rIdiisvlvrlum2jodj9nyfyg">
               <w:r>
                 <w:rPr>
                   <w:rFonts w:ascii="Arial" w:cs="Arial" w:eastAsia="Arial" w:hAnsi="Arial"/>
@@ -9171,7 +9171,7 @@
             </w:tcMar>
           </w:tcPr>
           <w:p>
-            <w:hyperlink w:history="1" r:id="rIdqyyzhdf1kdxrrm_gekqcs">
+            <w:hyperlink w:history="1" r:id="rIdklsgpam2ncmfspdvd8ckh">
               <w:r>
                 <w:rPr>
                   <w:rFonts w:ascii="Arial" w:cs="Arial" w:eastAsia="Arial" w:hAnsi="Arial"/>
@@ -9381,7 +9381,7 @@
             </w:tcMar>
           </w:tcPr>
           <w:p>
-            <w:hyperlink w:history="1" r:id="rIdrvv_dxz-g9yuvipyf_eke">
+            <w:hyperlink w:history="1" r:id="rIdwc14hawo5mdj9chislgls">
               <w:r>
                 <w:rPr>
                   <w:rFonts w:ascii="Arial" w:cs="Arial" w:eastAsia="Arial" w:hAnsi="Arial"/>
@@ -9591,7 +9591,7 @@
             </w:tcMar>
           </w:tcPr>
           <w:p>
-            <w:hyperlink w:history="1" r:id="rIdm4sj8n2rbovhgpvqvr6v7">
+            <w:hyperlink w:history="1" r:id="rIdy_lxwnln8vapz4fqznibu">
               <w:r>
                 <w:rPr>
                   <w:rFonts w:ascii="Arial" w:cs="Arial" w:eastAsia="Arial" w:hAnsi="Arial"/>
@@ -9801,7 +9801,7 @@
             </w:tcMar>
           </w:tcPr>
           <w:p>
-            <w:hyperlink w:history="1" r:id="rId72ukb7d6c6m6gpynje10m">
+            <w:hyperlink w:history="1" r:id="rIdgfk7z3eeawvhwq20tn3u2">
               <w:r>
                 <w:rPr>
                   <w:rFonts w:ascii="Arial" w:cs="Arial" w:eastAsia="Arial" w:hAnsi="Arial"/>
@@ -10011,7 +10011,7 @@
             </w:tcMar>
           </w:tcPr>
           <w:p>
-            <w:hyperlink w:history="1" r:id="rIdiztrz2cv-bbptdwui2l5a">
+            <w:hyperlink w:history="1" r:id="rIdtteiive1vh4mhskkwlkmz">
               <w:r>
                 <w:rPr>
                   <w:rFonts w:ascii="Arial" w:cs="Arial" w:eastAsia="Arial" w:hAnsi="Arial"/>
@@ -10221,7 +10221,7 @@
             </w:tcMar>
           </w:tcPr>
           <w:p>
-            <w:hyperlink w:history="1" r:id="rIdmu7dgud80nzjffrxbtr56">
+            <w:hyperlink w:history="1" r:id="rIdjuhnowx_krijknx6ykebo">
               <w:r>
                 <w:rPr>
                   <w:rFonts w:ascii="Arial" w:cs="Arial" w:eastAsia="Arial" w:hAnsi="Arial"/>
@@ -10431,7 +10431,7 @@
             </w:tcMar>
           </w:tcPr>
           <w:p>
-            <w:hyperlink w:history="1" r:id="rIdrfahrruyma8zhq4rl5cus">
+            <w:hyperlink w:history="1" r:id="rIdh13d33ff3voppghk66obc">
               <w:r>
                 <w:rPr>
                   <w:rFonts w:ascii="Arial" w:cs="Arial" w:eastAsia="Arial" w:hAnsi="Arial"/>
@@ -10641,7 +10641,7 @@
             </w:tcMar>
           </w:tcPr>
           <w:p>
-            <w:hyperlink w:history="1" r:id="rIdxhztpn7vlowxzoqjyflha">
+            <w:hyperlink w:history="1" r:id="rIdzuvycaf4bwenae_dlee4v">
               <w:r>
                 <w:rPr>
                   <w:rFonts w:ascii="Arial" w:cs="Arial" w:eastAsia="Arial" w:hAnsi="Arial"/>
@@ -10851,7 +10851,7 @@
             </w:tcMar>
           </w:tcPr>
           <w:p>
-            <w:hyperlink w:history="1" r:id="rIdqrnohrewy1py3a6diklo9">
+            <w:hyperlink w:history="1" r:id="rId_2iddendgvfzavprcyear">
               <w:r>
                 <w:rPr>
                   <w:rFonts w:ascii="Arial" w:cs="Arial" w:eastAsia="Arial" w:hAnsi="Arial"/>
@@ -11061,7 +11061,7 @@
             </w:tcMar>
           </w:tcPr>
           <w:p>
-            <w:hyperlink w:history="1" r:id="rIdpsq8g2hkhd3_5d3u0cjlg">
+            <w:hyperlink w:history="1" r:id="rIdh0g4ay-vph-fsex6boese">
               <w:r>
                 <w:rPr>
                   <w:rFonts w:ascii="Arial" w:cs="Arial" w:eastAsia="Arial" w:hAnsi="Arial"/>
@@ -11271,7 +11271,7 @@
             </w:tcMar>
           </w:tcPr>
           <w:p>
-            <w:hyperlink w:history="1" r:id="rIdzxrtptnh6oceicj--fbq0">
+            <w:hyperlink w:history="1" r:id="rIddxmwj5pcralywfiuo3a0p">
               <w:r>
                 <w:rPr>
                   <w:rFonts w:ascii="Arial" w:cs="Arial" w:eastAsia="Arial" w:hAnsi="Arial"/>
@@ -11481,7 +11481,7 @@
             </w:tcMar>
           </w:tcPr>
           <w:p>
-            <w:hyperlink w:history="1" r:id="rIdwwedu_ow1c-46aio2kedj">
+            <w:hyperlink w:history="1" r:id="rIdri_njjacgfv8rpycwlzbj">
               <w:r>
                 <w:rPr>
                   <w:rFonts w:ascii="Arial" w:cs="Arial" w:eastAsia="Arial" w:hAnsi="Arial"/>
@@ -11691,7 +11691,7 @@
             </w:tcMar>
           </w:tcPr>
           <w:p>
-            <w:hyperlink w:history="1" r:id="rIdabchq3peb93qneigaukzt">
+            <w:hyperlink w:history="1" r:id="rIdxbgr_wogwglfa_1qln0en">
               <w:r>
                 <w:rPr>
                   <w:rFonts w:ascii="Arial" w:cs="Arial" w:eastAsia="Arial" w:hAnsi="Arial"/>
@@ -11901,7 +11901,7 @@
             </w:tcMar>
           </w:tcPr>
           <w:p>
-            <w:hyperlink w:history="1" r:id="rIdobdpf6v63hkk8pmeogzg4">
+            <w:hyperlink w:history="1" r:id="rIdlx_r6ucowedzyny-l01c9">
               <w:r>
                 <w:rPr>
                   <w:rFonts w:ascii="Arial" w:cs="Arial" w:eastAsia="Arial" w:hAnsi="Arial"/>
@@ -12111,7 +12111,7 @@
             </w:tcMar>
           </w:tcPr>
           <w:p>
-            <w:hyperlink w:history="1" r:id="rIdu7zhxeywnhybumdjbtupn">
+            <w:hyperlink w:history="1" r:id="rId7z18a6p0dffbm093vusob">
               <w:r>
                 <w:rPr>
                   <w:rFonts w:ascii="Arial" w:cs="Arial" w:eastAsia="Arial" w:hAnsi="Arial"/>
@@ -12321,7 +12321,7 @@
             </w:tcMar>
           </w:tcPr>
           <w:p>
-            <w:hyperlink w:history="1" r:id="rIdnq7xjwkxthnhzlibnabii">
+            <w:hyperlink w:history="1" r:id="rIdvjhgrw09wrbdbeyu2i1ej">
               <w:r>
                 <w:rPr>
                   <w:rFonts w:ascii="Arial" w:cs="Arial" w:eastAsia="Arial" w:hAnsi="Arial"/>
@@ -12531,7 +12531,7 @@
             </w:tcMar>
           </w:tcPr>
           <w:p>
-            <w:hyperlink w:history="1" r:id="rIdozhqcdympo5b8qif0bd93">
+            <w:hyperlink w:history="1" r:id="rIdnznni6olcjbhqchqwbmac">
               <w:r>
                 <w:rPr>
                   <w:rFonts w:ascii="Arial" w:cs="Arial" w:eastAsia="Arial" w:hAnsi="Arial"/>
@@ -12741,7 +12741,7 @@
             </w:tcMar>
           </w:tcPr>
           <w:p>
-            <w:hyperlink w:history="1" r:id="rId4ypb5us6ngaes3_9nszl3">
+            <w:hyperlink w:history="1" r:id="rIdxb1o8ps3o-kv-im1vqlis">
               <w:r>
                 <w:rPr>
                   <w:rFonts w:ascii="Arial" w:cs="Arial" w:eastAsia="Arial" w:hAnsi="Arial"/>
@@ -12951,7 +12951,7 @@
             </w:tcMar>
           </w:tcPr>
           <w:p>
-            <w:hyperlink w:history="1" r:id="rIdrdlsk9vbkmn1n2hto8qpp">
+            <w:hyperlink w:history="1" r:id="rIdm6to70rg9aoxolnhlcpdp">
               <w:r>
                 <w:rPr>
                   <w:rFonts w:ascii="Arial" w:cs="Arial" w:eastAsia="Arial" w:hAnsi="Arial"/>
@@ -13161,7 +13161,7 @@
             </w:tcMar>
           </w:tcPr>
           <w:p>
-            <w:hyperlink w:history="1" r:id="rIdhithucsiubskxcojxc709">
+            <w:hyperlink w:history="1" r:id="rIduu8lttombdthhvl019sqf">
               <w:r>
                 <w:rPr>
                   <w:rFonts w:ascii="Arial" w:cs="Arial" w:eastAsia="Arial" w:hAnsi="Arial"/>
@@ -13371,7 +13371,7 @@
             </w:tcMar>
           </w:tcPr>
           <w:p>
-            <w:hyperlink w:history="1" r:id="rIdvhn9cjdbk7tmsehf5lk6t">
+            <w:hyperlink w:history="1" r:id="rIdlzpofriicpliee6ym-mqh">
               <w:r>
                 <w:rPr>
                   <w:rFonts w:ascii="Arial" w:cs="Arial" w:eastAsia="Arial" w:hAnsi="Arial"/>
@@ -13581,7 +13581,7 @@
             </w:tcMar>
           </w:tcPr>
           <w:p>
-            <w:hyperlink w:history="1" r:id="rIdt9avazi6jn23bxgnj3p_o">
+            <w:hyperlink w:history="1" r:id="rId5z5wwlbgy6xrpksf5y6jp">
               <w:r>
                 <w:rPr>
                   <w:rFonts w:ascii="Arial" w:cs="Arial" w:eastAsia="Arial" w:hAnsi="Arial"/>

</xml_diff>

<commit_message>
Fit the appendix table within the page margins
Co-Authored-By: Claude Fable 5.1 <noreply@anthropic.com>
Claude-Session: https://claude.ai/code/session_01VKikRW5GBV3qSjTxYi5jff
</commit_message>
<xml_diff>
--- a/reports/Power Four FY2025 benchmarks.docx
+++ b/reports/Power Four FY2025 benchmarks.docx
@@ -70,7 +70,7 @@
         </w:rPr>
         <w:t xml:space="preserve">Source links: </w:t>
       </w:r>
-      <w:hyperlink w:history="1" r:id="rId02wsnxuq6feu95z6hqwqo">
+      <w:hyperlink w:history="1" r:id="rId7bdpdvpi75x0teyum1wjw">
         <w:r>
           <w:rPr>
             <w:rFonts w:ascii="Arial" w:cs="Arial" w:eastAsia="Arial" w:hAnsi="Arial"/>
@@ -89,7 +89,7 @@
         </w:rPr>
         <w:t xml:space="preserve">; </w:t>
       </w:r>
-      <w:hyperlink w:history="1" r:id="rIdy6lp4jyxhpqyrvsxsbubn">
+      <w:hyperlink w:history="1" r:id="rIdor1off8uxvyazi7wolqmj">
         <w:r>
           <w:rPr>
             <w:rFonts w:ascii="Arial" w:cs="Arial" w:eastAsia="Arial" w:hAnsi="Arial"/>
@@ -136,7 +136,7 @@
         </w:rPr>
         <w:t xml:space="preserve">Source links: </w:t>
       </w:r>
-      <w:hyperlink w:history="1" r:id="rIdg_b3ih7olw3-c3fsfgicf">
+      <w:hyperlink w:history="1" r:id="rIdsacw7bf03enoqsaalklip">
         <w:r>
           <w:rPr>
             <w:rFonts w:ascii="Arial" w:cs="Arial" w:eastAsia="Arial" w:hAnsi="Arial"/>
@@ -155,7 +155,7 @@
         </w:rPr>
         <w:t xml:space="preserve">; </w:t>
       </w:r>
-      <w:hyperlink w:history="1" r:id="rIdcpkbnxt4mrqm3ly4cejd9">
+      <w:hyperlink w:history="1" r:id="rIdisbyhj-0rdo8brqmd7pja">
         <w:r>
           <w:rPr>
             <w:rFonts w:ascii="Arial" w:cs="Arial" w:eastAsia="Arial" w:hAnsi="Arial"/>
@@ -174,7 +174,7 @@
         </w:rPr>
         <w:t xml:space="preserve">; </w:t>
       </w:r>
-      <w:hyperlink w:history="1" r:id="rIdelj4gf5z9mvvvbpth3yxi">
+      <w:hyperlink w:history="1" r:id="rIdsvtncg60u6se4tupi3_fv">
         <w:r>
           <w:rPr>
             <w:rFonts w:ascii="Arial" w:cs="Arial" w:eastAsia="Arial" w:hAnsi="Arial"/>
@@ -193,7 +193,7 @@
         </w:rPr>
         <w:t xml:space="preserve">; </w:t>
       </w:r>
-      <w:hyperlink w:history="1" r:id="rIdp8jzwwykora-ul6assrw0">
+      <w:hyperlink w:history="1" r:id="rId7wadrd7gcnvu7kf2yd0c3">
         <w:r>
           <w:rPr>
             <w:rFonts w:ascii="Arial" w:cs="Arial" w:eastAsia="Arial" w:hAnsi="Arial"/>
@@ -212,7 +212,7 @@
         </w:rPr>
         <w:t xml:space="preserve">; </w:t>
       </w:r>
-      <w:hyperlink w:history="1" r:id="rIdormbqnavfwkq-4eszfgms">
+      <w:hyperlink w:history="1" r:id="rId2aojqjfxux97rjf2qygfw">
         <w:r>
           <w:rPr>
             <w:rFonts w:ascii="Arial" w:cs="Arial" w:eastAsia="Arial" w:hAnsi="Arial"/>
@@ -231,7 +231,7 @@
         </w:rPr>
         <w:t xml:space="preserve">; </w:t>
       </w:r>
-      <w:hyperlink w:history="1" r:id="rIdt1cy2je3o0uzdh3zm_u9b">
+      <w:hyperlink w:history="1" r:id="rIdx0qczufiwx7tpfkuw17lo">
         <w:r>
           <w:rPr>
             <w:rFonts w:ascii="Arial" w:cs="Arial" w:eastAsia="Arial" w:hAnsi="Arial"/>
@@ -278,7 +278,7 @@
         </w:rPr>
         <w:t xml:space="preserve">Source link: </w:t>
       </w:r>
-      <w:hyperlink w:history="1" r:id="rId6i1-aua0-kxfqrtgsdvhg">
+      <w:hyperlink w:history="1" r:id="rId3ggjl8657mmzkeqsgwktz">
         <w:r>
           <w:rPr>
             <w:rFonts w:ascii="Arial" w:cs="Arial" w:eastAsia="Arial" w:hAnsi="Arial"/>
@@ -325,7 +325,7 @@
         </w:rPr>
         <w:t xml:space="preserve">Source links: </w:t>
       </w:r>
-      <w:hyperlink w:history="1" r:id="rIdvxaw-b3xupb60vh4eu6np">
+      <w:hyperlink w:history="1" r:id="rIdmkujdw6mgxenw6vidtz55">
         <w:r>
           <w:rPr>
             <w:rFonts w:ascii="Arial" w:cs="Arial" w:eastAsia="Arial" w:hAnsi="Arial"/>
@@ -344,7 +344,7 @@
         </w:rPr>
         <w:t xml:space="preserve">; </w:t>
       </w:r>
-      <w:hyperlink w:history="1" r:id="rIdn9ubqurvlhhjxuxvrqlcy">
+      <w:hyperlink w:history="1" r:id="rIdukj4zmognde8pyrttcxh3">
         <w:r>
           <w:rPr>
             <w:rFonts w:ascii="Arial" w:cs="Arial" w:eastAsia="Arial" w:hAnsi="Arial"/>
@@ -406,7 +406,7 @@
         </w:rPr>
         <w:t xml:space="preserve">Source links: </w:t>
       </w:r>
-      <w:hyperlink w:history="1" r:id="rIdxo-ymvregp7nzv7vhqfzs">
+      <w:hyperlink w:history="1" r:id="rIdiuehlwl8azt7m-pvtk10b">
         <w:r>
           <w:rPr>
             <w:rFonts w:ascii="Arial" w:cs="Arial" w:eastAsia="Arial" w:hAnsi="Arial"/>
@@ -425,7 +425,7 @@
         </w:rPr>
         <w:t xml:space="preserve">; </w:t>
       </w:r>
-      <w:hyperlink w:history="1" r:id="rIdghr0-nqe3ighpnxcvlg4i">
+      <w:hyperlink w:history="1" r:id="rIdmzenxd7ufhvyi-ir3tv13">
         <w:r>
           <w:rPr>
             <w:rFonts w:ascii="Arial" w:cs="Arial" w:eastAsia="Arial" w:hAnsi="Arial"/>
@@ -472,7 +472,7 @@
         </w:rPr>
         <w:t xml:space="preserve">Source links: </w:t>
       </w:r>
-      <w:hyperlink w:history="1" r:id="rIdite7ujzaocseffhfcghhk">
+      <w:hyperlink w:history="1" r:id="rIdaehj_giesbndvsqsz0hyo">
         <w:r>
           <w:rPr>
             <w:rFonts w:ascii="Arial" w:cs="Arial" w:eastAsia="Arial" w:hAnsi="Arial"/>
@@ -491,7 +491,7 @@
         </w:rPr>
         <w:t xml:space="preserve">; </w:t>
       </w:r>
-      <w:hyperlink w:history="1" r:id="rIdq2vog9bvxnp313owtzei9">
+      <w:hyperlink w:history="1" r:id="rIdzycffu3iujlmafnb6lpzy">
         <w:r>
           <w:rPr>
             <w:rFonts w:ascii="Arial" w:cs="Arial" w:eastAsia="Arial" w:hAnsi="Arial"/>
@@ -538,7 +538,7 @@
         </w:rPr>
         <w:t xml:space="preserve">Source links: </w:t>
       </w:r>
-      <w:hyperlink w:history="1" r:id="rIdhqzhwveinqcedbj5kt85t">
+      <w:hyperlink w:history="1" r:id="rIdc02cxpv4fy9imvudi8asw">
         <w:r>
           <w:rPr>
             <w:rFonts w:ascii="Arial" w:cs="Arial" w:eastAsia="Arial" w:hAnsi="Arial"/>
@@ -557,7 +557,7 @@
         </w:rPr>
         <w:t xml:space="preserve">; </w:t>
       </w:r>
-      <w:hyperlink w:history="1" r:id="rIdfzlg1q5-fhmdc9ebqsy6i">
+      <w:hyperlink w:history="1" r:id="rId5fzpqtnsjqyr1phosbbmw">
         <w:r>
           <w:rPr>
             <w:rFonts w:ascii="Arial" w:cs="Arial" w:eastAsia="Arial" w:hAnsi="Arial"/>
@@ -604,7 +604,7 @@
         </w:rPr>
         <w:t xml:space="preserve">Source links: </w:t>
       </w:r>
-      <w:hyperlink w:history="1" r:id="rIdlxhtxzrwd06kg5vwgfrdf">
+      <w:hyperlink w:history="1" r:id="rIdytme0rj0mvjj-dgrkrjj0">
         <w:r>
           <w:rPr>
             <w:rFonts w:ascii="Arial" w:cs="Arial" w:eastAsia="Arial" w:hAnsi="Arial"/>
@@ -623,7 +623,7 @@
         </w:rPr>
         <w:t xml:space="preserve">; </w:t>
       </w:r>
-      <w:hyperlink w:history="1" r:id="rIdnny_opc0nubh9_kqxraza">
+      <w:hyperlink w:history="1" r:id="rIdyiqd0abtqsowoynxetz9y">
         <w:r>
           <w:rPr>
             <w:rFonts w:ascii="Arial" w:cs="Arial" w:eastAsia="Arial" w:hAnsi="Arial"/>
@@ -670,7 +670,7 @@
         </w:rPr>
         <w:t xml:space="preserve">Source links: </w:t>
       </w:r>
-      <w:hyperlink w:history="1" r:id="rIdgwtp0kkim60wa2p4_ojsa">
+      <w:hyperlink w:history="1" r:id="rIdlakk_f3gxbocfvhjybjd8">
         <w:r>
           <w:rPr>
             <w:rFonts w:ascii="Arial" w:cs="Arial" w:eastAsia="Arial" w:hAnsi="Arial"/>
@@ -689,7 +689,7 @@
         </w:rPr>
         <w:t xml:space="preserve">; </w:t>
       </w:r>
-      <w:hyperlink w:history="1" r:id="rIdda2ihxsxlrit5kccfz5lo">
+      <w:hyperlink w:history="1" r:id="rIdrtvzktbh8bjbqg1ioldxi">
         <w:r>
           <w:rPr>
             <w:rFonts w:ascii="Arial" w:cs="Arial" w:eastAsia="Arial" w:hAnsi="Arial"/>
@@ -708,7 +708,7 @@
         </w:rPr>
         <w:t xml:space="preserve">; </w:t>
       </w:r>
-      <w:hyperlink w:history="1" r:id="rIdnhlb2bt2qkwscfzp8qjg-">
+      <w:hyperlink w:history="1" r:id="rIdqjuss5nrdx7jvrejirqoi">
         <w:r>
           <w:rPr>
             <w:rFonts w:ascii="Arial" w:cs="Arial" w:eastAsia="Arial" w:hAnsi="Arial"/>
@@ -755,7 +755,7 @@
         </w:rPr>
         <w:t xml:space="preserve">Source links: </w:t>
       </w:r>
-      <w:hyperlink w:history="1" r:id="rId_o9b5cdbqi-kkxmx2ui-t">
+      <w:hyperlink w:history="1" r:id="rIdrpqmie7v07ked5vvusjdz">
         <w:r>
           <w:rPr>
             <w:rFonts w:ascii="Arial" w:cs="Arial" w:eastAsia="Arial" w:hAnsi="Arial"/>
@@ -774,7 +774,7 @@
         </w:rPr>
         <w:t xml:space="preserve">; </w:t>
       </w:r>
-      <w:hyperlink w:history="1" r:id="rIdxghf6efxmwpj1nq-tgzg6">
+      <w:hyperlink w:history="1" r:id="rIdfxhc_yzinqulckp9392oz">
         <w:r>
           <w:rPr>
             <w:rFonts w:ascii="Arial" w:cs="Arial" w:eastAsia="Arial" w:hAnsi="Arial"/>
@@ -793,7 +793,7 @@
         </w:rPr>
         <w:t xml:space="preserve">; </w:t>
       </w:r>
-      <w:hyperlink w:history="1" r:id="rIdcos0tr9x1jivbifg_8cdg">
+      <w:hyperlink w:history="1" r:id="rIdhsdipknksln8rdo5tkgnl">
         <w:r>
           <w:rPr>
             <w:rFonts w:ascii="Arial" w:cs="Arial" w:eastAsia="Arial" w:hAnsi="Arial"/>
@@ -812,7 +812,7 @@
         </w:rPr>
         <w:t xml:space="preserve">; </w:t>
       </w:r>
-      <w:hyperlink w:history="1" r:id="rIdg7a9jc1wq_n99oguadva3">
+      <w:hyperlink w:history="1" r:id="rIdaacdo7gbvztdzhc58yjbz">
         <w:r>
           <w:rPr>
             <w:rFonts w:ascii="Arial" w:cs="Arial" w:eastAsia="Arial" w:hAnsi="Arial"/>
@@ -831,7 +831,7 @@
         </w:rPr>
         <w:t xml:space="preserve">; </w:t>
       </w:r>
-      <w:hyperlink w:history="1" r:id="rIdtvsxcboewqjvjb1-89yrv">
+      <w:hyperlink w:history="1" r:id="rId-ct4tl_cbtaxhwrdtnj_j">
         <w:r>
           <w:rPr>
             <w:rFonts w:ascii="Arial" w:cs="Arial" w:eastAsia="Arial" w:hAnsi="Arial"/>
@@ -850,7 +850,7 @@
         </w:rPr>
         <w:t xml:space="preserve">; </w:t>
       </w:r>
-      <w:hyperlink w:history="1" r:id="rId7t6qek6zfq-djro2ck-gs">
+      <w:hyperlink w:history="1" r:id="rIdtpimw2yfdo_b-gmtbbvqv">
         <w:r>
           <w:rPr>
             <w:rFonts w:ascii="Arial" w:cs="Arial" w:eastAsia="Arial" w:hAnsi="Arial"/>
@@ -869,7 +869,7 @@
         </w:rPr>
         <w:t xml:space="preserve">; </w:t>
       </w:r>
-      <w:hyperlink w:history="1" r:id="rIdjmfcqlm7dfm6zwecdghva">
+      <w:hyperlink w:history="1" r:id="rIduapfprqn_on9qy5ehvmoj">
         <w:r>
           <w:rPr>
             <w:rFonts w:ascii="Arial" w:cs="Arial" w:eastAsia="Arial" w:hAnsi="Arial"/>
@@ -888,7 +888,7 @@
         </w:rPr>
         <w:t xml:space="preserve">; </w:t>
       </w:r>
-      <w:hyperlink w:history="1" r:id="rIdwnunxm5-fdqfw2bom5tf0">
+      <w:hyperlink w:history="1" r:id="rIdducbcsi0zqicrqvih-ad6">
         <w:r>
           <w:rPr>
             <w:rFonts w:ascii="Arial" w:cs="Arial" w:eastAsia="Arial" w:hAnsi="Arial"/>
@@ -907,7 +907,7 @@
         </w:rPr>
         <w:t xml:space="preserve">; </w:t>
       </w:r>
-      <w:hyperlink w:history="1" r:id="rId3zrffl4qvzyqeknbwglcg">
+      <w:hyperlink w:history="1" r:id="rId4sobck0k5rsgrdf3agytu">
         <w:r>
           <w:rPr>
             <w:rFonts w:ascii="Arial" w:cs="Arial" w:eastAsia="Arial" w:hAnsi="Arial"/>
@@ -954,7 +954,7 @@
         </w:rPr>
         <w:t xml:space="preserve">Source links: </w:t>
       </w:r>
-      <w:hyperlink w:history="1" r:id="rIdqvndcpu8hz1tytxragi0m">
+      <w:hyperlink w:history="1" r:id="rIdp-gopr6yeydyvksfe2utb">
         <w:r>
           <w:rPr>
             <w:rFonts w:ascii="Arial" w:cs="Arial" w:eastAsia="Arial" w:hAnsi="Arial"/>
@@ -973,7 +973,7 @@
         </w:rPr>
         <w:t xml:space="preserve">; </w:t>
       </w:r>
-      <w:hyperlink w:history="1" r:id="rId5rm2dl0ynvtdjpxqr1q_w">
+      <w:hyperlink w:history="1" r:id="rIdytxb7dkafy41bdqqgviii">
         <w:r>
           <w:rPr>
             <w:rFonts w:ascii="Arial" w:cs="Arial" w:eastAsia="Arial" w:hAnsi="Arial"/>
@@ -992,7 +992,7 @@
         </w:rPr>
         <w:t xml:space="preserve">; </w:t>
       </w:r>
-      <w:hyperlink w:history="1" r:id="rIdlbs__mxq_lecizetkmaxy">
+      <w:hyperlink w:history="1" r:id="rId7fkgeveonmmqfugzhjyud">
         <w:r>
           <w:rPr>
             <w:rFonts w:ascii="Arial" w:cs="Arial" w:eastAsia="Arial" w:hAnsi="Arial"/>
@@ -1011,7 +1011,7 @@
         </w:rPr>
         <w:t xml:space="preserve">; </w:t>
       </w:r>
-      <w:hyperlink w:history="1" r:id="rIdbhjczn3wwgd-xhffwjqtl">
+      <w:hyperlink w:history="1" r:id="rIdfjsylbguo4bjxdfetdtdn">
         <w:r>
           <w:rPr>
             <w:rFonts w:ascii="Arial" w:cs="Arial" w:eastAsia="Arial" w:hAnsi="Arial"/>
@@ -1030,7 +1030,7 @@
         </w:rPr>
         <w:t xml:space="preserve">; </w:t>
       </w:r>
-      <w:hyperlink w:history="1" r:id="rIdl-uzvfd-lq9keqhgz_hht">
+      <w:hyperlink w:history="1" r:id="rIdozaaelnwrwuosbgbsmovj">
         <w:r>
           <w:rPr>
             <w:rFonts w:ascii="Arial" w:cs="Arial" w:eastAsia="Arial" w:hAnsi="Arial"/>
@@ -1049,7 +1049,7 @@
         </w:rPr>
         <w:t xml:space="preserve">; </w:t>
       </w:r>
-      <w:hyperlink w:history="1" r:id="rIdvzlqqe0xboc7g9spgno3q">
+      <w:hyperlink w:history="1" r:id="rIdzoxlz3i4xk4_nw_41gs09">
         <w:r>
           <w:rPr>
             <w:rFonts w:ascii="Arial" w:cs="Arial" w:eastAsia="Arial" w:hAnsi="Arial"/>
@@ -1068,7 +1068,7 @@
         </w:rPr>
         <w:t xml:space="preserve">; </w:t>
       </w:r>
-      <w:hyperlink w:history="1" r:id="rIdaiunryc1ydscxd9ciigo9">
+      <w:hyperlink w:history="1" r:id="rId7m0tqfbljuvpdm2sq4guo">
         <w:r>
           <w:rPr>
             <w:rFonts w:ascii="Arial" w:cs="Arial" w:eastAsia="Arial" w:hAnsi="Arial"/>
@@ -1087,7 +1087,7 @@
         </w:rPr>
         <w:t xml:space="preserve">; </w:t>
       </w:r>
-      <w:hyperlink w:history="1" r:id="rIdcclyqcd5yhdhnfob80gr0">
+      <w:hyperlink w:history="1" r:id="rIdk-lre-z7zuhviwiz7xqjx">
         <w:r>
           <w:rPr>
             <w:rFonts w:ascii="Arial" w:cs="Arial" w:eastAsia="Arial" w:hAnsi="Arial"/>
@@ -1149,7 +1149,7 @@
         </w:rPr>
         <w:t xml:space="preserve">Source link: </w:t>
       </w:r>
-      <w:hyperlink w:history="1" r:id="rIdre9g40wpc6lipk9jwcrwt">
+      <w:hyperlink w:history="1" r:id="rIdptqrmow31lnx0kafefq6f">
         <w:r>
           <w:rPr>
             <w:rFonts w:ascii="Arial" w:cs="Arial" w:eastAsia="Arial" w:hAnsi="Arial"/>
@@ -1196,7 +1196,7 @@
         </w:rPr>
         <w:t xml:space="preserve">Source links: </w:t>
       </w:r>
-      <w:hyperlink w:history="1" r:id="rId75wpqdhdxamysfbx4qi37">
+      <w:hyperlink w:history="1" r:id="rIdpirxuvzzmqtyaxpyo8dzi">
         <w:r>
           <w:rPr>
             <w:rFonts w:ascii="Arial" w:cs="Arial" w:eastAsia="Arial" w:hAnsi="Arial"/>
@@ -1215,7 +1215,7 @@
         </w:rPr>
         <w:t xml:space="preserve">; </w:t>
       </w:r>
-      <w:hyperlink w:history="1" r:id="rIdnmo8hbwzg3skwpdgtxqdb">
+      <w:hyperlink w:history="1" r:id="rIdvg17jlnqidydthk7glcjd">
         <w:r>
           <w:rPr>
             <w:rFonts w:ascii="Arial" w:cs="Arial" w:eastAsia="Arial" w:hAnsi="Arial"/>
@@ -1234,7 +1234,7 @@
         </w:rPr>
         <w:t xml:space="preserve">; </w:t>
       </w:r>
-      <w:hyperlink w:history="1" r:id="rIdxvxaz8ppek9dfpvcrtjgk">
+      <w:hyperlink w:history="1" r:id="rIdtpqzx11imsljedaebaps7">
         <w:r>
           <w:rPr>
             <w:rFonts w:ascii="Arial" w:cs="Arial" w:eastAsia="Arial" w:hAnsi="Arial"/>
@@ -1281,7 +1281,7 @@
         </w:rPr>
         <w:t xml:space="preserve">Source link: </w:t>
       </w:r>
-      <w:hyperlink w:history="1" r:id="rId916a3sonk0qoysal22hr5">
+      <w:hyperlink w:history="1" r:id="rIdjdgqvejy9az8f1qjqds0t">
         <w:r>
           <w:rPr>
             <w:rFonts w:ascii="Arial" w:cs="Arial" w:eastAsia="Arial" w:hAnsi="Arial"/>
@@ -1328,7 +1328,7 @@
         </w:rPr>
         <w:t xml:space="preserve">Source links: </w:t>
       </w:r>
-      <w:hyperlink w:history="1" r:id="rIdvb9po4kx-ioihsjlypidz">
+      <w:hyperlink w:history="1" r:id="rIdrhai-jx71pqss-f8nagl1">
         <w:r>
           <w:rPr>
             <w:rFonts w:ascii="Arial" w:cs="Arial" w:eastAsia="Arial" w:hAnsi="Arial"/>
@@ -1347,7 +1347,7 @@
         </w:rPr>
         <w:t xml:space="preserve">; </w:t>
       </w:r>
-      <w:hyperlink w:history="1" r:id="rId78pqosdcb2gjfr3i9skao">
+      <w:hyperlink w:history="1" r:id="rIdzg37jz_a77rnw_ous7fii">
         <w:r>
           <w:rPr>
             <w:rFonts w:ascii="Arial" w:cs="Arial" w:eastAsia="Arial" w:hAnsi="Arial"/>
@@ -1366,7 +1366,7 @@
         </w:rPr>
         <w:t xml:space="preserve">; </w:t>
       </w:r>
-      <w:hyperlink w:history="1" r:id="rIdoadvogbsguvwtwt64rm5u">
+      <w:hyperlink w:history="1" r:id="rIdtroulmtjwklmcmzuluiws">
         <w:r>
           <w:rPr>
             <w:rFonts w:ascii="Arial" w:cs="Arial" w:eastAsia="Arial" w:hAnsi="Arial"/>
@@ -1385,7 +1385,7 @@
         </w:rPr>
         <w:t xml:space="preserve">; </w:t>
       </w:r>
-      <w:hyperlink w:history="1" r:id="rIdf6rgwxxqs3zqk8vxnii8f">
+      <w:hyperlink w:history="1" r:id="rIdrwa4aqdilej-ua8njoxuc">
         <w:r>
           <w:rPr>
             <w:rFonts w:ascii="Arial" w:cs="Arial" w:eastAsia="Arial" w:hAnsi="Arial"/>
@@ -1404,7 +1404,7 @@
         </w:rPr>
         <w:t xml:space="preserve">; </w:t>
       </w:r>
-      <w:hyperlink w:history="1" r:id="rIdoqh_yxikwoxq2ptnfa24t">
+      <w:hyperlink w:history="1" r:id="rIdcrswrlckiq-ekycyjemts">
         <w:r>
           <w:rPr>
             <w:rFonts w:ascii="Arial" w:cs="Arial" w:eastAsia="Arial" w:hAnsi="Arial"/>
@@ -1423,7 +1423,7 @@
         </w:rPr>
         <w:t xml:space="preserve">; </w:t>
       </w:r>
-      <w:hyperlink w:history="1" r:id="rIdwt3zpevvyck6pxw4vhiyk">
+      <w:hyperlink w:history="1" r:id="rIdbqdbzigh80lwez-fhveix">
         <w:r>
           <w:rPr>
             <w:rFonts w:ascii="Arial" w:cs="Arial" w:eastAsia="Arial" w:hAnsi="Arial"/>
@@ -1442,7 +1442,7 @@
         </w:rPr>
         <w:t xml:space="preserve">; </w:t>
       </w:r>
-      <w:hyperlink w:history="1" r:id="rId7cl7dusvlp8w4bcvfflu2">
+      <w:hyperlink w:history="1" r:id="rIdr34ngcxiowsnrf1bdg3n7">
         <w:r>
           <w:rPr>
             <w:rFonts w:ascii="Arial" w:cs="Arial" w:eastAsia="Arial" w:hAnsi="Arial"/>
@@ -1461,7 +1461,7 @@
         </w:rPr>
         <w:t xml:space="preserve">; </w:t>
       </w:r>
-      <w:hyperlink w:history="1" r:id="rIdvtuir_6wrwynxh_uky259">
+      <w:hyperlink w:history="1" r:id="rId3ly6x0e1jwf8uur3fh--_">
         <w:r>
           <w:rPr>
             <w:rFonts w:ascii="Arial" w:cs="Arial" w:eastAsia="Arial" w:hAnsi="Arial"/>
@@ -1508,7 +1508,7 @@
         </w:rPr>
         <w:t xml:space="preserve">Source link: </w:t>
       </w:r>
-      <w:hyperlink w:history="1" r:id="rIdad5yjo5u8swcxzuhhzvvm">
+      <w:hyperlink w:history="1" r:id="rIdy716vrifskuntwfrwq1q2">
         <w:r>
           <w:rPr>
             <w:rFonts w:ascii="Arial" w:cs="Arial" w:eastAsia="Arial" w:hAnsi="Arial"/>
@@ -1555,7 +1555,7 @@
         </w:rPr>
         <w:t xml:space="preserve">Source links: </w:t>
       </w:r>
-      <w:hyperlink w:history="1" r:id="rId0qg7w0l1pekjqjr4aahws">
+      <w:hyperlink w:history="1" r:id="rIdm6uxsh-8rqz6vgfo3bm2e">
         <w:r>
           <w:rPr>
             <w:rFonts w:ascii="Arial" w:cs="Arial" w:eastAsia="Arial" w:hAnsi="Arial"/>
@@ -1574,7 +1574,7 @@
         </w:rPr>
         <w:t xml:space="preserve">; </w:t>
       </w:r>
-      <w:hyperlink w:history="1" r:id="rIdkpqdyxe83nue89jfznixb">
+      <w:hyperlink w:history="1" r:id="rIdswlqsp3jhsaz5navgfdz4">
         <w:r>
           <w:rPr>
             <w:rFonts w:ascii="Arial" w:cs="Arial" w:eastAsia="Arial" w:hAnsi="Arial"/>
@@ -1636,7 +1636,7 @@
         </w:rPr>
         <w:t xml:space="preserve">Source links: </w:t>
       </w:r>
-      <w:hyperlink w:history="1" r:id="rIdccbzx0i-kxodpuneze4r7">
+      <w:hyperlink w:history="1" r:id="rIdfjwvdxl1nrii1bceev7uk">
         <w:r>
           <w:rPr>
             <w:rFonts w:ascii="Arial" w:cs="Arial" w:eastAsia="Arial" w:hAnsi="Arial"/>
@@ -1655,7 +1655,7 @@
         </w:rPr>
         <w:t xml:space="preserve">; </w:t>
       </w:r>
-      <w:hyperlink w:history="1" r:id="rId5pktefr-w3gbynv5t7ldb">
+      <w:hyperlink w:history="1" r:id="rIdsnniavscvc5qszodhorzu">
         <w:r>
           <w:rPr>
             <w:rFonts w:ascii="Arial" w:cs="Arial" w:eastAsia="Arial" w:hAnsi="Arial"/>
@@ -1702,7 +1702,7 @@
         </w:rPr>
         <w:t xml:space="preserve">Source links: </w:t>
       </w:r>
-      <w:hyperlink w:history="1" r:id="rIdfajj2ybagl3ryc3ghlz0j">
+      <w:hyperlink w:history="1" r:id="rIdiuvogwnhtd0uy9azwslti">
         <w:r>
           <w:rPr>
             <w:rFonts w:ascii="Arial" w:cs="Arial" w:eastAsia="Arial" w:hAnsi="Arial"/>
@@ -1721,7 +1721,7 @@
         </w:rPr>
         <w:t xml:space="preserve">; </w:t>
       </w:r>
-      <w:hyperlink w:history="1" r:id="rIdcy0o_8coxygk_lp0tx4jh">
+      <w:hyperlink w:history="1" r:id="rIdytkrdple2jvbgrw_eg3mr">
         <w:r>
           <w:rPr>
             <w:rFonts w:ascii="Arial" w:cs="Arial" w:eastAsia="Arial" w:hAnsi="Arial"/>
@@ -1768,7 +1768,7 @@
         </w:rPr>
         <w:t xml:space="preserve">Source links: </w:t>
       </w:r>
-      <w:hyperlink w:history="1" r:id="rIdgahcywdeaxbwunc52ybpw">
+      <w:hyperlink w:history="1" r:id="rIdawptdffwwksh0m_sj1iyh">
         <w:r>
           <w:rPr>
             <w:rFonts w:ascii="Arial" w:cs="Arial" w:eastAsia="Arial" w:hAnsi="Arial"/>
@@ -1787,7 +1787,7 @@
         </w:rPr>
         <w:t xml:space="preserve">; </w:t>
       </w:r>
-      <w:hyperlink w:history="1" r:id="rId6irqxcqogxww1agnudbur">
+      <w:hyperlink w:history="1" r:id="rIdbcpkfoesmh4oufswszigq">
         <w:r>
           <w:rPr>
             <w:rFonts w:ascii="Arial" w:cs="Arial" w:eastAsia="Arial" w:hAnsi="Arial"/>
@@ -1806,7 +1806,7 @@
         </w:rPr>
         <w:t xml:space="preserve">; </w:t>
       </w:r>
-      <w:hyperlink w:history="1" r:id="rIdrd6uimldm_bhjmg09v5yh">
+      <w:hyperlink w:history="1" r:id="rIdcl1l9lvepq4k0ojczxnf1">
         <w:r>
           <w:rPr>
             <w:rFonts w:ascii="Arial" w:cs="Arial" w:eastAsia="Arial" w:hAnsi="Arial"/>
@@ -1853,7 +1853,7 @@
         </w:rPr>
         <w:t xml:space="preserve">Source links: </w:t>
       </w:r>
-      <w:hyperlink w:history="1" r:id="rIdqdocxyocmifwxfadw6tbm">
+      <w:hyperlink w:history="1" r:id="rIdx2avxzusyfzh-2efcq3ql">
         <w:r>
           <w:rPr>
             <w:rFonts w:ascii="Arial" w:cs="Arial" w:eastAsia="Arial" w:hAnsi="Arial"/>
@@ -1872,7 +1872,7 @@
         </w:rPr>
         <w:t xml:space="preserve">; </w:t>
       </w:r>
-      <w:hyperlink w:history="1" r:id="rIdbynliu2lwqu1veytg77um">
+      <w:hyperlink w:history="1" r:id="rIdr-g3qa99ebwwidfluodrv">
         <w:r>
           <w:rPr>
             <w:rFonts w:ascii="Arial" w:cs="Arial" w:eastAsia="Arial" w:hAnsi="Arial"/>
@@ -1891,7 +1891,7 @@
         </w:rPr>
         <w:t xml:space="preserve">; </w:t>
       </w:r>
-      <w:hyperlink w:history="1" r:id="rIdor1iagcoidhajvulinu01">
+      <w:hyperlink w:history="1" r:id="rIdcegzr4xjdbq4i70wcvljs">
         <w:r>
           <w:rPr>
             <w:rFonts w:ascii="Arial" w:cs="Arial" w:eastAsia="Arial" w:hAnsi="Arial"/>
@@ -1910,7 +1910,7 @@
         </w:rPr>
         <w:t xml:space="preserve">; </w:t>
       </w:r>
-      <w:hyperlink w:history="1" r:id="rIdsqxymltokjsyza46op5wu">
+      <w:hyperlink w:history="1" r:id="rIddcpjxhvevshondqnhptqt">
         <w:r>
           <w:rPr>
             <w:rFonts w:ascii="Arial" w:cs="Arial" w:eastAsia="Arial" w:hAnsi="Arial"/>
@@ -1929,7 +1929,7 @@
         </w:rPr>
         <w:t xml:space="preserve">; </w:t>
       </w:r>
-      <w:hyperlink w:history="1" r:id="rIdcbmwolonq6jlguf5385om">
+      <w:hyperlink w:history="1" r:id="rIdq1wjz7ixkzw-fdqkdj0yw">
         <w:r>
           <w:rPr>
             <w:rFonts w:ascii="Arial" w:cs="Arial" w:eastAsia="Arial" w:hAnsi="Arial"/>
@@ -1948,7 +1948,7 @@
         </w:rPr>
         <w:t xml:space="preserve">; </w:t>
       </w:r>
-      <w:hyperlink w:history="1" r:id="rIdyogth6w9tbpn-w8ej73i2">
+      <w:hyperlink w:history="1" r:id="rId3zzydhea0khtnw9bpvlw-">
         <w:r>
           <w:rPr>
             <w:rFonts w:ascii="Arial" w:cs="Arial" w:eastAsia="Arial" w:hAnsi="Arial"/>
@@ -1967,7 +1967,7 @@
         </w:rPr>
         <w:t xml:space="preserve">; </w:t>
       </w:r>
-      <w:hyperlink w:history="1" r:id="rIdq2aewlb_3e4ogi3y1fif6">
+      <w:hyperlink w:history="1" r:id="rIdv0b3zrzhpwrws9pph3zft">
         <w:r>
           <w:rPr>
             <w:rFonts w:ascii="Arial" w:cs="Arial" w:eastAsia="Arial" w:hAnsi="Arial"/>
@@ -2014,7 +2014,7 @@
         </w:rPr>
         <w:t xml:space="preserve">Source link: </w:t>
       </w:r>
-      <w:hyperlink w:history="1" r:id="rIdnjs_cl_rpdcpx5ab3s9km">
+      <w:hyperlink w:history="1" r:id="rIdkbbfy_8awc6e6bur_hdx-">
         <w:r>
           <w:rPr>
             <w:rFonts w:ascii="Arial" w:cs="Arial" w:eastAsia="Arial" w:hAnsi="Arial"/>
@@ -2061,7 +2061,7 @@
         </w:rPr>
         <w:t xml:space="preserve">Source links: </w:t>
       </w:r>
-      <w:hyperlink w:history="1" r:id="rIdguknb7laotexc5awn4_nj">
+      <w:hyperlink w:history="1" r:id="rIdmnztt-nhqfp1jpcbdzgiz">
         <w:r>
           <w:rPr>
             <w:rFonts w:ascii="Arial" w:cs="Arial" w:eastAsia="Arial" w:hAnsi="Arial"/>
@@ -2080,7 +2080,7 @@
         </w:rPr>
         <w:t xml:space="preserve">; </w:t>
       </w:r>
-      <w:hyperlink w:history="1" r:id="rIdaqrw41u2wfwos5q3n0kjg">
+      <w:hyperlink w:history="1" r:id="rId9sllvfoheinh0b7hxwz1k">
         <w:r>
           <w:rPr>
             <w:rFonts w:ascii="Arial" w:cs="Arial" w:eastAsia="Arial" w:hAnsi="Arial"/>
@@ -2099,7 +2099,7 @@
         </w:rPr>
         <w:t xml:space="preserve">; </w:t>
       </w:r>
-      <w:hyperlink w:history="1" r:id="rIdrl2bdb4zacyby6zpgd_x6">
+      <w:hyperlink w:history="1" r:id="rIduqijwq4_lhlv0asszrjen">
         <w:r>
           <w:rPr>
             <w:rFonts w:ascii="Arial" w:cs="Arial" w:eastAsia="Arial" w:hAnsi="Arial"/>
@@ -2146,7 +2146,7 @@
         </w:rPr>
         <w:t xml:space="preserve">Source links: </w:t>
       </w:r>
-      <w:hyperlink w:history="1" r:id="rIdwsggf_mpfzdy-rgkl0oql">
+      <w:hyperlink w:history="1" r:id="rIdnv_e1qk6rp78srkzjhx9-">
         <w:r>
           <w:rPr>
             <w:rFonts w:ascii="Arial" w:cs="Arial" w:eastAsia="Arial" w:hAnsi="Arial"/>
@@ -2165,7 +2165,7 @@
         </w:rPr>
         <w:t xml:space="preserve">; </w:t>
       </w:r>
-      <w:hyperlink w:history="1" r:id="rId722m16jwhsxuai6qgmnce">
+      <w:hyperlink w:history="1" r:id="rIdaebacvfs7w3epgg4ivaxe">
         <w:r>
           <w:rPr>
             <w:rFonts w:ascii="Arial" w:cs="Arial" w:eastAsia="Arial" w:hAnsi="Arial"/>
@@ -2227,7 +2227,7 @@
         </w:rPr>
         <w:t xml:space="preserve">Source links: </w:t>
       </w:r>
-      <w:hyperlink w:history="1" r:id="rIdsqq6rebtdc2pe6csrdbsv">
+      <w:hyperlink w:history="1" r:id="rIdkf5nnotpxfwkdpqs7wc62">
         <w:r>
           <w:rPr>
             <w:rFonts w:ascii="Arial" w:cs="Arial" w:eastAsia="Arial" w:hAnsi="Arial"/>
@@ -2246,7 +2246,7 @@
         </w:rPr>
         <w:t xml:space="preserve">; </w:t>
       </w:r>
-      <w:hyperlink w:history="1" r:id="rIdobn2u4st9elaaenndsqgq">
+      <w:hyperlink w:history="1" r:id="rIdk5j0xoynnoxqelq3oyro9">
         <w:r>
           <w:rPr>
             <w:rFonts w:ascii="Arial" w:cs="Arial" w:eastAsia="Arial" w:hAnsi="Arial"/>
@@ -2293,7 +2293,7 @@
         </w:rPr>
         <w:t xml:space="preserve">Source link: </w:t>
       </w:r>
-      <w:hyperlink w:history="1" r:id="rIdy_dp90luvfb7tj8zq51ky">
+      <w:hyperlink w:history="1" r:id="rIdwxqhqve7vm6flfvu9cyvs">
         <w:r>
           <w:rPr>
             <w:rFonts w:ascii="Arial" w:cs="Arial" w:eastAsia="Arial" w:hAnsi="Arial"/>
@@ -2340,7 +2340,7 @@
         </w:rPr>
         <w:t xml:space="preserve">Source link: </w:t>
       </w:r>
-      <w:hyperlink w:history="1" r:id="rId4pfrp4mj63qptlv9xjtu9">
+      <w:hyperlink w:history="1" r:id="rIdhsmc7utnit9yfgljikbqe">
         <w:r>
           <w:rPr>
             <w:rFonts w:ascii="Arial" w:cs="Arial" w:eastAsia="Arial" w:hAnsi="Arial"/>
@@ -2387,7 +2387,7 @@
         </w:rPr>
         <w:t xml:space="preserve">Source links: </w:t>
       </w:r>
-      <w:hyperlink w:history="1" r:id="rIdjrtvyeqardqa3fbkvsand">
+      <w:hyperlink w:history="1" r:id="rId-brrfpktz2va9lecn94wg">
         <w:r>
           <w:rPr>
             <w:rFonts w:ascii="Arial" w:cs="Arial" w:eastAsia="Arial" w:hAnsi="Arial"/>
@@ -2406,7 +2406,7 @@
         </w:rPr>
         <w:t xml:space="preserve">; </w:t>
       </w:r>
-      <w:hyperlink w:history="1" r:id="rIdk_larrxvfceomb5lxebwn">
+      <w:hyperlink w:history="1" r:id="rIdiv8lspx6fgxim8gephimg">
         <w:r>
           <w:rPr>
             <w:rFonts w:ascii="Arial" w:cs="Arial" w:eastAsia="Arial" w:hAnsi="Arial"/>
@@ -2453,7 +2453,7 @@
         </w:rPr>
         <w:t xml:space="preserve">Source link: </w:t>
       </w:r>
-      <w:hyperlink w:history="1" r:id="rIdvs7kaxq2cgwdgwqoc3gml">
+      <w:hyperlink w:history="1" r:id="rIdjkbdytfjl7ishyx31ldnt">
         <w:r>
           <w:rPr>
             <w:rFonts w:ascii="Arial" w:cs="Arial" w:eastAsia="Arial" w:hAnsi="Arial"/>
@@ -2500,7 +2500,7 @@
         </w:rPr>
         <w:t xml:space="preserve">Source links: </w:t>
       </w:r>
-      <w:hyperlink w:history="1" r:id="rIdoj3u1l0dpntj6p1pgswyf">
+      <w:hyperlink w:history="1" r:id="rIdwtvxs1_jh0yojpshqucgl">
         <w:r>
           <w:rPr>
             <w:rFonts w:ascii="Arial" w:cs="Arial" w:eastAsia="Arial" w:hAnsi="Arial"/>
@@ -2519,7 +2519,7 @@
         </w:rPr>
         <w:t xml:space="preserve">; </w:t>
       </w:r>
-      <w:hyperlink w:history="1" r:id="rIdvt_3zchghvth_a3bcgovg">
+      <w:hyperlink w:history="1" r:id="rIdy-hbydtcei61rdvx8codb">
         <w:r>
           <w:rPr>
             <w:rFonts w:ascii="Arial" w:cs="Arial" w:eastAsia="Arial" w:hAnsi="Arial"/>
@@ -2538,7 +2538,7 @@
         </w:rPr>
         <w:t xml:space="preserve">; </w:t>
       </w:r>
-      <w:hyperlink w:history="1" r:id="rIdentophhnwhzgdc-qrdy-v">
+      <w:hyperlink w:history="1" r:id="rIdx2jdxmfeqw2jjzzc1ctww">
         <w:r>
           <w:rPr>
             <w:rFonts w:ascii="Arial" w:cs="Arial" w:eastAsia="Arial" w:hAnsi="Arial"/>
@@ -2557,7 +2557,7 @@
         </w:rPr>
         <w:t xml:space="preserve">; </w:t>
       </w:r>
-      <w:hyperlink w:history="1" r:id="rIdn57h8ijvtcvhw3jhhsbob">
+      <w:hyperlink w:history="1" r:id="rId4xnfhju-n606x3dcdjgco">
         <w:r>
           <w:rPr>
             <w:rFonts w:ascii="Arial" w:cs="Arial" w:eastAsia="Arial" w:hAnsi="Arial"/>
@@ -2586,7 +2586,7 @@
     </w:p>
     <w:tbl>
       <w:tblPr>
-        <w:tblW w:type="dxa" w:w="11400"/>
+        <w:tblW w:type="dxa" w:w="9200"/>
         <w:tblBorders>
           <w:top w:val="single" w:color="auto" w:sz="4"/>
           <w:left w:val="single" w:color="auto" w:sz="4"/>
@@ -2597,14 +2597,14 @@
         </w:tblBorders>
       </w:tblPr>
       <w:tblGrid>
-        <w:gridCol w:w="2600"/>
-        <w:gridCol w:w="1200"/>
+        <w:gridCol w:w="2200"/>
         <w:gridCol w:w="900"/>
-        <w:gridCol w:w="1000"/>
-        <w:gridCol w:w="2600"/>
-        <w:gridCol w:w="1200"/>
+        <w:gridCol w:w="700"/>
+        <w:gridCol w:w="800"/>
+        <w:gridCol w:w="2200"/>
         <w:gridCol w:w="900"/>
-        <w:gridCol w:w="1000"/>
+        <w:gridCol w:w="700"/>
+        <w:gridCol w:w="800"/>
       </w:tblGrid>
       <w:tr>
         <w:trPr>
@@ -2612,7 +2612,7 @@
         </w:trPr>
         <w:tc>
           <w:tcPr>
-            <w:tcW w:type="dxa" w:w="2600"/>
+            <w:tcW w:type="dxa" w:w="2200"/>
             <w:shd w:fill="EDEDED" w:color="auto" w:val="clear"/>
             <w:tcMar>
               <w:top w:type="dxa" w:w="30"/>
@@ -2636,7 +2636,7 @@
         </w:tc>
         <w:tc>
           <w:tcPr>
-            <w:tcW w:type="dxa" w:w="1200"/>
+            <w:tcW w:type="dxa" w:w="900"/>
             <w:shd w:fill="EDEDED" w:color="auto" w:val="clear"/>
             <w:tcMar>
               <w:top w:type="dxa" w:w="30"/>
@@ -2660,6 +2660,78 @@
         </w:tc>
         <w:tc>
           <w:tcPr>
+            <w:tcW w:type="dxa" w:w="700"/>
+            <w:shd w:fill="EDEDED" w:color="auto" w:val="clear"/>
+            <w:tcMar>
+              <w:top w:type="dxa" w:w="30"/>
+              <w:left w:type="dxa" w:w="60"/>
+              <w:bottom w:type="dxa" w:w="30"/>
+              <w:right w:type="dxa" w:w="60"/>
+            </w:tcMar>
+          </w:tcPr>
+          <w:p>
+            <w:r>
+              <w:rPr>
+                <w:rFonts w:ascii="Arial" w:cs="Arial" w:eastAsia="Arial" w:hAnsi="Arial"/>
+                <w:b/>
+                <w:bCs/>
+                <w:sz w:val="20"/>
+                <w:szCs w:val="20"/>
+              </w:rPr>
+              <w:t xml:space="preserve">Sports</w:t>
+            </w:r>
+          </w:p>
+        </w:tc>
+        <w:tc>
+          <w:tcPr>
+            <w:tcW w:type="dxa" w:w="800"/>
+            <w:shd w:fill="EDEDED" w:color="auto" w:val="clear"/>
+            <w:tcMar>
+              <w:top w:type="dxa" w:w="30"/>
+              <w:left w:type="dxa" w:w="60"/>
+              <w:bottom w:type="dxa" w:w="30"/>
+              <w:right w:type="dxa" w:w="60"/>
+            </w:tcMar>
+          </w:tcPr>
+          <w:p>
+            <w:r>
+              <w:rPr>
+                <w:rFonts w:ascii="Arial" w:cs="Arial" w:eastAsia="Arial" w:hAnsi="Arial"/>
+                <w:b/>
+                <w:bCs/>
+                <w:sz w:val="20"/>
+                <w:szCs w:val="20"/>
+              </w:rPr>
+              <w:t xml:space="preserve">Source</w:t>
+            </w:r>
+          </w:p>
+        </w:tc>
+        <w:tc>
+          <w:tcPr>
+            <w:tcW w:type="dxa" w:w="2200"/>
+            <w:shd w:fill="EDEDED" w:color="auto" w:val="clear"/>
+            <w:tcMar>
+              <w:top w:type="dxa" w:w="30"/>
+              <w:left w:type="dxa" w:w="60"/>
+              <w:bottom w:type="dxa" w:w="30"/>
+              <w:right w:type="dxa" w:w="60"/>
+            </w:tcMar>
+          </w:tcPr>
+          <w:p>
+            <w:r>
+              <w:rPr>
+                <w:rFonts w:ascii="Arial" w:cs="Arial" w:eastAsia="Arial" w:hAnsi="Arial"/>
+                <w:b/>
+                <w:bCs/>
+                <w:sz w:val="20"/>
+                <w:szCs w:val="20"/>
+              </w:rPr>
+              <w:t xml:space="preserve">School</w:t>
+            </w:r>
+          </w:p>
+        </w:tc>
+        <w:tc>
+          <w:tcPr>
             <w:tcW w:type="dxa" w:w="900"/>
             <w:shd w:fill="EDEDED" w:color="auto" w:val="clear"/>
             <w:tcMar>
@@ -2678,13 +2750,13 @@
                 <w:sz w:val="20"/>
                 <w:szCs w:val="20"/>
               </w:rPr>
-              <w:t xml:space="preserve">Sports</w:t>
-            </w:r>
-          </w:p>
-        </w:tc>
-        <w:tc>
-          <w:tcPr>
-            <w:tcW w:type="dxa" w:w="1000"/>
+              <w:t xml:space="preserve">Conf</w:t>
+            </w:r>
+          </w:p>
+        </w:tc>
+        <w:tc>
+          <w:tcPr>
+            <w:tcW w:type="dxa" w:w="700"/>
             <w:shd w:fill="EDEDED" w:color="auto" w:val="clear"/>
             <w:tcMar>
               <w:top w:type="dxa" w:w="30"/>
@@ -2702,13 +2774,13 @@
                 <w:sz w:val="20"/>
                 <w:szCs w:val="20"/>
               </w:rPr>
-              <w:t xml:space="preserve">Source</w:t>
-            </w:r>
-          </w:p>
-        </w:tc>
-        <w:tc>
-          <w:tcPr>
-            <w:tcW w:type="dxa" w:w="2600"/>
+              <w:t xml:space="preserve">Sports</w:t>
+            </w:r>
+          </w:p>
+        </w:tc>
+        <w:tc>
+          <w:tcPr>
+            <w:tcW w:type="dxa" w:w="800"/>
             <w:shd w:fill="EDEDED" w:color="auto" w:val="clear"/>
             <w:tcMar>
               <w:top w:type="dxa" w:w="30"/>
@@ -2726,78 +2798,6 @@
                 <w:sz w:val="20"/>
                 <w:szCs w:val="20"/>
               </w:rPr>
-              <w:t xml:space="preserve">School</w:t>
-            </w:r>
-          </w:p>
-        </w:tc>
-        <w:tc>
-          <w:tcPr>
-            <w:tcW w:type="dxa" w:w="1200"/>
-            <w:shd w:fill="EDEDED" w:color="auto" w:val="clear"/>
-            <w:tcMar>
-              <w:top w:type="dxa" w:w="30"/>
-              <w:left w:type="dxa" w:w="60"/>
-              <w:bottom w:type="dxa" w:w="30"/>
-              <w:right w:type="dxa" w:w="60"/>
-            </w:tcMar>
-          </w:tcPr>
-          <w:p>
-            <w:r>
-              <w:rPr>
-                <w:rFonts w:ascii="Arial" w:cs="Arial" w:eastAsia="Arial" w:hAnsi="Arial"/>
-                <w:b/>
-                <w:bCs/>
-                <w:sz w:val="20"/>
-                <w:szCs w:val="20"/>
-              </w:rPr>
-              <w:t xml:space="preserve">Conf</w:t>
-            </w:r>
-          </w:p>
-        </w:tc>
-        <w:tc>
-          <w:tcPr>
-            <w:tcW w:type="dxa" w:w="900"/>
-            <w:shd w:fill="EDEDED" w:color="auto" w:val="clear"/>
-            <w:tcMar>
-              <w:top w:type="dxa" w:w="30"/>
-              <w:left w:type="dxa" w:w="60"/>
-              <w:bottom w:type="dxa" w:w="30"/>
-              <w:right w:type="dxa" w:w="60"/>
-            </w:tcMar>
-          </w:tcPr>
-          <w:p>
-            <w:r>
-              <w:rPr>
-                <w:rFonts w:ascii="Arial" w:cs="Arial" w:eastAsia="Arial" w:hAnsi="Arial"/>
-                <w:b/>
-                <w:bCs/>
-                <w:sz w:val="20"/>
-                <w:szCs w:val="20"/>
-              </w:rPr>
-              <w:t xml:space="preserve">Sports</w:t>
-            </w:r>
-          </w:p>
-        </w:tc>
-        <w:tc>
-          <w:tcPr>
-            <w:tcW w:type="dxa" w:w="1000"/>
-            <w:shd w:fill="EDEDED" w:color="auto" w:val="clear"/>
-            <w:tcMar>
-              <w:top w:type="dxa" w:w="30"/>
-              <w:left w:type="dxa" w:w="60"/>
-              <w:bottom w:type="dxa" w:w="30"/>
-              <w:right w:type="dxa" w:w="60"/>
-            </w:tcMar>
-          </w:tcPr>
-          <w:p>
-            <w:r>
-              <w:rPr>
-                <w:rFonts w:ascii="Arial" w:cs="Arial" w:eastAsia="Arial" w:hAnsi="Arial"/>
-                <w:b/>
-                <w:bCs/>
-                <w:sz w:val="20"/>
-                <w:szCs w:val="20"/>
-              </w:rPr>
               <w:t xml:space="preserve">Source</w:t>
             </w:r>
           </w:p>
@@ -2806,7 +2806,7 @@
       <w:tr>
         <w:tc>
           <w:tcPr>
-            <w:tcW w:type="dxa" w:w="2600"/>
+            <w:tcW w:type="dxa" w:w="2200"/>
             <w:tcMar>
               <w:top w:type="dxa" w:w="30"/>
               <w:left w:type="dxa" w:w="60"/>
@@ -2829,7 +2829,7 @@
         </w:tc>
         <w:tc>
           <w:tcPr>
-            <w:tcW w:type="dxa" w:w="1200"/>
+            <w:tcW w:type="dxa" w:w="900"/>
             <w:tcMar>
               <w:top w:type="dxa" w:w="30"/>
               <w:left w:type="dxa" w:w="60"/>
@@ -2852,7 +2852,7 @@
         </w:tc>
         <w:tc>
           <w:tcPr>
-            <w:tcW w:type="dxa" w:w="900"/>
+            <w:tcW w:type="dxa" w:w="700"/>
             <w:tcMar>
               <w:top w:type="dxa" w:w="30"/>
               <w:left w:type="dxa" w:w="60"/>
@@ -2875,16 +2875,16 @@
         </w:tc>
         <w:tc>
           <w:tcPr>
-            <w:tcW w:type="dxa" w:w="1000"/>
-            <w:tcMar>
-              <w:top w:type="dxa" w:w="30"/>
-              <w:left w:type="dxa" w:w="60"/>
-              <w:bottom w:type="dxa" w:w="30"/>
-              <w:right w:type="dxa" w:w="60"/>
-            </w:tcMar>
-          </w:tcPr>
-          <w:p>
-            <w:hyperlink w:history="1" r:id="rIdm_ejzcomgmpv8vnqcbe0y">
+            <w:tcW w:type="dxa" w:w="800"/>
+            <w:tcMar>
+              <w:top w:type="dxa" w:w="30"/>
+              <w:left w:type="dxa" w:w="60"/>
+              <w:bottom w:type="dxa" w:w="30"/>
+              <w:right w:type="dxa" w:w="60"/>
+            </w:tcMar>
+          </w:tcPr>
+          <w:p>
+            <w:hyperlink w:history="1" r:id="rIdh5wgjuvf1s9b_iw2uttnr">
               <w:r>
                 <w:rPr>
                   <w:rFonts w:ascii="Arial" w:cs="Arial" w:eastAsia="Arial" w:hAnsi="Arial"/>
@@ -2899,7 +2899,7 @@
         </w:tc>
         <w:tc>
           <w:tcPr>
-            <w:tcW w:type="dxa" w:w="2600"/>
+            <w:tcW w:type="dxa" w:w="2200"/>
             <w:tcMar>
               <w:top w:type="dxa" w:w="30"/>
               <w:left w:type="dxa" w:w="60"/>
@@ -2922,7 +2922,7 @@
         </w:tc>
         <w:tc>
           <w:tcPr>
-            <w:tcW w:type="dxa" w:w="1200"/>
+            <w:tcW w:type="dxa" w:w="900"/>
             <w:tcMar>
               <w:top w:type="dxa" w:w="30"/>
               <w:left w:type="dxa" w:w="60"/>
@@ -2945,7 +2945,7 @@
         </w:tc>
         <w:tc>
           <w:tcPr>
-            <w:tcW w:type="dxa" w:w="900"/>
+            <w:tcW w:type="dxa" w:w="700"/>
             <w:tcMar>
               <w:top w:type="dxa" w:w="30"/>
               <w:left w:type="dxa" w:w="60"/>
@@ -2968,16 +2968,16 @@
         </w:tc>
         <w:tc>
           <w:tcPr>
-            <w:tcW w:type="dxa" w:w="1000"/>
-            <w:tcMar>
-              <w:top w:type="dxa" w:w="30"/>
-              <w:left w:type="dxa" w:w="60"/>
-              <w:bottom w:type="dxa" w:w="30"/>
-              <w:right w:type="dxa" w:w="60"/>
-            </w:tcMar>
-          </w:tcPr>
-          <w:p>
-            <w:hyperlink w:history="1" r:id="rIdfjglxwg6bidrp4f6imhgd">
+            <w:tcW w:type="dxa" w:w="800"/>
+            <w:tcMar>
+              <w:top w:type="dxa" w:w="30"/>
+              <w:left w:type="dxa" w:w="60"/>
+              <w:bottom w:type="dxa" w:w="30"/>
+              <w:right w:type="dxa" w:w="60"/>
+            </w:tcMar>
+          </w:tcPr>
+          <w:p>
+            <w:hyperlink w:history="1" r:id="rIdti_yihetkafybbjz004wm">
               <w:r>
                 <w:rPr>
                   <w:rFonts w:ascii="Arial" w:cs="Arial" w:eastAsia="Arial" w:hAnsi="Arial"/>
@@ -2994,7 +2994,7 @@
       <w:tr>
         <w:tc>
           <w:tcPr>
-            <w:tcW w:type="dxa" w:w="2600"/>
+            <w:tcW w:type="dxa" w:w="2200"/>
             <w:tcMar>
               <w:top w:type="dxa" w:w="30"/>
               <w:left w:type="dxa" w:w="60"/>
@@ -3017,7 +3017,7 @@
         </w:tc>
         <w:tc>
           <w:tcPr>
-            <w:tcW w:type="dxa" w:w="1200"/>
+            <w:tcW w:type="dxa" w:w="900"/>
             <w:tcMar>
               <w:top w:type="dxa" w:w="30"/>
               <w:left w:type="dxa" w:w="60"/>
@@ -3040,7 +3040,7 @@
         </w:tc>
         <w:tc>
           <w:tcPr>
-            <w:tcW w:type="dxa" w:w="900"/>
+            <w:tcW w:type="dxa" w:w="700"/>
             <w:tcMar>
               <w:top w:type="dxa" w:w="30"/>
               <w:left w:type="dxa" w:w="60"/>
@@ -3063,16 +3063,16 @@
         </w:tc>
         <w:tc>
           <w:tcPr>
-            <w:tcW w:type="dxa" w:w="1000"/>
-            <w:tcMar>
-              <w:top w:type="dxa" w:w="30"/>
-              <w:left w:type="dxa" w:w="60"/>
-              <w:bottom w:type="dxa" w:w="30"/>
-              <w:right w:type="dxa" w:w="60"/>
-            </w:tcMar>
-          </w:tcPr>
-          <w:p>
-            <w:hyperlink w:history="1" r:id="rId8g5ltbgabzcfzudp4kmex">
+            <w:tcW w:type="dxa" w:w="800"/>
+            <w:tcMar>
+              <w:top w:type="dxa" w:w="30"/>
+              <w:left w:type="dxa" w:w="60"/>
+              <w:bottom w:type="dxa" w:w="30"/>
+              <w:right w:type="dxa" w:w="60"/>
+            </w:tcMar>
+          </w:tcPr>
+          <w:p>
+            <w:hyperlink w:history="1" r:id="rId72jn3x0cgk3o5t9_4qums">
               <w:r>
                 <w:rPr>
                   <w:rFonts w:ascii="Arial" w:cs="Arial" w:eastAsia="Arial" w:hAnsi="Arial"/>
@@ -3087,7 +3087,7 @@
         </w:tc>
         <w:tc>
           <w:tcPr>
-            <w:tcW w:type="dxa" w:w="2600"/>
+            <w:tcW w:type="dxa" w:w="2200"/>
             <w:tcMar>
               <w:top w:type="dxa" w:w="30"/>
               <w:left w:type="dxa" w:w="60"/>
@@ -3110,7 +3110,7 @@
         </w:tc>
         <w:tc>
           <w:tcPr>
-            <w:tcW w:type="dxa" w:w="1200"/>
+            <w:tcW w:type="dxa" w:w="900"/>
             <w:tcMar>
               <w:top w:type="dxa" w:w="30"/>
               <w:left w:type="dxa" w:w="60"/>
@@ -3133,7 +3133,7 @@
         </w:tc>
         <w:tc>
           <w:tcPr>
-            <w:tcW w:type="dxa" w:w="900"/>
+            <w:tcW w:type="dxa" w:w="700"/>
             <w:tcMar>
               <w:top w:type="dxa" w:w="30"/>
               <w:left w:type="dxa" w:w="60"/>
@@ -3156,16 +3156,16 @@
         </w:tc>
         <w:tc>
           <w:tcPr>
-            <w:tcW w:type="dxa" w:w="1000"/>
-            <w:tcMar>
-              <w:top w:type="dxa" w:w="30"/>
-              <w:left w:type="dxa" w:w="60"/>
-              <w:bottom w:type="dxa" w:w="30"/>
-              <w:right w:type="dxa" w:w="60"/>
-            </w:tcMar>
-          </w:tcPr>
-          <w:p>
-            <w:hyperlink w:history="1" r:id="rIdseyfi4shfcclvdabiotsv">
+            <w:tcW w:type="dxa" w:w="800"/>
+            <w:tcMar>
+              <w:top w:type="dxa" w:w="30"/>
+              <w:left w:type="dxa" w:w="60"/>
+              <w:bottom w:type="dxa" w:w="30"/>
+              <w:right w:type="dxa" w:w="60"/>
+            </w:tcMar>
+          </w:tcPr>
+          <w:p>
+            <w:hyperlink w:history="1" r:id="rId4vazun8zx2vcrmkzskxxe">
               <w:r>
                 <w:rPr>
                   <w:rFonts w:ascii="Arial" w:cs="Arial" w:eastAsia="Arial" w:hAnsi="Arial"/>
@@ -3182,7 +3182,7 @@
       <w:tr>
         <w:tc>
           <w:tcPr>
-            <w:tcW w:type="dxa" w:w="2600"/>
+            <w:tcW w:type="dxa" w:w="2200"/>
             <w:tcMar>
               <w:top w:type="dxa" w:w="30"/>
               <w:left w:type="dxa" w:w="60"/>
@@ -3205,7 +3205,7 @@
         </w:tc>
         <w:tc>
           <w:tcPr>
-            <w:tcW w:type="dxa" w:w="1200"/>
+            <w:tcW w:type="dxa" w:w="900"/>
             <w:tcMar>
               <w:top w:type="dxa" w:w="30"/>
               <w:left w:type="dxa" w:w="60"/>
@@ -3228,7 +3228,7 @@
         </w:tc>
         <w:tc>
           <w:tcPr>
-            <w:tcW w:type="dxa" w:w="900"/>
+            <w:tcW w:type="dxa" w:w="700"/>
             <w:tcMar>
               <w:top w:type="dxa" w:w="30"/>
               <w:left w:type="dxa" w:w="60"/>
@@ -3251,16 +3251,16 @@
         </w:tc>
         <w:tc>
           <w:tcPr>
-            <w:tcW w:type="dxa" w:w="1000"/>
-            <w:tcMar>
-              <w:top w:type="dxa" w:w="30"/>
-              <w:left w:type="dxa" w:w="60"/>
-              <w:bottom w:type="dxa" w:w="30"/>
-              <w:right w:type="dxa" w:w="60"/>
-            </w:tcMar>
-          </w:tcPr>
-          <w:p>
-            <w:hyperlink w:history="1" r:id="rIdpqxl1sx-opw7dfxthhbds">
+            <w:tcW w:type="dxa" w:w="800"/>
+            <w:tcMar>
+              <w:top w:type="dxa" w:w="30"/>
+              <w:left w:type="dxa" w:w="60"/>
+              <w:bottom w:type="dxa" w:w="30"/>
+              <w:right w:type="dxa" w:w="60"/>
+            </w:tcMar>
+          </w:tcPr>
+          <w:p>
+            <w:hyperlink w:history="1" r:id="rId-b7giljtx9k8wh9kmji-d">
               <w:r>
                 <w:rPr>
                   <w:rFonts w:ascii="Arial" w:cs="Arial" w:eastAsia="Arial" w:hAnsi="Arial"/>
@@ -3275,7 +3275,7 @@
         </w:tc>
         <w:tc>
           <w:tcPr>
-            <w:tcW w:type="dxa" w:w="2600"/>
+            <w:tcW w:type="dxa" w:w="2200"/>
             <w:tcMar>
               <w:top w:type="dxa" w:w="30"/>
               <w:left w:type="dxa" w:w="60"/>
@@ -3298,7 +3298,7 @@
         </w:tc>
         <w:tc>
           <w:tcPr>
-            <w:tcW w:type="dxa" w:w="1200"/>
+            <w:tcW w:type="dxa" w:w="900"/>
             <w:tcMar>
               <w:top w:type="dxa" w:w="30"/>
               <w:left w:type="dxa" w:w="60"/>
@@ -3321,7 +3321,7 @@
         </w:tc>
         <w:tc>
           <w:tcPr>
-            <w:tcW w:type="dxa" w:w="900"/>
+            <w:tcW w:type="dxa" w:w="700"/>
             <w:tcMar>
               <w:top w:type="dxa" w:w="30"/>
               <w:left w:type="dxa" w:w="60"/>
@@ -3344,16 +3344,16 @@
         </w:tc>
         <w:tc>
           <w:tcPr>
-            <w:tcW w:type="dxa" w:w="1000"/>
-            <w:tcMar>
-              <w:top w:type="dxa" w:w="30"/>
-              <w:left w:type="dxa" w:w="60"/>
-              <w:bottom w:type="dxa" w:w="30"/>
-              <w:right w:type="dxa" w:w="60"/>
-            </w:tcMar>
-          </w:tcPr>
-          <w:p>
-            <w:hyperlink w:history="1" r:id="rIdhtizr2nxwun125yhns2ee">
+            <w:tcW w:type="dxa" w:w="800"/>
+            <w:tcMar>
+              <w:top w:type="dxa" w:w="30"/>
+              <w:left w:type="dxa" w:w="60"/>
+              <w:bottom w:type="dxa" w:w="30"/>
+              <w:right w:type="dxa" w:w="60"/>
+            </w:tcMar>
+          </w:tcPr>
+          <w:p>
+            <w:hyperlink w:history="1" r:id="rIdnj3nvvrif5xxjtgi4xqwh">
               <w:r>
                 <w:rPr>
                   <w:rFonts w:ascii="Arial" w:cs="Arial" w:eastAsia="Arial" w:hAnsi="Arial"/>
@@ -3370,7 +3370,7 @@
       <w:tr>
         <w:tc>
           <w:tcPr>
-            <w:tcW w:type="dxa" w:w="2600"/>
+            <w:tcW w:type="dxa" w:w="2200"/>
             <w:tcMar>
               <w:top w:type="dxa" w:w="30"/>
               <w:left w:type="dxa" w:w="60"/>
@@ -3393,7 +3393,7 @@
         </w:tc>
         <w:tc>
           <w:tcPr>
-            <w:tcW w:type="dxa" w:w="1200"/>
+            <w:tcW w:type="dxa" w:w="900"/>
             <w:tcMar>
               <w:top w:type="dxa" w:w="30"/>
               <w:left w:type="dxa" w:w="60"/>
@@ -3416,7 +3416,7 @@
         </w:tc>
         <w:tc>
           <w:tcPr>
-            <w:tcW w:type="dxa" w:w="900"/>
+            <w:tcW w:type="dxa" w:w="700"/>
             <w:tcMar>
               <w:top w:type="dxa" w:w="30"/>
               <w:left w:type="dxa" w:w="60"/>
@@ -3439,16 +3439,16 @@
         </w:tc>
         <w:tc>
           <w:tcPr>
-            <w:tcW w:type="dxa" w:w="1000"/>
-            <w:tcMar>
-              <w:top w:type="dxa" w:w="30"/>
-              <w:left w:type="dxa" w:w="60"/>
-              <w:bottom w:type="dxa" w:w="30"/>
-              <w:right w:type="dxa" w:w="60"/>
-            </w:tcMar>
-          </w:tcPr>
-          <w:p>
-            <w:hyperlink w:history="1" r:id="rIdr1rahdcllgxkwxfywdxqw">
+            <w:tcW w:type="dxa" w:w="800"/>
+            <w:tcMar>
+              <w:top w:type="dxa" w:w="30"/>
+              <w:left w:type="dxa" w:w="60"/>
+              <w:bottom w:type="dxa" w:w="30"/>
+              <w:right w:type="dxa" w:w="60"/>
+            </w:tcMar>
+          </w:tcPr>
+          <w:p>
+            <w:hyperlink w:history="1" r:id="rIdpl2mqeavg1lnq87ifjtyd">
               <w:r>
                 <w:rPr>
                   <w:rFonts w:ascii="Arial" w:cs="Arial" w:eastAsia="Arial" w:hAnsi="Arial"/>
@@ -3463,7 +3463,7 @@
         </w:tc>
         <w:tc>
           <w:tcPr>
-            <w:tcW w:type="dxa" w:w="2600"/>
+            <w:tcW w:type="dxa" w:w="2200"/>
             <w:tcMar>
               <w:top w:type="dxa" w:w="30"/>
               <w:left w:type="dxa" w:w="60"/>
@@ -3486,7 +3486,7 @@
         </w:tc>
         <w:tc>
           <w:tcPr>
-            <w:tcW w:type="dxa" w:w="1200"/>
+            <w:tcW w:type="dxa" w:w="900"/>
             <w:tcMar>
               <w:top w:type="dxa" w:w="30"/>
               <w:left w:type="dxa" w:w="60"/>
@@ -3509,7 +3509,7 @@
         </w:tc>
         <w:tc>
           <w:tcPr>
-            <w:tcW w:type="dxa" w:w="900"/>
+            <w:tcW w:type="dxa" w:w="700"/>
             <w:tcMar>
               <w:top w:type="dxa" w:w="30"/>
               <w:left w:type="dxa" w:w="60"/>
@@ -3532,16 +3532,16 @@
         </w:tc>
         <w:tc>
           <w:tcPr>
-            <w:tcW w:type="dxa" w:w="1000"/>
-            <w:tcMar>
-              <w:top w:type="dxa" w:w="30"/>
-              <w:left w:type="dxa" w:w="60"/>
-              <w:bottom w:type="dxa" w:w="30"/>
-              <w:right w:type="dxa" w:w="60"/>
-            </w:tcMar>
-          </w:tcPr>
-          <w:p>
-            <w:hyperlink w:history="1" r:id="rIdih9cljoiwcogrkon7r-qd">
+            <w:tcW w:type="dxa" w:w="800"/>
+            <w:tcMar>
+              <w:top w:type="dxa" w:w="30"/>
+              <w:left w:type="dxa" w:w="60"/>
+              <w:bottom w:type="dxa" w:w="30"/>
+              <w:right w:type="dxa" w:w="60"/>
+            </w:tcMar>
+          </w:tcPr>
+          <w:p>
+            <w:hyperlink w:history="1" r:id="rIdrqtqmgutyfc3yywop8hpd">
               <w:r>
                 <w:rPr>
                   <w:rFonts w:ascii="Arial" w:cs="Arial" w:eastAsia="Arial" w:hAnsi="Arial"/>
@@ -3558,7 +3558,7 @@
       <w:tr>
         <w:tc>
           <w:tcPr>
-            <w:tcW w:type="dxa" w:w="2600"/>
+            <w:tcW w:type="dxa" w:w="2200"/>
             <w:tcMar>
               <w:top w:type="dxa" w:w="30"/>
               <w:left w:type="dxa" w:w="60"/>
@@ -3581,7 +3581,7 @@
         </w:tc>
         <w:tc>
           <w:tcPr>
-            <w:tcW w:type="dxa" w:w="1200"/>
+            <w:tcW w:type="dxa" w:w="900"/>
             <w:tcMar>
               <w:top w:type="dxa" w:w="30"/>
               <w:left w:type="dxa" w:w="60"/>
@@ -3604,7 +3604,7 @@
         </w:tc>
         <w:tc>
           <w:tcPr>
-            <w:tcW w:type="dxa" w:w="900"/>
+            <w:tcW w:type="dxa" w:w="700"/>
             <w:tcMar>
               <w:top w:type="dxa" w:w="30"/>
               <w:left w:type="dxa" w:w="60"/>
@@ -3627,16 +3627,16 @@
         </w:tc>
         <w:tc>
           <w:tcPr>
-            <w:tcW w:type="dxa" w:w="1000"/>
-            <w:tcMar>
-              <w:top w:type="dxa" w:w="30"/>
-              <w:left w:type="dxa" w:w="60"/>
-              <w:bottom w:type="dxa" w:w="30"/>
-              <w:right w:type="dxa" w:w="60"/>
-            </w:tcMar>
-          </w:tcPr>
-          <w:p>
-            <w:hyperlink w:history="1" r:id="rIdmadz9qr2hbzidgqgapfni">
+            <w:tcW w:type="dxa" w:w="800"/>
+            <w:tcMar>
+              <w:top w:type="dxa" w:w="30"/>
+              <w:left w:type="dxa" w:w="60"/>
+              <w:bottom w:type="dxa" w:w="30"/>
+              <w:right w:type="dxa" w:w="60"/>
+            </w:tcMar>
+          </w:tcPr>
+          <w:p>
+            <w:hyperlink w:history="1" r:id="rId-xazw9oovacs3wu8d33qf">
               <w:r>
                 <w:rPr>
                   <w:rFonts w:ascii="Arial" w:cs="Arial" w:eastAsia="Arial" w:hAnsi="Arial"/>
@@ -3651,7 +3651,7 @@
         </w:tc>
         <w:tc>
           <w:tcPr>
-            <w:tcW w:type="dxa" w:w="2600"/>
+            <w:tcW w:type="dxa" w:w="2200"/>
             <w:tcMar>
               <w:top w:type="dxa" w:w="30"/>
               <w:left w:type="dxa" w:w="60"/>
@@ -3674,7 +3674,7 @@
         </w:tc>
         <w:tc>
           <w:tcPr>
-            <w:tcW w:type="dxa" w:w="1200"/>
+            <w:tcW w:type="dxa" w:w="900"/>
             <w:tcMar>
               <w:top w:type="dxa" w:w="30"/>
               <w:left w:type="dxa" w:w="60"/>
@@ -3697,7 +3697,7 @@
         </w:tc>
         <w:tc>
           <w:tcPr>
-            <w:tcW w:type="dxa" w:w="900"/>
+            <w:tcW w:type="dxa" w:w="700"/>
             <w:tcMar>
               <w:top w:type="dxa" w:w="30"/>
               <w:left w:type="dxa" w:w="60"/>
@@ -3720,16 +3720,16 @@
         </w:tc>
         <w:tc>
           <w:tcPr>
-            <w:tcW w:type="dxa" w:w="1000"/>
-            <w:tcMar>
-              <w:top w:type="dxa" w:w="30"/>
-              <w:left w:type="dxa" w:w="60"/>
-              <w:bottom w:type="dxa" w:w="30"/>
-              <w:right w:type="dxa" w:w="60"/>
-            </w:tcMar>
-          </w:tcPr>
-          <w:p>
-            <w:hyperlink w:history="1" r:id="rIdxem4scpicx9tr_pordddg">
+            <w:tcW w:type="dxa" w:w="800"/>
+            <w:tcMar>
+              <w:top w:type="dxa" w:w="30"/>
+              <w:left w:type="dxa" w:w="60"/>
+              <w:bottom w:type="dxa" w:w="30"/>
+              <w:right w:type="dxa" w:w="60"/>
+            </w:tcMar>
+          </w:tcPr>
+          <w:p>
+            <w:hyperlink w:history="1" r:id="rIdep_enudghw3wsqyucrsfq">
               <w:r>
                 <w:rPr>
                   <w:rFonts w:ascii="Arial" w:cs="Arial" w:eastAsia="Arial" w:hAnsi="Arial"/>
@@ -3746,7 +3746,7 @@
       <w:tr>
         <w:tc>
           <w:tcPr>
-            <w:tcW w:type="dxa" w:w="2600"/>
+            <w:tcW w:type="dxa" w:w="2200"/>
             <w:tcMar>
               <w:top w:type="dxa" w:w="30"/>
               <w:left w:type="dxa" w:w="60"/>
@@ -3769,7 +3769,7 @@
         </w:tc>
         <w:tc>
           <w:tcPr>
-            <w:tcW w:type="dxa" w:w="1200"/>
+            <w:tcW w:type="dxa" w:w="900"/>
             <w:tcMar>
               <w:top w:type="dxa" w:w="30"/>
               <w:left w:type="dxa" w:w="60"/>
@@ -3792,7 +3792,7 @@
         </w:tc>
         <w:tc>
           <w:tcPr>
-            <w:tcW w:type="dxa" w:w="900"/>
+            <w:tcW w:type="dxa" w:w="700"/>
             <w:tcMar>
               <w:top w:type="dxa" w:w="30"/>
               <w:left w:type="dxa" w:w="60"/>
@@ -3815,16 +3815,16 @@
         </w:tc>
         <w:tc>
           <w:tcPr>
-            <w:tcW w:type="dxa" w:w="1000"/>
-            <w:tcMar>
-              <w:top w:type="dxa" w:w="30"/>
-              <w:left w:type="dxa" w:w="60"/>
-              <w:bottom w:type="dxa" w:w="30"/>
-              <w:right w:type="dxa" w:w="60"/>
-            </w:tcMar>
-          </w:tcPr>
-          <w:p>
-            <w:hyperlink w:history="1" r:id="rId3lfwzmzwbrdfavhv44z4a">
+            <w:tcW w:type="dxa" w:w="800"/>
+            <w:tcMar>
+              <w:top w:type="dxa" w:w="30"/>
+              <w:left w:type="dxa" w:w="60"/>
+              <w:bottom w:type="dxa" w:w="30"/>
+              <w:right w:type="dxa" w:w="60"/>
+            </w:tcMar>
+          </w:tcPr>
+          <w:p>
+            <w:hyperlink w:history="1" r:id="rId2yrmicuikgqbxnls938wq">
               <w:r>
                 <w:rPr>
                   <w:rFonts w:ascii="Arial" w:cs="Arial" w:eastAsia="Arial" w:hAnsi="Arial"/>
@@ -3839,7 +3839,7 @@
         </w:tc>
         <w:tc>
           <w:tcPr>
-            <w:tcW w:type="dxa" w:w="2600"/>
+            <w:tcW w:type="dxa" w:w="2200"/>
             <w:tcMar>
               <w:top w:type="dxa" w:w="30"/>
               <w:left w:type="dxa" w:w="60"/>
@@ -3862,7 +3862,7 @@
         </w:tc>
         <w:tc>
           <w:tcPr>
-            <w:tcW w:type="dxa" w:w="1200"/>
+            <w:tcW w:type="dxa" w:w="900"/>
             <w:tcMar>
               <w:top w:type="dxa" w:w="30"/>
               <w:left w:type="dxa" w:w="60"/>
@@ -3885,7 +3885,7 @@
         </w:tc>
         <w:tc>
           <w:tcPr>
-            <w:tcW w:type="dxa" w:w="900"/>
+            <w:tcW w:type="dxa" w:w="700"/>
             <w:tcMar>
               <w:top w:type="dxa" w:w="30"/>
               <w:left w:type="dxa" w:w="60"/>
@@ -3908,16 +3908,16 @@
         </w:tc>
         <w:tc>
           <w:tcPr>
-            <w:tcW w:type="dxa" w:w="1000"/>
-            <w:tcMar>
-              <w:top w:type="dxa" w:w="30"/>
-              <w:left w:type="dxa" w:w="60"/>
-              <w:bottom w:type="dxa" w:w="30"/>
-              <w:right w:type="dxa" w:w="60"/>
-            </w:tcMar>
-          </w:tcPr>
-          <w:p>
-            <w:hyperlink w:history="1" r:id="rIdavjak9brenhbods50igpy">
+            <w:tcW w:type="dxa" w:w="800"/>
+            <w:tcMar>
+              <w:top w:type="dxa" w:w="30"/>
+              <w:left w:type="dxa" w:w="60"/>
+              <w:bottom w:type="dxa" w:w="30"/>
+              <w:right w:type="dxa" w:w="60"/>
+            </w:tcMar>
+          </w:tcPr>
+          <w:p>
+            <w:hyperlink w:history="1" r:id="rId2mkfhuskagajulj0wzenu">
               <w:r>
                 <w:rPr>
                   <w:rFonts w:ascii="Arial" w:cs="Arial" w:eastAsia="Arial" w:hAnsi="Arial"/>
@@ -3934,7 +3934,7 @@
       <w:tr>
         <w:tc>
           <w:tcPr>
-            <w:tcW w:type="dxa" w:w="2600"/>
+            <w:tcW w:type="dxa" w:w="2200"/>
             <w:tcMar>
               <w:top w:type="dxa" w:w="30"/>
               <w:left w:type="dxa" w:w="60"/>
@@ -3957,7 +3957,7 @@
         </w:tc>
         <w:tc>
           <w:tcPr>
-            <w:tcW w:type="dxa" w:w="1200"/>
+            <w:tcW w:type="dxa" w:w="900"/>
             <w:tcMar>
               <w:top w:type="dxa" w:w="30"/>
               <w:left w:type="dxa" w:w="60"/>
@@ -3980,7 +3980,7 @@
         </w:tc>
         <w:tc>
           <w:tcPr>
-            <w:tcW w:type="dxa" w:w="900"/>
+            <w:tcW w:type="dxa" w:w="700"/>
             <w:tcMar>
               <w:top w:type="dxa" w:w="30"/>
               <w:left w:type="dxa" w:w="60"/>
@@ -4003,16 +4003,16 @@
         </w:tc>
         <w:tc>
           <w:tcPr>
-            <w:tcW w:type="dxa" w:w="1000"/>
-            <w:tcMar>
-              <w:top w:type="dxa" w:w="30"/>
-              <w:left w:type="dxa" w:w="60"/>
-              <w:bottom w:type="dxa" w:w="30"/>
-              <w:right w:type="dxa" w:w="60"/>
-            </w:tcMar>
-          </w:tcPr>
-          <w:p>
-            <w:hyperlink w:history="1" r:id="rIdfkgur-nla7usskgudfyax">
+            <w:tcW w:type="dxa" w:w="800"/>
+            <w:tcMar>
+              <w:top w:type="dxa" w:w="30"/>
+              <w:left w:type="dxa" w:w="60"/>
+              <w:bottom w:type="dxa" w:w="30"/>
+              <w:right w:type="dxa" w:w="60"/>
+            </w:tcMar>
+          </w:tcPr>
+          <w:p>
+            <w:hyperlink w:history="1" r:id="rIdadrdodcmu_nht8ifkxvey">
               <w:r>
                 <w:rPr>
                   <w:rFonts w:ascii="Arial" w:cs="Arial" w:eastAsia="Arial" w:hAnsi="Arial"/>
@@ -4027,7 +4027,7 @@
         </w:tc>
         <w:tc>
           <w:tcPr>
-            <w:tcW w:type="dxa" w:w="2600"/>
+            <w:tcW w:type="dxa" w:w="2200"/>
             <w:tcMar>
               <w:top w:type="dxa" w:w="30"/>
               <w:left w:type="dxa" w:w="60"/>
@@ -4050,7 +4050,7 @@
         </w:tc>
         <w:tc>
           <w:tcPr>
-            <w:tcW w:type="dxa" w:w="1200"/>
+            <w:tcW w:type="dxa" w:w="900"/>
             <w:tcMar>
               <w:top w:type="dxa" w:w="30"/>
               <w:left w:type="dxa" w:w="60"/>
@@ -4073,7 +4073,7 @@
         </w:tc>
         <w:tc>
           <w:tcPr>
-            <w:tcW w:type="dxa" w:w="900"/>
+            <w:tcW w:type="dxa" w:w="700"/>
             <w:tcMar>
               <w:top w:type="dxa" w:w="30"/>
               <w:left w:type="dxa" w:w="60"/>
@@ -4096,16 +4096,16 @@
         </w:tc>
         <w:tc>
           <w:tcPr>
-            <w:tcW w:type="dxa" w:w="1000"/>
-            <w:tcMar>
-              <w:top w:type="dxa" w:w="30"/>
-              <w:left w:type="dxa" w:w="60"/>
-              <w:bottom w:type="dxa" w:w="30"/>
-              <w:right w:type="dxa" w:w="60"/>
-            </w:tcMar>
-          </w:tcPr>
-          <w:p>
-            <w:hyperlink w:history="1" r:id="rIdbdrkigae5z9owqnkv3d_w">
+            <w:tcW w:type="dxa" w:w="800"/>
+            <w:tcMar>
+              <w:top w:type="dxa" w:w="30"/>
+              <w:left w:type="dxa" w:w="60"/>
+              <w:bottom w:type="dxa" w:w="30"/>
+              <w:right w:type="dxa" w:w="60"/>
+            </w:tcMar>
+          </w:tcPr>
+          <w:p>
+            <w:hyperlink w:history="1" r:id="rIdx8j3rxme6tyw3lwcl42us">
               <w:r>
                 <w:rPr>
                   <w:rFonts w:ascii="Arial" w:cs="Arial" w:eastAsia="Arial" w:hAnsi="Arial"/>
@@ -4122,7 +4122,7 @@
       <w:tr>
         <w:tc>
           <w:tcPr>
-            <w:tcW w:type="dxa" w:w="2600"/>
+            <w:tcW w:type="dxa" w:w="2200"/>
             <w:tcMar>
               <w:top w:type="dxa" w:w="30"/>
               <w:left w:type="dxa" w:w="60"/>
@@ -4145,7 +4145,7 @@
         </w:tc>
         <w:tc>
           <w:tcPr>
-            <w:tcW w:type="dxa" w:w="1200"/>
+            <w:tcW w:type="dxa" w:w="900"/>
             <w:tcMar>
               <w:top w:type="dxa" w:w="30"/>
               <w:left w:type="dxa" w:w="60"/>
@@ -4168,7 +4168,7 @@
         </w:tc>
         <w:tc>
           <w:tcPr>
-            <w:tcW w:type="dxa" w:w="900"/>
+            <w:tcW w:type="dxa" w:w="700"/>
             <w:tcMar>
               <w:top w:type="dxa" w:w="30"/>
               <w:left w:type="dxa" w:w="60"/>
@@ -4191,16 +4191,16 @@
         </w:tc>
         <w:tc>
           <w:tcPr>
-            <w:tcW w:type="dxa" w:w="1000"/>
-            <w:tcMar>
-              <w:top w:type="dxa" w:w="30"/>
-              <w:left w:type="dxa" w:w="60"/>
-              <w:bottom w:type="dxa" w:w="30"/>
-              <w:right w:type="dxa" w:w="60"/>
-            </w:tcMar>
-          </w:tcPr>
-          <w:p>
-            <w:hyperlink w:history="1" r:id="rIdwo0ptbsgi5zx7i0ey0zpq">
+            <w:tcW w:type="dxa" w:w="800"/>
+            <w:tcMar>
+              <w:top w:type="dxa" w:w="30"/>
+              <w:left w:type="dxa" w:w="60"/>
+              <w:bottom w:type="dxa" w:w="30"/>
+              <w:right w:type="dxa" w:w="60"/>
+            </w:tcMar>
+          </w:tcPr>
+          <w:p>
+            <w:hyperlink w:history="1" r:id="rIdzhpmbjrvtsjmjyrfythw-">
               <w:r>
                 <w:rPr>
                   <w:rFonts w:ascii="Arial" w:cs="Arial" w:eastAsia="Arial" w:hAnsi="Arial"/>
@@ -4215,7 +4215,7 @@
         </w:tc>
         <w:tc>
           <w:tcPr>
-            <w:tcW w:type="dxa" w:w="2600"/>
+            <w:tcW w:type="dxa" w:w="2200"/>
             <w:tcMar>
               <w:top w:type="dxa" w:w="30"/>
               <w:left w:type="dxa" w:w="60"/>
@@ -4238,7 +4238,7 @@
         </w:tc>
         <w:tc>
           <w:tcPr>
-            <w:tcW w:type="dxa" w:w="1200"/>
+            <w:tcW w:type="dxa" w:w="900"/>
             <w:tcMar>
               <w:top w:type="dxa" w:w="30"/>
               <w:left w:type="dxa" w:w="60"/>
@@ -4261,7 +4261,7 @@
         </w:tc>
         <w:tc>
           <w:tcPr>
-            <w:tcW w:type="dxa" w:w="900"/>
+            <w:tcW w:type="dxa" w:w="700"/>
             <w:tcMar>
               <w:top w:type="dxa" w:w="30"/>
               <w:left w:type="dxa" w:w="60"/>
@@ -4284,16 +4284,16 @@
         </w:tc>
         <w:tc>
           <w:tcPr>
-            <w:tcW w:type="dxa" w:w="1000"/>
-            <w:tcMar>
-              <w:top w:type="dxa" w:w="30"/>
-              <w:left w:type="dxa" w:w="60"/>
-              <w:bottom w:type="dxa" w:w="30"/>
-              <w:right w:type="dxa" w:w="60"/>
-            </w:tcMar>
-          </w:tcPr>
-          <w:p>
-            <w:hyperlink w:history="1" r:id="rIdtuoqtiuwo9twn-rgmmrvs">
+            <w:tcW w:type="dxa" w:w="800"/>
+            <w:tcMar>
+              <w:top w:type="dxa" w:w="30"/>
+              <w:left w:type="dxa" w:w="60"/>
+              <w:bottom w:type="dxa" w:w="30"/>
+              <w:right w:type="dxa" w:w="60"/>
+            </w:tcMar>
+          </w:tcPr>
+          <w:p>
+            <w:hyperlink w:history="1" r:id="rIdmnb4gr0zmb4dg8ivb79fm">
               <w:r>
                 <w:rPr>
                   <w:rFonts w:ascii="Arial" w:cs="Arial" w:eastAsia="Arial" w:hAnsi="Arial"/>
@@ -4310,7 +4310,7 @@
       <w:tr>
         <w:tc>
           <w:tcPr>
-            <w:tcW w:type="dxa" w:w="2600"/>
+            <w:tcW w:type="dxa" w:w="2200"/>
             <w:tcMar>
               <w:top w:type="dxa" w:w="30"/>
               <w:left w:type="dxa" w:w="60"/>
@@ -4333,7 +4333,7 @@
         </w:tc>
         <w:tc>
           <w:tcPr>
-            <w:tcW w:type="dxa" w:w="1200"/>
+            <w:tcW w:type="dxa" w:w="900"/>
             <w:tcMar>
               <w:top w:type="dxa" w:w="30"/>
               <w:left w:type="dxa" w:w="60"/>
@@ -4356,7 +4356,7 @@
         </w:tc>
         <w:tc>
           <w:tcPr>
-            <w:tcW w:type="dxa" w:w="900"/>
+            <w:tcW w:type="dxa" w:w="700"/>
             <w:tcMar>
               <w:top w:type="dxa" w:w="30"/>
               <w:left w:type="dxa" w:w="60"/>
@@ -4379,16 +4379,16 @@
         </w:tc>
         <w:tc>
           <w:tcPr>
-            <w:tcW w:type="dxa" w:w="1000"/>
-            <w:tcMar>
-              <w:top w:type="dxa" w:w="30"/>
-              <w:left w:type="dxa" w:w="60"/>
-              <w:bottom w:type="dxa" w:w="30"/>
-              <w:right w:type="dxa" w:w="60"/>
-            </w:tcMar>
-          </w:tcPr>
-          <w:p>
-            <w:hyperlink w:history="1" r:id="rIddhuj3_txvlxxxbhpsitkw">
+            <w:tcW w:type="dxa" w:w="800"/>
+            <w:tcMar>
+              <w:top w:type="dxa" w:w="30"/>
+              <w:left w:type="dxa" w:w="60"/>
+              <w:bottom w:type="dxa" w:w="30"/>
+              <w:right w:type="dxa" w:w="60"/>
+            </w:tcMar>
+          </w:tcPr>
+          <w:p>
+            <w:hyperlink w:history="1" r:id="rIdmgosrzc3zpktc-cr5tjzg">
               <w:r>
                 <w:rPr>
                   <w:rFonts w:ascii="Arial" w:cs="Arial" w:eastAsia="Arial" w:hAnsi="Arial"/>
@@ -4403,7 +4403,7 @@
         </w:tc>
         <w:tc>
           <w:tcPr>
-            <w:tcW w:type="dxa" w:w="2600"/>
+            <w:tcW w:type="dxa" w:w="2200"/>
             <w:tcMar>
               <w:top w:type="dxa" w:w="30"/>
               <w:left w:type="dxa" w:w="60"/>
@@ -4426,7 +4426,7 @@
         </w:tc>
         <w:tc>
           <w:tcPr>
-            <w:tcW w:type="dxa" w:w="1200"/>
+            <w:tcW w:type="dxa" w:w="900"/>
             <w:tcMar>
               <w:top w:type="dxa" w:w="30"/>
               <w:left w:type="dxa" w:w="60"/>
@@ -4449,7 +4449,7 @@
         </w:tc>
         <w:tc>
           <w:tcPr>
-            <w:tcW w:type="dxa" w:w="900"/>
+            <w:tcW w:type="dxa" w:w="700"/>
             <w:tcMar>
               <w:top w:type="dxa" w:w="30"/>
               <w:left w:type="dxa" w:w="60"/>
@@ -4472,16 +4472,16 @@
         </w:tc>
         <w:tc>
           <w:tcPr>
-            <w:tcW w:type="dxa" w:w="1000"/>
-            <w:tcMar>
-              <w:top w:type="dxa" w:w="30"/>
-              <w:left w:type="dxa" w:w="60"/>
-              <w:bottom w:type="dxa" w:w="30"/>
-              <w:right w:type="dxa" w:w="60"/>
-            </w:tcMar>
-          </w:tcPr>
-          <w:p>
-            <w:hyperlink w:history="1" r:id="rId6h7ci9yomw7kvqug4-iq4">
+            <w:tcW w:type="dxa" w:w="800"/>
+            <w:tcMar>
+              <w:top w:type="dxa" w:w="30"/>
+              <w:left w:type="dxa" w:w="60"/>
+              <w:bottom w:type="dxa" w:w="30"/>
+              <w:right w:type="dxa" w:w="60"/>
+            </w:tcMar>
+          </w:tcPr>
+          <w:p>
+            <w:hyperlink w:history="1" r:id="rId0ifr16jaigp6zxtkamp2g">
               <w:r>
                 <w:rPr>
                   <w:rFonts w:ascii="Arial" w:cs="Arial" w:eastAsia="Arial" w:hAnsi="Arial"/>
@@ -4498,7 +4498,7 @@
       <w:tr>
         <w:tc>
           <w:tcPr>
-            <w:tcW w:type="dxa" w:w="2600"/>
+            <w:tcW w:type="dxa" w:w="2200"/>
             <w:tcMar>
               <w:top w:type="dxa" w:w="30"/>
               <w:left w:type="dxa" w:w="60"/>
@@ -4521,7 +4521,7 @@
         </w:tc>
         <w:tc>
           <w:tcPr>
-            <w:tcW w:type="dxa" w:w="1200"/>
+            <w:tcW w:type="dxa" w:w="900"/>
             <w:tcMar>
               <w:top w:type="dxa" w:w="30"/>
               <w:left w:type="dxa" w:w="60"/>
@@ -4544,7 +4544,7 @@
         </w:tc>
         <w:tc>
           <w:tcPr>
-            <w:tcW w:type="dxa" w:w="900"/>
+            <w:tcW w:type="dxa" w:w="700"/>
             <w:tcMar>
               <w:top w:type="dxa" w:w="30"/>
               <w:left w:type="dxa" w:w="60"/>
@@ -4567,16 +4567,16 @@
         </w:tc>
         <w:tc>
           <w:tcPr>
-            <w:tcW w:type="dxa" w:w="1000"/>
-            <w:tcMar>
-              <w:top w:type="dxa" w:w="30"/>
-              <w:left w:type="dxa" w:w="60"/>
-              <w:bottom w:type="dxa" w:w="30"/>
-              <w:right w:type="dxa" w:w="60"/>
-            </w:tcMar>
-          </w:tcPr>
-          <w:p>
-            <w:hyperlink w:history="1" r:id="rIdbfpc4v5z0dosb45cgxkph">
+            <w:tcW w:type="dxa" w:w="800"/>
+            <w:tcMar>
+              <w:top w:type="dxa" w:w="30"/>
+              <w:left w:type="dxa" w:w="60"/>
+              <w:bottom w:type="dxa" w:w="30"/>
+              <w:right w:type="dxa" w:w="60"/>
+            </w:tcMar>
+          </w:tcPr>
+          <w:p>
+            <w:hyperlink w:history="1" r:id="rId3kbzxk0tgou444yijyg2n">
               <w:r>
                 <w:rPr>
                   <w:rFonts w:ascii="Arial" w:cs="Arial" w:eastAsia="Arial" w:hAnsi="Arial"/>
@@ -4591,7 +4591,7 @@
         </w:tc>
         <w:tc>
           <w:tcPr>
-            <w:tcW w:type="dxa" w:w="2600"/>
+            <w:tcW w:type="dxa" w:w="2200"/>
             <w:tcMar>
               <w:top w:type="dxa" w:w="30"/>
               <w:left w:type="dxa" w:w="60"/>
@@ -4614,7 +4614,7 @@
         </w:tc>
         <w:tc>
           <w:tcPr>
-            <w:tcW w:type="dxa" w:w="1200"/>
+            <w:tcW w:type="dxa" w:w="900"/>
             <w:tcMar>
               <w:top w:type="dxa" w:w="30"/>
               <w:left w:type="dxa" w:w="60"/>
@@ -4637,7 +4637,7 @@
         </w:tc>
         <w:tc>
           <w:tcPr>
-            <w:tcW w:type="dxa" w:w="900"/>
+            <w:tcW w:type="dxa" w:w="700"/>
             <w:tcMar>
               <w:top w:type="dxa" w:w="30"/>
               <w:left w:type="dxa" w:w="60"/>
@@ -4660,16 +4660,16 @@
         </w:tc>
         <w:tc>
           <w:tcPr>
-            <w:tcW w:type="dxa" w:w="1000"/>
-            <w:tcMar>
-              <w:top w:type="dxa" w:w="30"/>
-              <w:left w:type="dxa" w:w="60"/>
-              <w:bottom w:type="dxa" w:w="30"/>
-              <w:right w:type="dxa" w:w="60"/>
-            </w:tcMar>
-          </w:tcPr>
-          <w:p>
-            <w:hyperlink w:history="1" r:id="rIdecg3emhcg_2oasb6uw6p1">
+            <w:tcW w:type="dxa" w:w="800"/>
+            <w:tcMar>
+              <w:top w:type="dxa" w:w="30"/>
+              <w:left w:type="dxa" w:w="60"/>
+              <w:bottom w:type="dxa" w:w="30"/>
+              <w:right w:type="dxa" w:w="60"/>
+            </w:tcMar>
+          </w:tcPr>
+          <w:p>
+            <w:hyperlink w:history="1" r:id="rIdzgkfpfkfnbbvoqr3vvh47">
               <w:r>
                 <w:rPr>
                   <w:rFonts w:ascii="Arial" w:cs="Arial" w:eastAsia="Arial" w:hAnsi="Arial"/>
@@ -4686,7 +4686,7 @@
       <w:tr>
         <w:tc>
           <w:tcPr>
-            <w:tcW w:type="dxa" w:w="2600"/>
+            <w:tcW w:type="dxa" w:w="2200"/>
             <w:tcMar>
               <w:top w:type="dxa" w:w="30"/>
               <w:left w:type="dxa" w:w="60"/>
@@ -4709,7 +4709,7 @@
         </w:tc>
         <w:tc>
           <w:tcPr>
-            <w:tcW w:type="dxa" w:w="1200"/>
+            <w:tcW w:type="dxa" w:w="900"/>
             <w:tcMar>
               <w:top w:type="dxa" w:w="30"/>
               <w:left w:type="dxa" w:w="60"/>
@@ -4732,7 +4732,7 @@
         </w:tc>
         <w:tc>
           <w:tcPr>
-            <w:tcW w:type="dxa" w:w="900"/>
+            <w:tcW w:type="dxa" w:w="700"/>
             <w:tcMar>
               <w:top w:type="dxa" w:w="30"/>
               <w:left w:type="dxa" w:w="60"/>
@@ -4755,16 +4755,16 @@
         </w:tc>
         <w:tc>
           <w:tcPr>
-            <w:tcW w:type="dxa" w:w="1000"/>
-            <w:tcMar>
-              <w:top w:type="dxa" w:w="30"/>
-              <w:left w:type="dxa" w:w="60"/>
-              <w:bottom w:type="dxa" w:w="30"/>
-              <w:right w:type="dxa" w:w="60"/>
-            </w:tcMar>
-          </w:tcPr>
-          <w:p>
-            <w:hyperlink w:history="1" r:id="rId_zu0gtsp-ljpido8h85dm">
+            <w:tcW w:type="dxa" w:w="800"/>
+            <w:tcMar>
+              <w:top w:type="dxa" w:w="30"/>
+              <w:left w:type="dxa" w:w="60"/>
+              <w:bottom w:type="dxa" w:w="30"/>
+              <w:right w:type="dxa" w:w="60"/>
+            </w:tcMar>
+          </w:tcPr>
+          <w:p>
+            <w:hyperlink w:history="1" r:id="rIdpkmcun9qx04-ft3yg5xt9">
               <w:r>
                 <w:rPr>
                   <w:rFonts w:ascii="Arial" w:cs="Arial" w:eastAsia="Arial" w:hAnsi="Arial"/>
@@ -4779,7 +4779,7 @@
         </w:tc>
         <w:tc>
           <w:tcPr>
-            <w:tcW w:type="dxa" w:w="2600"/>
+            <w:tcW w:type="dxa" w:w="2200"/>
             <w:tcMar>
               <w:top w:type="dxa" w:w="30"/>
               <w:left w:type="dxa" w:w="60"/>
@@ -4802,7 +4802,7 @@
         </w:tc>
         <w:tc>
           <w:tcPr>
-            <w:tcW w:type="dxa" w:w="1200"/>
+            <w:tcW w:type="dxa" w:w="900"/>
             <w:tcMar>
               <w:top w:type="dxa" w:w="30"/>
               <w:left w:type="dxa" w:w="60"/>
@@ -4825,7 +4825,7 @@
         </w:tc>
         <w:tc>
           <w:tcPr>
-            <w:tcW w:type="dxa" w:w="900"/>
+            <w:tcW w:type="dxa" w:w="700"/>
             <w:tcMar>
               <w:top w:type="dxa" w:w="30"/>
               <w:left w:type="dxa" w:w="60"/>
@@ -4848,16 +4848,16 @@
         </w:tc>
         <w:tc>
           <w:tcPr>
-            <w:tcW w:type="dxa" w:w="1000"/>
-            <w:tcMar>
-              <w:top w:type="dxa" w:w="30"/>
-              <w:left w:type="dxa" w:w="60"/>
-              <w:bottom w:type="dxa" w:w="30"/>
-              <w:right w:type="dxa" w:w="60"/>
-            </w:tcMar>
-          </w:tcPr>
-          <w:p>
-            <w:hyperlink w:history="1" r:id="rId2u66va-xw6qwgb5boj6w4">
+            <w:tcW w:type="dxa" w:w="800"/>
+            <w:tcMar>
+              <w:top w:type="dxa" w:w="30"/>
+              <w:left w:type="dxa" w:w="60"/>
+              <w:bottom w:type="dxa" w:w="30"/>
+              <w:right w:type="dxa" w:w="60"/>
+            </w:tcMar>
+          </w:tcPr>
+          <w:p>
+            <w:hyperlink w:history="1" r:id="rId0hl8idagj3vke07odeyf5">
               <w:r>
                 <w:rPr>
                   <w:rFonts w:ascii="Arial" w:cs="Arial" w:eastAsia="Arial" w:hAnsi="Arial"/>
@@ -4874,7 +4874,7 @@
       <w:tr>
         <w:tc>
           <w:tcPr>
-            <w:tcW w:type="dxa" w:w="2600"/>
+            <w:tcW w:type="dxa" w:w="2200"/>
             <w:tcMar>
               <w:top w:type="dxa" w:w="30"/>
               <w:left w:type="dxa" w:w="60"/>
@@ -4897,7 +4897,7 @@
         </w:tc>
         <w:tc>
           <w:tcPr>
-            <w:tcW w:type="dxa" w:w="1200"/>
+            <w:tcW w:type="dxa" w:w="900"/>
             <w:tcMar>
               <w:top w:type="dxa" w:w="30"/>
               <w:left w:type="dxa" w:w="60"/>
@@ -4920,7 +4920,7 @@
         </w:tc>
         <w:tc>
           <w:tcPr>
-            <w:tcW w:type="dxa" w:w="900"/>
+            <w:tcW w:type="dxa" w:w="700"/>
             <w:tcMar>
               <w:top w:type="dxa" w:w="30"/>
               <w:left w:type="dxa" w:w="60"/>
@@ -4943,16 +4943,16 @@
         </w:tc>
         <w:tc>
           <w:tcPr>
-            <w:tcW w:type="dxa" w:w="1000"/>
-            <w:tcMar>
-              <w:top w:type="dxa" w:w="30"/>
-              <w:left w:type="dxa" w:w="60"/>
-              <w:bottom w:type="dxa" w:w="30"/>
-              <w:right w:type="dxa" w:w="60"/>
-            </w:tcMar>
-          </w:tcPr>
-          <w:p>
-            <w:hyperlink w:history="1" r:id="rIdlrjc9khvd9cx2bcse50qc">
+            <w:tcW w:type="dxa" w:w="800"/>
+            <w:tcMar>
+              <w:top w:type="dxa" w:w="30"/>
+              <w:left w:type="dxa" w:w="60"/>
+              <w:bottom w:type="dxa" w:w="30"/>
+              <w:right w:type="dxa" w:w="60"/>
+            </w:tcMar>
+          </w:tcPr>
+          <w:p>
+            <w:hyperlink w:history="1" r:id="rIdiztr77jau3txgbrdauhgc">
               <w:r>
                 <w:rPr>
                   <w:rFonts w:ascii="Arial" w:cs="Arial" w:eastAsia="Arial" w:hAnsi="Arial"/>
@@ -4967,7 +4967,7 @@
         </w:tc>
         <w:tc>
           <w:tcPr>
-            <w:tcW w:type="dxa" w:w="2600"/>
+            <w:tcW w:type="dxa" w:w="2200"/>
             <w:tcMar>
               <w:top w:type="dxa" w:w="30"/>
               <w:left w:type="dxa" w:w="60"/>
@@ -4990,7 +4990,7 @@
         </w:tc>
         <w:tc>
           <w:tcPr>
-            <w:tcW w:type="dxa" w:w="1200"/>
+            <w:tcW w:type="dxa" w:w="900"/>
             <w:tcMar>
               <w:top w:type="dxa" w:w="30"/>
               <w:left w:type="dxa" w:w="60"/>
@@ -5013,7 +5013,7 @@
         </w:tc>
         <w:tc>
           <w:tcPr>
-            <w:tcW w:type="dxa" w:w="900"/>
+            <w:tcW w:type="dxa" w:w="700"/>
             <w:tcMar>
               <w:top w:type="dxa" w:w="30"/>
               <w:left w:type="dxa" w:w="60"/>
@@ -5036,16 +5036,16 @@
         </w:tc>
         <w:tc>
           <w:tcPr>
-            <w:tcW w:type="dxa" w:w="1000"/>
-            <w:tcMar>
-              <w:top w:type="dxa" w:w="30"/>
-              <w:left w:type="dxa" w:w="60"/>
-              <w:bottom w:type="dxa" w:w="30"/>
-              <w:right w:type="dxa" w:w="60"/>
-            </w:tcMar>
-          </w:tcPr>
-          <w:p>
-            <w:hyperlink w:history="1" r:id="rIdkpao2rqpkutrgowueszo-">
+            <w:tcW w:type="dxa" w:w="800"/>
+            <w:tcMar>
+              <w:top w:type="dxa" w:w="30"/>
+              <w:left w:type="dxa" w:w="60"/>
+              <w:bottom w:type="dxa" w:w="30"/>
+              <w:right w:type="dxa" w:w="60"/>
+            </w:tcMar>
+          </w:tcPr>
+          <w:p>
+            <w:hyperlink w:history="1" r:id="rIddunnx2narueecs98xkyol">
               <w:r>
                 <w:rPr>
                   <w:rFonts w:ascii="Arial" w:cs="Arial" w:eastAsia="Arial" w:hAnsi="Arial"/>
@@ -5062,7 +5062,7 @@
       <w:tr>
         <w:tc>
           <w:tcPr>
-            <w:tcW w:type="dxa" w:w="2600"/>
+            <w:tcW w:type="dxa" w:w="2200"/>
             <w:tcMar>
               <w:top w:type="dxa" w:w="30"/>
               <w:left w:type="dxa" w:w="60"/>
@@ -5085,7 +5085,7 @@
         </w:tc>
         <w:tc>
           <w:tcPr>
-            <w:tcW w:type="dxa" w:w="1200"/>
+            <w:tcW w:type="dxa" w:w="900"/>
             <w:tcMar>
               <w:top w:type="dxa" w:w="30"/>
               <w:left w:type="dxa" w:w="60"/>
@@ -5108,7 +5108,7 @@
         </w:tc>
         <w:tc>
           <w:tcPr>
-            <w:tcW w:type="dxa" w:w="900"/>
+            <w:tcW w:type="dxa" w:w="700"/>
             <w:tcMar>
               <w:top w:type="dxa" w:w="30"/>
               <w:left w:type="dxa" w:w="60"/>
@@ -5131,16 +5131,16 @@
         </w:tc>
         <w:tc>
           <w:tcPr>
-            <w:tcW w:type="dxa" w:w="1000"/>
-            <w:tcMar>
-              <w:top w:type="dxa" w:w="30"/>
-              <w:left w:type="dxa" w:w="60"/>
-              <w:bottom w:type="dxa" w:w="30"/>
-              <w:right w:type="dxa" w:w="60"/>
-            </w:tcMar>
-          </w:tcPr>
-          <w:p>
-            <w:hyperlink w:history="1" r:id="rIda4n_wec0npkrup4m_errb">
+            <w:tcW w:type="dxa" w:w="800"/>
+            <w:tcMar>
+              <w:top w:type="dxa" w:w="30"/>
+              <w:left w:type="dxa" w:w="60"/>
+              <w:bottom w:type="dxa" w:w="30"/>
+              <w:right w:type="dxa" w:w="60"/>
+            </w:tcMar>
+          </w:tcPr>
+          <w:p>
+            <w:hyperlink w:history="1" r:id="rIdbn5vdbf9c23bn6nv_g_jy">
               <w:r>
                 <w:rPr>
                   <w:rFonts w:ascii="Arial" w:cs="Arial" w:eastAsia="Arial" w:hAnsi="Arial"/>
@@ -5155,7 +5155,7 @@
         </w:tc>
         <w:tc>
           <w:tcPr>
-            <w:tcW w:type="dxa" w:w="2600"/>
+            <w:tcW w:type="dxa" w:w="2200"/>
             <w:tcMar>
               <w:top w:type="dxa" w:w="30"/>
               <w:left w:type="dxa" w:w="60"/>
@@ -5178,7 +5178,7 @@
         </w:tc>
         <w:tc>
           <w:tcPr>
-            <w:tcW w:type="dxa" w:w="1200"/>
+            <w:tcW w:type="dxa" w:w="900"/>
             <w:tcMar>
               <w:top w:type="dxa" w:w="30"/>
               <w:left w:type="dxa" w:w="60"/>
@@ -5201,7 +5201,7 @@
         </w:tc>
         <w:tc>
           <w:tcPr>
-            <w:tcW w:type="dxa" w:w="900"/>
+            <w:tcW w:type="dxa" w:w="700"/>
             <w:tcMar>
               <w:top w:type="dxa" w:w="30"/>
               <w:left w:type="dxa" w:w="60"/>
@@ -5224,16 +5224,16 @@
         </w:tc>
         <w:tc>
           <w:tcPr>
-            <w:tcW w:type="dxa" w:w="1000"/>
-            <w:tcMar>
-              <w:top w:type="dxa" w:w="30"/>
-              <w:left w:type="dxa" w:w="60"/>
-              <w:bottom w:type="dxa" w:w="30"/>
-              <w:right w:type="dxa" w:w="60"/>
-            </w:tcMar>
-          </w:tcPr>
-          <w:p>
-            <w:hyperlink w:history="1" r:id="rIdfng4zlr8ucgaoesmz6vy_">
+            <w:tcW w:type="dxa" w:w="800"/>
+            <w:tcMar>
+              <w:top w:type="dxa" w:w="30"/>
+              <w:left w:type="dxa" w:w="60"/>
+              <w:bottom w:type="dxa" w:w="30"/>
+              <w:right w:type="dxa" w:w="60"/>
+            </w:tcMar>
+          </w:tcPr>
+          <w:p>
+            <w:hyperlink w:history="1" r:id="rIdakenuiprwjtdr54ufcwuj">
               <w:r>
                 <w:rPr>
                   <w:rFonts w:ascii="Arial" w:cs="Arial" w:eastAsia="Arial" w:hAnsi="Arial"/>
@@ -5250,7 +5250,7 @@
       <w:tr>
         <w:tc>
           <w:tcPr>
-            <w:tcW w:type="dxa" w:w="2600"/>
+            <w:tcW w:type="dxa" w:w="2200"/>
             <w:tcMar>
               <w:top w:type="dxa" w:w="30"/>
               <w:left w:type="dxa" w:w="60"/>
@@ -5273,7 +5273,7 @@
         </w:tc>
         <w:tc>
           <w:tcPr>
-            <w:tcW w:type="dxa" w:w="1200"/>
+            <w:tcW w:type="dxa" w:w="900"/>
             <w:tcMar>
               <w:top w:type="dxa" w:w="30"/>
               <w:left w:type="dxa" w:w="60"/>
@@ -5296,7 +5296,7 @@
         </w:tc>
         <w:tc>
           <w:tcPr>
-            <w:tcW w:type="dxa" w:w="900"/>
+            <w:tcW w:type="dxa" w:w="700"/>
             <w:tcMar>
               <w:top w:type="dxa" w:w="30"/>
               <w:left w:type="dxa" w:w="60"/>
@@ -5319,16 +5319,16 @@
         </w:tc>
         <w:tc>
           <w:tcPr>
-            <w:tcW w:type="dxa" w:w="1000"/>
-            <w:tcMar>
-              <w:top w:type="dxa" w:w="30"/>
-              <w:left w:type="dxa" w:w="60"/>
-              <w:bottom w:type="dxa" w:w="30"/>
-              <w:right w:type="dxa" w:w="60"/>
-            </w:tcMar>
-          </w:tcPr>
-          <w:p>
-            <w:hyperlink w:history="1" r:id="rIdffbhxlonuff0hysjjppc2">
+            <w:tcW w:type="dxa" w:w="800"/>
+            <w:tcMar>
+              <w:top w:type="dxa" w:w="30"/>
+              <w:left w:type="dxa" w:w="60"/>
+              <w:bottom w:type="dxa" w:w="30"/>
+              <w:right w:type="dxa" w:w="60"/>
+            </w:tcMar>
+          </w:tcPr>
+          <w:p>
+            <w:hyperlink w:history="1" r:id="rIdldf6eecrdk7v9kjh5gtit">
               <w:r>
                 <w:rPr>
                   <w:rFonts w:ascii="Arial" w:cs="Arial" w:eastAsia="Arial" w:hAnsi="Arial"/>
@@ -5343,7 +5343,7 @@
         </w:tc>
         <w:tc>
           <w:tcPr>
-            <w:tcW w:type="dxa" w:w="2600"/>
+            <w:tcW w:type="dxa" w:w="2200"/>
             <w:tcMar>
               <w:top w:type="dxa" w:w="30"/>
               <w:left w:type="dxa" w:w="60"/>
@@ -5366,7 +5366,7 @@
         </w:tc>
         <w:tc>
           <w:tcPr>
-            <w:tcW w:type="dxa" w:w="1200"/>
+            <w:tcW w:type="dxa" w:w="900"/>
             <w:tcMar>
               <w:top w:type="dxa" w:w="30"/>
               <w:left w:type="dxa" w:w="60"/>
@@ -5389,7 +5389,7 @@
         </w:tc>
         <w:tc>
           <w:tcPr>
-            <w:tcW w:type="dxa" w:w="900"/>
+            <w:tcW w:type="dxa" w:w="700"/>
             <w:tcMar>
               <w:top w:type="dxa" w:w="30"/>
               <w:left w:type="dxa" w:w="60"/>
@@ -5412,16 +5412,16 @@
         </w:tc>
         <w:tc>
           <w:tcPr>
-            <w:tcW w:type="dxa" w:w="1000"/>
-            <w:tcMar>
-              <w:top w:type="dxa" w:w="30"/>
-              <w:left w:type="dxa" w:w="60"/>
-              <w:bottom w:type="dxa" w:w="30"/>
-              <w:right w:type="dxa" w:w="60"/>
-            </w:tcMar>
-          </w:tcPr>
-          <w:p>
-            <w:hyperlink w:history="1" r:id="rIdg-ey2vpwjngfx3qrjl-li">
+            <w:tcW w:type="dxa" w:w="800"/>
+            <w:tcMar>
+              <w:top w:type="dxa" w:w="30"/>
+              <w:left w:type="dxa" w:w="60"/>
+              <w:bottom w:type="dxa" w:w="30"/>
+              <w:right w:type="dxa" w:w="60"/>
+            </w:tcMar>
+          </w:tcPr>
+          <w:p>
+            <w:hyperlink w:history="1" r:id="rIdknboy4xcefjmc-t2jk7g3">
               <w:r>
                 <w:rPr>
                   <w:rFonts w:ascii="Arial" w:cs="Arial" w:eastAsia="Arial" w:hAnsi="Arial"/>
@@ -5438,7 +5438,7 @@
       <w:tr>
         <w:tc>
           <w:tcPr>
-            <w:tcW w:type="dxa" w:w="2600"/>
+            <w:tcW w:type="dxa" w:w="2200"/>
             <w:tcMar>
               <w:top w:type="dxa" w:w="30"/>
               <w:left w:type="dxa" w:w="60"/>
@@ -5461,7 +5461,7 @@
         </w:tc>
         <w:tc>
           <w:tcPr>
-            <w:tcW w:type="dxa" w:w="1200"/>
+            <w:tcW w:type="dxa" w:w="900"/>
             <w:tcMar>
               <w:top w:type="dxa" w:w="30"/>
               <w:left w:type="dxa" w:w="60"/>
@@ -5484,7 +5484,7 @@
         </w:tc>
         <w:tc>
           <w:tcPr>
-            <w:tcW w:type="dxa" w:w="900"/>
+            <w:tcW w:type="dxa" w:w="700"/>
             <w:tcMar>
               <w:top w:type="dxa" w:w="30"/>
               <w:left w:type="dxa" w:w="60"/>
@@ -5507,16 +5507,16 @@
         </w:tc>
         <w:tc>
           <w:tcPr>
-            <w:tcW w:type="dxa" w:w="1000"/>
-            <w:tcMar>
-              <w:top w:type="dxa" w:w="30"/>
-              <w:left w:type="dxa" w:w="60"/>
-              <w:bottom w:type="dxa" w:w="30"/>
-              <w:right w:type="dxa" w:w="60"/>
-            </w:tcMar>
-          </w:tcPr>
-          <w:p>
-            <w:hyperlink w:history="1" r:id="rIdmpevvdzlx5yr8wnwaa61z">
+            <w:tcW w:type="dxa" w:w="800"/>
+            <w:tcMar>
+              <w:top w:type="dxa" w:w="30"/>
+              <w:left w:type="dxa" w:w="60"/>
+              <w:bottom w:type="dxa" w:w="30"/>
+              <w:right w:type="dxa" w:w="60"/>
+            </w:tcMar>
+          </w:tcPr>
+          <w:p>
+            <w:hyperlink w:history="1" r:id="rIdekzvpqbdecrtva_psnfl3">
               <w:r>
                 <w:rPr>
                   <w:rFonts w:ascii="Arial" w:cs="Arial" w:eastAsia="Arial" w:hAnsi="Arial"/>
@@ -5531,7 +5531,7 @@
         </w:tc>
         <w:tc>
           <w:tcPr>
-            <w:tcW w:type="dxa" w:w="2600"/>
+            <w:tcW w:type="dxa" w:w="2200"/>
             <w:tcMar>
               <w:top w:type="dxa" w:w="30"/>
               <w:left w:type="dxa" w:w="60"/>
@@ -5554,7 +5554,7 @@
         </w:tc>
         <w:tc>
           <w:tcPr>
-            <w:tcW w:type="dxa" w:w="1200"/>
+            <w:tcW w:type="dxa" w:w="900"/>
             <w:tcMar>
               <w:top w:type="dxa" w:w="30"/>
               <w:left w:type="dxa" w:w="60"/>
@@ -5577,7 +5577,7 @@
         </w:tc>
         <w:tc>
           <w:tcPr>
-            <w:tcW w:type="dxa" w:w="900"/>
+            <w:tcW w:type="dxa" w:w="700"/>
             <w:tcMar>
               <w:top w:type="dxa" w:w="30"/>
               <w:left w:type="dxa" w:w="60"/>
@@ -5600,16 +5600,16 @@
         </w:tc>
         <w:tc>
           <w:tcPr>
-            <w:tcW w:type="dxa" w:w="1000"/>
-            <w:tcMar>
-              <w:top w:type="dxa" w:w="30"/>
-              <w:left w:type="dxa" w:w="60"/>
-              <w:bottom w:type="dxa" w:w="30"/>
-              <w:right w:type="dxa" w:w="60"/>
-            </w:tcMar>
-          </w:tcPr>
-          <w:p>
-            <w:hyperlink w:history="1" r:id="rIdhxiw4fdf3tdvvbz-1kgpc">
+            <w:tcW w:type="dxa" w:w="800"/>
+            <w:tcMar>
+              <w:top w:type="dxa" w:w="30"/>
+              <w:left w:type="dxa" w:w="60"/>
+              <w:bottom w:type="dxa" w:w="30"/>
+              <w:right w:type="dxa" w:w="60"/>
+            </w:tcMar>
+          </w:tcPr>
+          <w:p>
+            <w:hyperlink w:history="1" r:id="rIdye_smklrbmvigbomoep0t">
               <w:r>
                 <w:rPr>
                   <w:rFonts w:ascii="Arial" w:cs="Arial" w:eastAsia="Arial" w:hAnsi="Arial"/>
@@ -5626,7 +5626,7 @@
       <w:tr>
         <w:tc>
           <w:tcPr>
-            <w:tcW w:type="dxa" w:w="2600"/>
+            <w:tcW w:type="dxa" w:w="2200"/>
             <w:tcMar>
               <w:top w:type="dxa" w:w="30"/>
               <w:left w:type="dxa" w:w="60"/>
@@ -5649,7 +5649,7 @@
         </w:tc>
         <w:tc>
           <w:tcPr>
-            <w:tcW w:type="dxa" w:w="1200"/>
+            <w:tcW w:type="dxa" w:w="900"/>
             <w:tcMar>
               <w:top w:type="dxa" w:w="30"/>
               <w:left w:type="dxa" w:w="60"/>
@@ -5672,7 +5672,7 @@
         </w:tc>
         <w:tc>
           <w:tcPr>
-            <w:tcW w:type="dxa" w:w="900"/>
+            <w:tcW w:type="dxa" w:w="700"/>
             <w:tcMar>
               <w:top w:type="dxa" w:w="30"/>
               <w:left w:type="dxa" w:w="60"/>
@@ -5695,16 +5695,16 @@
         </w:tc>
         <w:tc>
           <w:tcPr>
-            <w:tcW w:type="dxa" w:w="1000"/>
-            <w:tcMar>
-              <w:top w:type="dxa" w:w="30"/>
-              <w:left w:type="dxa" w:w="60"/>
-              <w:bottom w:type="dxa" w:w="30"/>
-              <w:right w:type="dxa" w:w="60"/>
-            </w:tcMar>
-          </w:tcPr>
-          <w:p>
-            <w:hyperlink w:history="1" r:id="rId8ibtwan5dchqjkgmfhg2j">
+            <w:tcW w:type="dxa" w:w="800"/>
+            <w:tcMar>
+              <w:top w:type="dxa" w:w="30"/>
+              <w:left w:type="dxa" w:w="60"/>
+              <w:bottom w:type="dxa" w:w="30"/>
+              <w:right w:type="dxa" w:w="60"/>
+            </w:tcMar>
+          </w:tcPr>
+          <w:p>
+            <w:hyperlink w:history="1" r:id="rIdn2ejujkjzs_4urpkappgp">
               <w:r>
                 <w:rPr>
                   <w:rFonts w:ascii="Arial" w:cs="Arial" w:eastAsia="Arial" w:hAnsi="Arial"/>
@@ -5719,7 +5719,7 @@
         </w:tc>
         <w:tc>
           <w:tcPr>
-            <w:tcW w:type="dxa" w:w="2600"/>
+            <w:tcW w:type="dxa" w:w="2200"/>
             <w:tcMar>
               <w:top w:type="dxa" w:w="30"/>
               <w:left w:type="dxa" w:w="60"/>
@@ -5742,7 +5742,7 @@
         </w:tc>
         <w:tc>
           <w:tcPr>
-            <w:tcW w:type="dxa" w:w="1200"/>
+            <w:tcW w:type="dxa" w:w="900"/>
             <w:tcMar>
               <w:top w:type="dxa" w:w="30"/>
               <w:left w:type="dxa" w:w="60"/>
@@ -5765,7 +5765,7 @@
         </w:tc>
         <w:tc>
           <w:tcPr>
-            <w:tcW w:type="dxa" w:w="900"/>
+            <w:tcW w:type="dxa" w:w="700"/>
             <w:tcMar>
               <w:top w:type="dxa" w:w="30"/>
               <w:left w:type="dxa" w:w="60"/>
@@ -5788,16 +5788,16 @@
         </w:tc>
         <w:tc>
           <w:tcPr>
-            <w:tcW w:type="dxa" w:w="1000"/>
-            <w:tcMar>
-              <w:top w:type="dxa" w:w="30"/>
-              <w:left w:type="dxa" w:w="60"/>
-              <w:bottom w:type="dxa" w:w="30"/>
-              <w:right w:type="dxa" w:w="60"/>
-            </w:tcMar>
-          </w:tcPr>
-          <w:p>
-            <w:hyperlink w:history="1" r:id="rIdqe7g0b5_fsggmtdrmz8xj">
+            <w:tcW w:type="dxa" w:w="800"/>
+            <w:tcMar>
+              <w:top w:type="dxa" w:w="30"/>
+              <w:left w:type="dxa" w:w="60"/>
+              <w:bottom w:type="dxa" w:w="30"/>
+              <w:right w:type="dxa" w:w="60"/>
+            </w:tcMar>
+          </w:tcPr>
+          <w:p>
+            <w:hyperlink w:history="1" r:id="rId4czoncowhryfyuyrovzco">
               <w:r>
                 <w:rPr>
                   <w:rFonts w:ascii="Arial" w:cs="Arial" w:eastAsia="Arial" w:hAnsi="Arial"/>
@@ -5814,7 +5814,7 @@
       <w:tr>
         <w:tc>
           <w:tcPr>
-            <w:tcW w:type="dxa" w:w="2600"/>
+            <w:tcW w:type="dxa" w:w="2200"/>
             <w:tcMar>
               <w:top w:type="dxa" w:w="30"/>
               <w:left w:type="dxa" w:w="60"/>
@@ -5837,7 +5837,7 @@
         </w:tc>
         <w:tc>
           <w:tcPr>
-            <w:tcW w:type="dxa" w:w="1200"/>
+            <w:tcW w:type="dxa" w:w="900"/>
             <w:tcMar>
               <w:top w:type="dxa" w:w="30"/>
               <w:left w:type="dxa" w:w="60"/>
@@ -5860,7 +5860,7 @@
         </w:tc>
         <w:tc>
           <w:tcPr>
-            <w:tcW w:type="dxa" w:w="900"/>
+            <w:tcW w:type="dxa" w:w="700"/>
             <w:tcMar>
               <w:top w:type="dxa" w:w="30"/>
               <w:left w:type="dxa" w:w="60"/>
@@ -5883,16 +5883,16 @@
         </w:tc>
         <w:tc>
           <w:tcPr>
-            <w:tcW w:type="dxa" w:w="1000"/>
-            <w:tcMar>
-              <w:top w:type="dxa" w:w="30"/>
-              <w:left w:type="dxa" w:w="60"/>
-              <w:bottom w:type="dxa" w:w="30"/>
-              <w:right w:type="dxa" w:w="60"/>
-            </w:tcMar>
-          </w:tcPr>
-          <w:p>
-            <w:hyperlink w:history="1" r:id="rId64vrgqiw4trjk6yb28yr-">
+            <w:tcW w:type="dxa" w:w="800"/>
+            <w:tcMar>
+              <w:top w:type="dxa" w:w="30"/>
+              <w:left w:type="dxa" w:w="60"/>
+              <w:bottom w:type="dxa" w:w="30"/>
+              <w:right w:type="dxa" w:w="60"/>
+            </w:tcMar>
+          </w:tcPr>
+          <w:p>
+            <w:hyperlink w:history="1" r:id="rIdb7607xooc4_zlkxikzk3w">
               <w:r>
                 <w:rPr>
                   <w:rFonts w:ascii="Arial" w:cs="Arial" w:eastAsia="Arial" w:hAnsi="Arial"/>
@@ -5907,7 +5907,7 @@
         </w:tc>
         <w:tc>
           <w:tcPr>
-            <w:tcW w:type="dxa" w:w="2600"/>
+            <w:tcW w:type="dxa" w:w="2200"/>
             <w:tcMar>
               <w:top w:type="dxa" w:w="30"/>
               <w:left w:type="dxa" w:w="60"/>
@@ -5930,7 +5930,7 @@
         </w:tc>
         <w:tc>
           <w:tcPr>
-            <w:tcW w:type="dxa" w:w="1200"/>
+            <w:tcW w:type="dxa" w:w="900"/>
             <w:tcMar>
               <w:top w:type="dxa" w:w="30"/>
               <w:left w:type="dxa" w:w="60"/>
@@ -5953,7 +5953,7 @@
         </w:tc>
         <w:tc>
           <w:tcPr>
-            <w:tcW w:type="dxa" w:w="900"/>
+            <w:tcW w:type="dxa" w:w="700"/>
             <w:tcMar>
               <w:top w:type="dxa" w:w="30"/>
               <w:left w:type="dxa" w:w="60"/>
@@ -5976,16 +5976,16 @@
         </w:tc>
         <w:tc>
           <w:tcPr>
-            <w:tcW w:type="dxa" w:w="1000"/>
-            <w:tcMar>
-              <w:top w:type="dxa" w:w="30"/>
-              <w:left w:type="dxa" w:w="60"/>
-              <w:bottom w:type="dxa" w:w="30"/>
-              <w:right w:type="dxa" w:w="60"/>
-            </w:tcMar>
-          </w:tcPr>
-          <w:p>
-            <w:hyperlink w:history="1" r:id="rIduymkyfuxeebkfhuhyx-0b">
+            <w:tcW w:type="dxa" w:w="800"/>
+            <w:tcMar>
+              <w:top w:type="dxa" w:w="30"/>
+              <w:left w:type="dxa" w:w="60"/>
+              <w:bottom w:type="dxa" w:w="30"/>
+              <w:right w:type="dxa" w:w="60"/>
+            </w:tcMar>
+          </w:tcPr>
+          <w:p>
+            <w:hyperlink w:history="1" r:id="rIdm6nnmodwa5wurifa2myrt">
               <w:r>
                 <w:rPr>
                   <w:rFonts w:ascii="Arial" w:cs="Arial" w:eastAsia="Arial" w:hAnsi="Arial"/>
@@ -6002,7 +6002,7 @@
       <w:tr>
         <w:tc>
           <w:tcPr>
-            <w:tcW w:type="dxa" w:w="2600"/>
+            <w:tcW w:type="dxa" w:w="2200"/>
             <w:tcMar>
               <w:top w:type="dxa" w:w="30"/>
               <w:left w:type="dxa" w:w="60"/>
@@ -6025,7 +6025,7 @@
         </w:tc>
         <w:tc>
           <w:tcPr>
-            <w:tcW w:type="dxa" w:w="1200"/>
+            <w:tcW w:type="dxa" w:w="900"/>
             <w:tcMar>
               <w:top w:type="dxa" w:w="30"/>
               <w:left w:type="dxa" w:w="60"/>
@@ -6048,7 +6048,7 @@
         </w:tc>
         <w:tc>
           <w:tcPr>
-            <w:tcW w:type="dxa" w:w="900"/>
+            <w:tcW w:type="dxa" w:w="700"/>
             <w:tcMar>
               <w:top w:type="dxa" w:w="30"/>
               <w:left w:type="dxa" w:w="60"/>
@@ -6071,16 +6071,16 @@
         </w:tc>
         <w:tc>
           <w:tcPr>
-            <w:tcW w:type="dxa" w:w="1000"/>
-            <w:tcMar>
-              <w:top w:type="dxa" w:w="30"/>
-              <w:left w:type="dxa" w:w="60"/>
-              <w:bottom w:type="dxa" w:w="30"/>
-              <w:right w:type="dxa" w:w="60"/>
-            </w:tcMar>
-          </w:tcPr>
-          <w:p>
-            <w:hyperlink w:history="1" r:id="rIdmsw4qcy_v2hgucfnn7a3b">
+            <w:tcW w:type="dxa" w:w="800"/>
+            <w:tcMar>
+              <w:top w:type="dxa" w:w="30"/>
+              <w:left w:type="dxa" w:w="60"/>
+              <w:bottom w:type="dxa" w:w="30"/>
+              <w:right w:type="dxa" w:w="60"/>
+            </w:tcMar>
+          </w:tcPr>
+          <w:p>
+            <w:hyperlink w:history="1" r:id="rId125dnghklh5xgwuty4bmg">
               <w:r>
                 <w:rPr>
                   <w:rFonts w:ascii="Arial" w:cs="Arial" w:eastAsia="Arial" w:hAnsi="Arial"/>
@@ -6095,7 +6095,7 @@
         </w:tc>
         <w:tc>
           <w:tcPr>
-            <w:tcW w:type="dxa" w:w="2600"/>
+            <w:tcW w:type="dxa" w:w="2200"/>
             <w:tcMar>
               <w:top w:type="dxa" w:w="30"/>
               <w:left w:type="dxa" w:w="60"/>
@@ -6118,7 +6118,7 @@
         </w:tc>
         <w:tc>
           <w:tcPr>
-            <w:tcW w:type="dxa" w:w="1200"/>
+            <w:tcW w:type="dxa" w:w="900"/>
             <w:tcMar>
               <w:top w:type="dxa" w:w="30"/>
               <w:left w:type="dxa" w:w="60"/>
@@ -6141,7 +6141,7 @@
         </w:tc>
         <w:tc>
           <w:tcPr>
-            <w:tcW w:type="dxa" w:w="900"/>
+            <w:tcW w:type="dxa" w:w="700"/>
             <w:tcMar>
               <w:top w:type="dxa" w:w="30"/>
               <w:left w:type="dxa" w:w="60"/>
@@ -6164,16 +6164,16 @@
         </w:tc>
         <w:tc>
           <w:tcPr>
-            <w:tcW w:type="dxa" w:w="1000"/>
-            <w:tcMar>
-              <w:top w:type="dxa" w:w="30"/>
-              <w:left w:type="dxa" w:w="60"/>
-              <w:bottom w:type="dxa" w:w="30"/>
-              <w:right w:type="dxa" w:w="60"/>
-            </w:tcMar>
-          </w:tcPr>
-          <w:p>
-            <w:hyperlink w:history="1" r:id="rIdqoww3pyoo8pnzmpci5943">
+            <w:tcW w:type="dxa" w:w="800"/>
+            <w:tcMar>
+              <w:top w:type="dxa" w:w="30"/>
+              <w:left w:type="dxa" w:w="60"/>
+              <w:bottom w:type="dxa" w:w="30"/>
+              <w:right w:type="dxa" w:w="60"/>
+            </w:tcMar>
+          </w:tcPr>
+          <w:p>
+            <w:hyperlink w:history="1" r:id="rIdhuioptcytox_r27hvyjhm">
               <w:r>
                 <w:rPr>
                   <w:rFonts w:ascii="Arial" w:cs="Arial" w:eastAsia="Arial" w:hAnsi="Arial"/>
@@ -6190,7 +6190,7 @@
       <w:tr>
         <w:tc>
           <w:tcPr>
-            <w:tcW w:type="dxa" w:w="2600"/>
+            <w:tcW w:type="dxa" w:w="2200"/>
             <w:tcMar>
               <w:top w:type="dxa" w:w="30"/>
               <w:left w:type="dxa" w:w="60"/>
@@ -6213,7 +6213,7 @@
         </w:tc>
         <w:tc>
           <w:tcPr>
-            <w:tcW w:type="dxa" w:w="1200"/>
+            <w:tcW w:type="dxa" w:w="900"/>
             <w:tcMar>
               <w:top w:type="dxa" w:w="30"/>
               <w:left w:type="dxa" w:w="60"/>
@@ -6236,7 +6236,7 @@
         </w:tc>
         <w:tc>
           <w:tcPr>
-            <w:tcW w:type="dxa" w:w="900"/>
+            <w:tcW w:type="dxa" w:w="700"/>
             <w:tcMar>
               <w:top w:type="dxa" w:w="30"/>
               <w:left w:type="dxa" w:w="60"/>
@@ -6259,16 +6259,16 @@
         </w:tc>
         <w:tc>
           <w:tcPr>
-            <w:tcW w:type="dxa" w:w="1000"/>
-            <w:tcMar>
-              <w:top w:type="dxa" w:w="30"/>
-              <w:left w:type="dxa" w:w="60"/>
-              <w:bottom w:type="dxa" w:w="30"/>
-              <w:right w:type="dxa" w:w="60"/>
-            </w:tcMar>
-          </w:tcPr>
-          <w:p>
-            <w:hyperlink w:history="1" r:id="rIdme6brximf1n3fa2hx5bka">
+            <w:tcW w:type="dxa" w:w="800"/>
+            <w:tcMar>
+              <w:top w:type="dxa" w:w="30"/>
+              <w:left w:type="dxa" w:w="60"/>
+              <w:bottom w:type="dxa" w:w="30"/>
+              <w:right w:type="dxa" w:w="60"/>
+            </w:tcMar>
+          </w:tcPr>
+          <w:p>
+            <w:hyperlink w:history="1" r:id="rIdphy1hnwkf5rzmzt8fmh3t">
               <w:r>
                 <w:rPr>
                   <w:rFonts w:ascii="Arial" w:cs="Arial" w:eastAsia="Arial" w:hAnsi="Arial"/>
@@ -6283,7 +6283,7 @@
         </w:tc>
         <w:tc>
           <w:tcPr>
-            <w:tcW w:type="dxa" w:w="2600"/>
+            <w:tcW w:type="dxa" w:w="2200"/>
             <w:tcMar>
               <w:top w:type="dxa" w:w="30"/>
               <w:left w:type="dxa" w:w="60"/>
@@ -6306,7 +6306,7 @@
         </w:tc>
         <w:tc>
           <w:tcPr>
-            <w:tcW w:type="dxa" w:w="1200"/>
+            <w:tcW w:type="dxa" w:w="900"/>
             <w:tcMar>
               <w:top w:type="dxa" w:w="30"/>
               <w:left w:type="dxa" w:w="60"/>
@@ -6329,7 +6329,7 @@
         </w:tc>
         <w:tc>
           <w:tcPr>
-            <w:tcW w:type="dxa" w:w="900"/>
+            <w:tcW w:type="dxa" w:w="700"/>
             <w:tcMar>
               <w:top w:type="dxa" w:w="30"/>
               <w:left w:type="dxa" w:w="60"/>
@@ -6352,16 +6352,16 @@
         </w:tc>
         <w:tc>
           <w:tcPr>
-            <w:tcW w:type="dxa" w:w="1000"/>
-            <w:tcMar>
-              <w:top w:type="dxa" w:w="30"/>
-              <w:left w:type="dxa" w:w="60"/>
-              <w:bottom w:type="dxa" w:w="30"/>
-              <w:right w:type="dxa" w:w="60"/>
-            </w:tcMar>
-          </w:tcPr>
-          <w:p>
-            <w:hyperlink w:history="1" r:id="rIdzpzhuswuet3jo0mc6x0h9">
+            <w:tcW w:type="dxa" w:w="800"/>
+            <w:tcMar>
+              <w:top w:type="dxa" w:w="30"/>
+              <w:left w:type="dxa" w:w="60"/>
+              <w:bottom w:type="dxa" w:w="30"/>
+              <w:right w:type="dxa" w:w="60"/>
+            </w:tcMar>
+          </w:tcPr>
+          <w:p>
+            <w:hyperlink w:history="1" r:id="rIdweucfumfjk72ce6qmwggq">
               <w:r>
                 <w:rPr>
                   <w:rFonts w:ascii="Arial" w:cs="Arial" w:eastAsia="Arial" w:hAnsi="Arial"/>
@@ -6378,7 +6378,7 @@
       <w:tr>
         <w:tc>
           <w:tcPr>
-            <w:tcW w:type="dxa" w:w="2600"/>
+            <w:tcW w:type="dxa" w:w="2200"/>
             <w:tcMar>
               <w:top w:type="dxa" w:w="30"/>
               <w:left w:type="dxa" w:w="60"/>
@@ -6401,7 +6401,7 @@
         </w:tc>
         <w:tc>
           <w:tcPr>
-            <w:tcW w:type="dxa" w:w="1200"/>
+            <w:tcW w:type="dxa" w:w="900"/>
             <w:tcMar>
               <w:top w:type="dxa" w:w="30"/>
               <w:left w:type="dxa" w:w="60"/>
@@ -6424,7 +6424,7 @@
         </w:tc>
         <w:tc>
           <w:tcPr>
-            <w:tcW w:type="dxa" w:w="900"/>
+            <w:tcW w:type="dxa" w:w="700"/>
             <w:tcMar>
               <w:top w:type="dxa" w:w="30"/>
               <w:left w:type="dxa" w:w="60"/>
@@ -6447,16 +6447,16 @@
         </w:tc>
         <w:tc>
           <w:tcPr>
-            <w:tcW w:type="dxa" w:w="1000"/>
-            <w:tcMar>
-              <w:top w:type="dxa" w:w="30"/>
-              <w:left w:type="dxa" w:w="60"/>
-              <w:bottom w:type="dxa" w:w="30"/>
-              <w:right w:type="dxa" w:w="60"/>
-            </w:tcMar>
-          </w:tcPr>
-          <w:p>
-            <w:hyperlink w:history="1" r:id="rIdbvt5onnuf8wsh7tijlpiv">
+            <w:tcW w:type="dxa" w:w="800"/>
+            <w:tcMar>
+              <w:top w:type="dxa" w:w="30"/>
+              <w:left w:type="dxa" w:w="60"/>
+              <w:bottom w:type="dxa" w:w="30"/>
+              <w:right w:type="dxa" w:w="60"/>
+            </w:tcMar>
+          </w:tcPr>
+          <w:p>
+            <w:hyperlink w:history="1" r:id="rIdeqckik6paxvcyo9v40th5">
               <w:r>
                 <w:rPr>
                   <w:rFonts w:ascii="Arial" w:cs="Arial" w:eastAsia="Arial" w:hAnsi="Arial"/>
@@ -6471,7 +6471,7 @@
         </w:tc>
         <w:tc>
           <w:tcPr>
-            <w:tcW w:type="dxa" w:w="2600"/>
+            <w:tcW w:type="dxa" w:w="2200"/>
             <w:tcMar>
               <w:top w:type="dxa" w:w="30"/>
               <w:left w:type="dxa" w:w="60"/>
@@ -6494,7 +6494,7 @@
         </w:tc>
         <w:tc>
           <w:tcPr>
-            <w:tcW w:type="dxa" w:w="1200"/>
+            <w:tcW w:type="dxa" w:w="900"/>
             <w:tcMar>
               <w:top w:type="dxa" w:w="30"/>
               <w:left w:type="dxa" w:w="60"/>
@@ -6517,7 +6517,7 @@
         </w:tc>
         <w:tc>
           <w:tcPr>
-            <w:tcW w:type="dxa" w:w="900"/>
+            <w:tcW w:type="dxa" w:w="700"/>
             <w:tcMar>
               <w:top w:type="dxa" w:w="30"/>
               <w:left w:type="dxa" w:w="60"/>
@@ -6540,16 +6540,16 @@
         </w:tc>
         <w:tc>
           <w:tcPr>
-            <w:tcW w:type="dxa" w:w="1000"/>
-            <w:tcMar>
-              <w:top w:type="dxa" w:w="30"/>
-              <w:left w:type="dxa" w:w="60"/>
-              <w:bottom w:type="dxa" w:w="30"/>
-              <w:right w:type="dxa" w:w="60"/>
-            </w:tcMar>
-          </w:tcPr>
-          <w:p>
-            <w:hyperlink w:history="1" r:id="rIdbkdiyivk9aakbfn8nlh2z">
+            <w:tcW w:type="dxa" w:w="800"/>
+            <w:tcMar>
+              <w:top w:type="dxa" w:w="30"/>
+              <w:left w:type="dxa" w:w="60"/>
+              <w:bottom w:type="dxa" w:w="30"/>
+              <w:right w:type="dxa" w:w="60"/>
+            </w:tcMar>
+          </w:tcPr>
+          <w:p>
+            <w:hyperlink w:history="1" r:id="rIdx2dkduimdxskrgld7ar_f">
               <w:r>
                 <w:rPr>
                   <w:rFonts w:ascii="Arial" w:cs="Arial" w:eastAsia="Arial" w:hAnsi="Arial"/>
@@ -6566,7 +6566,7 @@
       <w:tr>
         <w:tc>
           <w:tcPr>
-            <w:tcW w:type="dxa" w:w="2600"/>
+            <w:tcW w:type="dxa" w:w="2200"/>
             <w:tcMar>
               <w:top w:type="dxa" w:w="30"/>
               <w:left w:type="dxa" w:w="60"/>
@@ -6589,7 +6589,7 @@
         </w:tc>
         <w:tc>
           <w:tcPr>
-            <w:tcW w:type="dxa" w:w="1200"/>
+            <w:tcW w:type="dxa" w:w="900"/>
             <w:tcMar>
               <w:top w:type="dxa" w:w="30"/>
               <w:left w:type="dxa" w:w="60"/>
@@ -6612,7 +6612,7 @@
         </w:tc>
         <w:tc>
           <w:tcPr>
-            <w:tcW w:type="dxa" w:w="900"/>
+            <w:tcW w:type="dxa" w:w="700"/>
             <w:tcMar>
               <w:top w:type="dxa" w:w="30"/>
               <w:left w:type="dxa" w:w="60"/>
@@ -6635,16 +6635,16 @@
         </w:tc>
         <w:tc>
           <w:tcPr>
-            <w:tcW w:type="dxa" w:w="1000"/>
-            <w:tcMar>
-              <w:top w:type="dxa" w:w="30"/>
-              <w:left w:type="dxa" w:w="60"/>
-              <w:bottom w:type="dxa" w:w="30"/>
-              <w:right w:type="dxa" w:w="60"/>
-            </w:tcMar>
-          </w:tcPr>
-          <w:p>
-            <w:hyperlink w:history="1" r:id="rIdxal8hni3nosyswcvtyr1q">
+            <w:tcW w:type="dxa" w:w="800"/>
+            <w:tcMar>
+              <w:top w:type="dxa" w:w="30"/>
+              <w:left w:type="dxa" w:w="60"/>
+              <w:bottom w:type="dxa" w:w="30"/>
+              <w:right w:type="dxa" w:w="60"/>
+            </w:tcMar>
+          </w:tcPr>
+          <w:p>
+            <w:hyperlink w:history="1" r:id="rIdyiqxntg507p2as-vhmfcn">
               <w:r>
                 <w:rPr>
                   <w:rFonts w:ascii="Arial" w:cs="Arial" w:eastAsia="Arial" w:hAnsi="Arial"/>
@@ -6659,7 +6659,7 @@
         </w:tc>
         <w:tc>
           <w:tcPr>
-            <w:tcW w:type="dxa" w:w="2600"/>
+            <w:tcW w:type="dxa" w:w="2200"/>
             <w:tcMar>
               <w:top w:type="dxa" w:w="30"/>
               <w:left w:type="dxa" w:w="60"/>
@@ -6682,7 +6682,7 @@
         </w:tc>
         <w:tc>
           <w:tcPr>
-            <w:tcW w:type="dxa" w:w="1200"/>
+            <w:tcW w:type="dxa" w:w="900"/>
             <w:tcMar>
               <w:top w:type="dxa" w:w="30"/>
               <w:left w:type="dxa" w:w="60"/>
@@ -6705,7 +6705,7 @@
         </w:tc>
         <w:tc>
           <w:tcPr>
-            <w:tcW w:type="dxa" w:w="900"/>
+            <w:tcW w:type="dxa" w:w="700"/>
             <w:tcMar>
               <w:top w:type="dxa" w:w="30"/>
               <w:left w:type="dxa" w:w="60"/>
@@ -6728,16 +6728,16 @@
         </w:tc>
         <w:tc>
           <w:tcPr>
-            <w:tcW w:type="dxa" w:w="1000"/>
-            <w:tcMar>
-              <w:top w:type="dxa" w:w="30"/>
-              <w:left w:type="dxa" w:w="60"/>
-              <w:bottom w:type="dxa" w:w="30"/>
-              <w:right w:type="dxa" w:w="60"/>
-            </w:tcMar>
-          </w:tcPr>
-          <w:p>
-            <w:hyperlink w:history="1" r:id="rIdsnbszd07rvb0ev9yp32gn">
+            <w:tcW w:type="dxa" w:w="800"/>
+            <w:tcMar>
+              <w:top w:type="dxa" w:w="30"/>
+              <w:left w:type="dxa" w:w="60"/>
+              <w:bottom w:type="dxa" w:w="30"/>
+              <w:right w:type="dxa" w:w="60"/>
+            </w:tcMar>
+          </w:tcPr>
+          <w:p>
+            <w:hyperlink w:history="1" r:id="rIddhntk_p7bu1lsd-lzukvw">
               <w:r>
                 <w:rPr>
                   <w:rFonts w:ascii="Arial" w:cs="Arial" w:eastAsia="Arial" w:hAnsi="Arial"/>
@@ -6754,7 +6754,7 @@
       <w:tr>
         <w:tc>
           <w:tcPr>
-            <w:tcW w:type="dxa" w:w="2600"/>
+            <w:tcW w:type="dxa" w:w="2200"/>
             <w:tcMar>
               <w:top w:type="dxa" w:w="30"/>
               <w:left w:type="dxa" w:w="60"/>
@@ -6777,7 +6777,7 @@
         </w:tc>
         <w:tc>
           <w:tcPr>
-            <w:tcW w:type="dxa" w:w="1200"/>
+            <w:tcW w:type="dxa" w:w="900"/>
             <w:tcMar>
               <w:top w:type="dxa" w:w="30"/>
               <w:left w:type="dxa" w:w="60"/>
@@ -6800,7 +6800,7 @@
         </w:tc>
         <w:tc>
           <w:tcPr>
-            <w:tcW w:type="dxa" w:w="900"/>
+            <w:tcW w:type="dxa" w:w="700"/>
             <w:tcMar>
               <w:top w:type="dxa" w:w="30"/>
               <w:left w:type="dxa" w:w="60"/>
@@ -6823,16 +6823,16 @@
         </w:tc>
         <w:tc>
           <w:tcPr>
-            <w:tcW w:type="dxa" w:w="1000"/>
-            <w:tcMar>
-              <w:top w:type="dxa" w:w="30"/>
-              <w:left w:type="dxa" w:w="60"/>
-              <w:bottom w:type="dxa" w:w="30"/>
-              <w:right w:type="dxa" w:w="60"/>
-            </w:tcMar>
-          </w:tcPr>
-          <w:p>
-            <w:hyperlink w:history="1" r:id="rIdfceqvhvorob2mp9rzvzlv">
+            <w:tcW w:type="dxa" w:w="800"/>
+            <w:tcMar>
+              <w:top w:type="dxa" w:w="30"/>
+              <w:left w:type="dxa" w:w="60"/>
+              <w:bottom w:type="dxa" w:w="30"/>
+              <w:right w:type="dxa" w:w="60"/>
+            </w:tcMar>
+          </w:tcPr>
+          <w:p>
+            <w:hyperlink w:history="1" r:id="rIdf6rl7sn24fbhijcl4zgay">
               <w:r>
                 <w:rPr>
                   <w:rFonts w:ascii="Arial" w:cs="Arial" w:eastAsia="Arial" w:hAnsi="Arial"/>
@@ -6847,7 +6847,7 @@
         </w:tc>
         <w:tc>
           <w:tcPr>
-            <w:tcW w:type="dxa" w:w="2600"/>
+            <w:tcW w:type="dxa" w:w="2200"/>
             <w:tcMar>
               <w:top w:type="dxa" w:w="30"/>
               <w:left w:type="dxa" w:w="60"/>
@@ -6870,7 +6870,7 @@
         </w:tc>
         <w:tc>
           <w:tcPr>
-            <w:tcW w:type="dxa" w:w="1200"/>
+            <w:tcW w:type="dxa" w:w="900"/>
             <w:tcMar>
               <w:top w:type="dxa" w:w="30"/>
               <w:left w:type="dxa" w:w="60"/>
@@ -6893,7 +6893,7 @@
         </w:tc>
         <w:tc>
           <w:tcPr>
-            <w:tcW w:type="dxa" w:w="900"/>
+            <w:tcW w:type="dxa" w:w="700"/>
             <w:tcMar>
               <w:top w:type="dxa" w:w="30"/>
               <w:left w:type="dxa" w:w="60"/>
@@ -6916,16 +6916,16 @@
         </w:tc>
         <w:tc>
           <w:tcPr>
-            <w:tcW w:type="dxa" w:w="1000"/>
-            <w:tcMar>
-              <w:top w:type="dxa" w:w="30"/>
-              <w:left w:type="dxa" w:w="60"/>
-              <w:bottom w:type="dxa" w:w="30"/>
-              <w:right w:type="dxa" w:w="60"/>
-            </w:tcMar>
-          </w:tcPr>
-          <w:p>
-            <w:hyperlink w:history="1" r:id="rIdwgzdx5hhd-eoalzhgkccn">
+            <w:tcW w:type="dxa" w:w="800"/>
+            <w:tcMar>
+              <w:top w:type="dxa" w:w="30"/>
+              <w:left w:type="dxa" w:w="60"/>
+              <w:bottom w:type="dxa" w:w="30"/>
+              <w:right w:type="dxa" w:w="60"/>
+            </w:tcMar>
+          </w:tcPr>
+          <w:p>
+            <w:hyperlink w:history="1" r:id="rIdgw22ps3khigivjoifvptx">
               <w:r>
                 <w:rPr>
                   <w:rFonts w:ascii="Arial" w:cs="Arial" w:eastAsia="Arial" w:hAnsi="Arial"/>
@@ -6942,7 +6942,7 @@
       <w:tr>
         <w:tc>
           <w:tcPr>
-            <w:tcW w:type="dxa" w:w="2600"/>
+            <w:tcW w:type="dxa" w:w="2200"/>
             <w:tcMar>
               <w:top w:type="dxa" w:w="30"/>
               <w:left w:type="dxa" w:w="60"/>
@@ -6965,7 +6965,7 @@
         </w:tc>
         <w:tc>
           <w:tcPr>
-            <w:tcW w:type="dxa" w:w="1200"/>
+            <w:tcW w:type="dxa" w:w="900"/>
             <w:tcMar>
               <w:top w:type="dxa" w:w="30"/>
               <w:left w:type="dxa" w:w="60"/>
@@ -6988,7 +6988,7 @@
         </w:tc>
         <w:tc>
           <w:tcPr>
-            <w:tcW w:type="dxa" w:w="900"/>
+            <w:tcW w:type="dxa" w:w="700"/>
             <w:tcMar>
               <w:top w:type="dxa" w:w="30"/>
               <w:left w:type="dxa" w:w="60"/>
@@ -7011,16 +7011,16 @@
         </w:tc>
         <w:tc>
           <w:tcPr>
-            <w:tcW w:type="dxa" w:w="1000"/>
-            <w:tcMar>
-              <w:top w:type="dxa" w:w="30"/>
-              <w:left w:type="dxa" w:w="60"/>
-              <w:bottom w:type="dxa" w:w="30"/>
-              <w:right w:type="dxa" w:w="60"/>
-            </w:tcMar>
-          </w:tcPr>
-          <w:p>
-            <w:hyperlink w:history="1" r:id="rIdkyopllzndaemr9w9y0gii">
+            <w:tcW w:type="dxa" w:w="800"/>
+            <w:tcMar>
+              <w:top w:type="dxa" w:w="30"/>
+              <w:left w:type="dxa" w:w="60"/>
+              <w:bottom w:type="dxa" w:w="30"/>
+              <w:right w:type="dxa" w:w="60"/>
+            </w:tcMar>
+          </w:tcPr>
+          <w:p>
+            <w:hyperlink w:history="1" r:id="rId0_ag9no5z16etxbbvvdxk">
               <w:r>
                 <w:rPr>
                   <w:rFonts w:ascii="Arial" w:cs="Arial" w:eastAsia="Arial" w:hAnsi="Arial"/>
@@ -7035,7 +7035,7 @@
         </w:tc>
         <w:tc>
           <w:tcPr>
-            <w:tcW w:type="dxa" w:w="2600"/>
+            <w:tcW w:type="dxa" w:w="2200"/>
             <w:tcMar>
               <w:top w:type="dxa" w:w="30"/>
               <w:left w:type="dxa" w:w="60"/>
@@ -7058,7 +7058,7 @@
         </w:tc>
         <w:tc>
           <w:tcPr>
-            <w:tcW w:type="dxa" w:w="1200"/>
+            <w:tcW w:type="dxa" w:w="900"/>
             <w:tcMar>
               <w:top w:type="dxa" w:w="30"/>
               <w:left w:type="dxa" w:w="60"/>
@@ -7081,7 +7081,7 @@
         </w:tc>
         <w:tc>
           <w:tcPr>
-            <w:tcW w:type="dxa" w:w="900"/>
+            <w:tcW w:type="dxa" w:w="700"/>
             <w:tcMar>
               <w:top w:type="dxa" w:w="30"/>
               <w:left w:type="dxa" w:w="60"/>
@@ -7104,16 +7104,16 @@
         </w:tc>
         <w:tc>
           <w:tcPr>
-            <w:tcW w:type="dxa" w:w="1000"/>
-            <w:tcMar>
-              <w:top w:type="dxa" w:w="30"/>
-              <w:left w:type="dxa" w:w="60"/>
-              <w:bottom w:type="dxa" w:w="30"/>
-              <w:right w:type="dxa" w:w="60"/>
-            </w:tcMar>
-          </w:tcPr>
-          <w:p>
-            <w:hyperlink w:history="1" r:id="rIddw3vl1sw_pjbvqbedwdw_">
+            <w:tcW w:type="dxa" w:w="800"/>
+            <w:tcMar>
+              <w:top w:type="dxa" w:w="30"/>
+              <w:left w:type="dxa" w:w="60"/>
+              <w:bottom w:type="dxa" w:w="30"/>
+              <w:right w:type="dxa" w:w="60"/>
+            </w:tcMar>
+          </w:tcPr>
+          <w:p>
+            <w:hyperlink w:history="1" r:id="rId1m5eg4hk4jajlk09j2ptp">
               <w:r>
                 <w:rPr>
                   <w:rFonts w:ascii="Arial" w:cs="Arial" w:eastAsia="Arial" w:hAnsi="Arial"/>
@@ -7130,7 +7130,7 @@
       <w:tr>
         <w:tc>
           <w:tcPr>
-            <w:tcW w:type="dxa" w:w="2600"/>
+            <w:tcW w:type="dxa" w:w="2200"/>
             <w:tcMar>
               <w:top w:type="dxa" w:w="30"/>
               <w:left w:type="dxa" w:w="60"/>
@@ -7153,7 +7153,7 @@
         </w:tc>
         <w:tc>
           <w:tcPr>
-            <w:tcW w:type="dxa" w:w="1200"/>
+            <w:tcW w:type="dxa" w:w="900"/>
             <w:tcMar>
               <w:top w:type="dxa" w:w="30"/>
               <w:left w:type="dxa" w:w="60"/>
@@ -7176,7 +7176,7 @@
         </w:tc>
         <w:tc>
           <w:tcPr>
-            <w:tcW w:type="dxa" w:w="900"/>
+            <w:tcW w:type="dxa" w:w="700"/>
             <w:tcMar>
               <w:top w:type="dxa" w:w="30"/>
               <w:left w:type="dxa" w:w="60"/>
@@ -7199,16 +7199,16 @@
         </w:tc>
         <w:tc>
           <w:tcPr>
-            <w:tcW w:type="dxa" w:w="1000"/>
-            <w:tcMar>
-              <w:top w:type="dxa" w:w="30"/>
-              <w:left w:type="dxa" w:w="60"/>
-              <w:bottom w:type="dxa" w:w="30"/>
-              <w:right w:type="dxa" w:w="60"/>
-            </w:tcMar>
-          </w:tcPr>
-          <w:p>
-            <w:hyperlink w:history="1" r:id="rIdoflne4szev2wsxmmuyazf">
+            <w:tcW w:type="dxa" w:w="800"/>
+            <w:tcMar>
+              <w:top w:type="dxa" w:w="30"/>
+              <w:left w:type="dxa" w:w="60"/>
+              <w:bottom w:type="dxa" w:w="30"/>
+              <w:right w:type="dxa" w:w="60"/>
+            </w:tcMar>
+          </w:tcPr>
+          <w:p>
+            <w:hyperlink w:history="1" r:id="rId58vb4u9wakniaxx6xo0uq">
               <w:r>
                 <w:rPr>
                   <w:rFonts w:ascii="Arial" w:cs="Arial" w:eastAsia="Arial" w:hAnsi="Arial"/>
@@ -7223,7 +7223,7 @@
         </w:tc>
         <w:tc>
           <w:tcPr>
-            <w:tcW w:type="dxa" w:w="2600"/>
+            <w:tcW w:type="dxa" w:w="2200"/>
             <w:tcMar>
               <w:top w:type="dxa" w:w="30"/>
               <w:left w:type="dxa" w:w="60"/>
@@ -7246,7 +7246,7 @@
         </w:tc>
         <w:tc>
           <w:tcPr>
-            <w:tcW w:type="dxa" w:w="1200"/>
+            <w:tcW w:type="dxa" w:w="900"/>
             <w:tcMar>
               <w:top w:type="dxa" w:w="30"/>
               <w:left w:type="dxa" w:w="60"/>
@@ -7269,7 +7269,7 @@
         </w:tc>
         <w:tc>
           <w:tcPr>
-            <w:tcW w:type="dxa" w:w="900"/>
+            <w:tcW w:type="dxa" w:w="700"/>
             <w:tcMar>
               <w:top w:type="dxa" w:w="30"/>
               <w:left w:type="dxa" w:w="60"/>
@@ -7292,16 +7292,16 @@
         </w:tc>
         <w:tc>
           <w:tcPr>
-            <w:tcW w:type="dxa" w:w="1000"/>
-            <w:tcMar>
-              <w:top w:type="dxa" w:w="30"/>
-              <w:left w:type="dxa" w:w="60"/>
-              <w:bottom w:type="dxa" w:w="30"/>
-              <w:right w:type="dxa" w:w="60"/>
-            </w:tcMar>
-          </w:tcPr>
-          <w:p>
-            <w:hyperlink w:history="1" r:id="rIdk9pj1o3xdrgucpcp4pntg">
+            <w:tcW w:type="dxa" w:w="800"/>
+            <w:tcMar>
+              <w:top w:type="dxa" w:w="30"/>
+              <w:left w:type="dxa" w:w="60"/>
+              <w:bottom w:type="dxa" w:w="30"/>
+              <w:right w:type="dxa" w:w="60"/>
+            </w:tcMar>
+          </w:tcPr>
+          <w:p>
+            <w:hyperlink w:history="1" r:id="rIdhd9xabdhhjed1th0esthc">
               <w:r>
                 <w:rPr>
                   <w:rFonts w:ascii="Arial" w:cs="Arial" w:eastAsia="Arial" w:hAnsi="Arial"/>
@@ -7318,7 +7318,7 @@
       <w:tr>
         <w:tc>
           <w:tcPr>
-            <w:tcW w:type="dxa" w:w="2600"/>
+            <w:tcW w:type="dxa" w:w="2200"/>
             <w:tcMar>
               <w:top w:type="dxa" w:w="30"/>
               <w:left w:type="dxa" w:w="60"/>
@@ -7341,7 +7341,7 @@
         </w:tc>
         <w:tc>
           <w:tcPr>
-            <w:tcW w:type="dxa" w:w="1200"/>
+            <w:tcW w:type="dxa" w:w="900"/>
             <w:tcMar>
               <w:top w:type="dxa" w:w="30"/>
               <w:left w:type="dxa" w:w="60"/>
@@ -7364,7 +7364,7 @@
         </w:tc>
         <w:tc>
           <w:tcPr>
-            <w:tcW w:type="dxa" w:w="900"/>
+            <w:tcW w:type="dxa" w:w="700"/>
             <w:tcMar>
               <w:top w:type="dxa" w:w="30"/>
               <w:left w:type="dxa" w:w="60"/>
@@ -7387,16 +7387,16 @@
         </w:tc>
         <w:tc>
           <w:tcPr>
-            <w:tcW w:type="dxa" w:w="1000"/>
-            <w:tcMar>
-              <w:top w:type="dxa" w:w="30"/>
-              <w:left w:type="dxa" w:w="60"/>
-              <w:bottom w:type="dxa" w:w="30"/>
-              <w:right w:type="dxa" w:w="60"/>
-            </w:tcMar>
-          </w:tcPr>
-          <w:p>
-            <w:hyperlink w:history="1" r:id="rIdwv5gqykugycxrjvlgr3ap">
+            <w:tcW w:type="dxa" w:w="800"/>
+            <w:tcMar>
+              <w:top w:type="dxa" w:w="30"/>
+              <w:left w:type="dxa" w:w="60"/>
+              <w:bottom w:type="dxa" w:w="30"/>
+              <w:right w:type="dxa" w:w="60"/>
+            </w:tcMar>
+          </w:tcPr>
+          <w:p>
+            <w:hyperlink w:history="1" r:id="rId-5k5ufek-sihjoligus52">
               <w:r>
                 <w:rPr>
                   <w:rFonts w:ascii="Arial" w:cs="Arial" w:eastAsia="Arial" w:hAnsi="Arial"/>
@@ -7411,7 +7411,7 @@
         </w:tc>
         <w:tc>
           <w:tcPr>
-            <w:tcW w:type="dxa" w:w="2600"/>
+            <w:tcW w:type="dxa" w:w="2200"/>
             <w:tcMar>
               <w:top w:type="dxa" w:w="30"/>
               <w:left w:type="dxa" w:w="60"/>
@@ -7434,7 +7434,7 @@
         </w:tc>
         <w:tc>
           <w:tcPr>
-            <w:tcW w:type="dxa" w:w="1200"/>
+            <w:tcW w:type="dxa" w:w="900"/>
             <w:tcMar>
               <w:top w:type="dxa" w:w="30"/>
               <w:left w:type="dxa" w:w="60"/>
@@ -7457,7 +7457,7 @@
         </w:tc>
         <w:tc>
           <w:tcPr>
-            <w:tcW w:type="dxa" w:w="900"/>
+            <w:tcW w:type="dxa" w:w="700"/>
             <w:tcMar>
               <w:top w:type="dxa" w:w="30"/>
               <w:left w:type="dxa" w:w="60"/>
@@ -7480,16 +7480,16 @@
         </w:tc>
         <w:tc>
           <w:tcPr>
-            <w:tcW w:type="dxa" w:w="1000"/>
-            <w:tcMar>
-              <w:top w:type="dxa" w:w="30"/>
-              <w:left w:type="dxa" w:w="60"/>
-              <w:bottom w:type="dxa" w:w="30"/>
-              <w:right w:type="dxa" w:w="60"/>
-            </w:tcMar>
-          </w:tcPr>
-          <w:p>
-            <w:hyperlink w:history="1" r:id="rIdpivwlhwykqo8xcb9-cjlq">
+            <w:tcW w:type="dxa" w:w="800"/>
+            <w:tcMar>
+              <w:top w:type="dxa" w:w="30"/>
+              <w:left w:type="dxa" w:w="60"/>
+              <w:bottom w:type="dxa" w:w="30"/>
+              <w:right w:type="dxa" w:w="60"/>
+            </w:tcMar>
+          </w:tcPr>
+          <w:p>
+            <w:hyperlink w:history="1" r:id="rIderrdx3rutuxbigpkcmxgs">
               <w:r>
                 <w:rPr>
                   <w:rFonts w:ascii="Arial" w:cs="Arial" w:eastAsia="Arial" w:hAnsi="Arial"/>
@@ -7506,7 +7506,7 @@
       <w:tr>
         <w:tc>
           <w:tcPr>
-            <w:tcW w:type="dxa" w:w="2600"/>
+            <w:tcW w:type="dxa" w:w="2200"/>
             <w:tcMar>
               <w:top w:type="dxa" w:w="30"/>
               <w:left w:type="dxa" w:w="60"/>
@@ -7529,7 +7529,7 @@
         </w:tc>
         <w:tc>
           <w:tcPr>
-            <w:tcW w:type="dxa" w:w="1200"/>
+            <w:tcW w:type="dxa" w:w="900"/>
             <w:tcMar>
               <w:top w:type="dxa" w:w="30"/>
               <w:left w:type="dxa" w:w="60"/>
@@ -7552,7 +7552,7 @@
         </w:tc>
         <w:tc>
           <w:tcPr>
-            <w:tcW w:type="dxa" w:w="900"/>
+            <w:tcW w:type="dxa" w:w="700"/>
             <w:tcMar>
               <w:top w:type="dxa" w:w="30"/>
               <w:left w:type="dxa" w:w="60"/>
@@ -7575,16 +7575,16 @@
         </w:tc>
         <w:tc>
           <w:tcPr>
-            <w:tcW w:type="dxa" w:w="1000"/>
-            <w:tcMar>
-              <w:top w:type="dxa" w:w="30"/>
-              <w:left w:type="dxa" w:w="60"/>
-              <w:bottom w:type="dxa" w:w="30"/>
-              <w:right w:type="dxa" w:w="60"/>
-            </w:tcMar>
-          </w:tcPr>
-          <w:p>
-            <w:hyperlink w:history="1" r:id="rIdczjyokbz0jqccjvm4w36p">
+            <w:tcW w:type="dxa" w:w="800"/>
+            <w:tcMar>
+              <w:top w:type="dxa" w:w="30"/>
+              <w:left w:type="dxa" w:w="60"/>
+              <w:bottom w:type="dxa" w:w="30"/>
+              <w:right w:type="dxa" w:w="60"/>
+            </w:tcMar>
+          </w:tcPr>
+          <w:p>
+            <w:hyperlink w:history="1" r:id="rIdvp3mj0l7dbq33umjcvvpv">
               <w:r>
                 <w:rPr>
                   <w:rFonts w:ascii="Arial" w:cs="Arial" w:eastAsia="Arial" w:hAnsi="Arial"/>
@@ -7599,7 +7599,7 @@
         </w:tc>
         <w:tc>
           <w:tcPr>
-            <w:tcW w:type="dxa" w:w="2600"/>
+            <w:tcW w:type="dxa" w:w="2200"/>
             <w:tcMar>
               <w:top w:type="dxa" w:w="30"/>
               <w:left w:type="dxa" w:w="60"/>
@@ -7622,7 +7622,7 @@
         </w:tc>
         <w:tc>
           <w:tcPr>
-            <w:tcW w:type="dxa" w:w="1200"/>
+            <w:tcW w:type="dxa" w:w="900"/>
             <w:tcMar>
               <w:top w:type="dxa" w:w="30"/>
               <w:left w:type="dxa" w:w="60"/>
@@ -7645,7 +7645,7 @@
         </w:tc>
         <w:tc>
           <w:tcPr>
-            <w:tcW w:type="dxa" w:w="900"/>
+            <w:tcW w:type="dxa" w:w="700"/>
             <w:tcMar>
               <w:top w:type="dxa" w:w="30"/>
               <w:left w:type="dxa" w:w="60"/>
@@ -7668,16 +7668,16 @@
         </w:tc>
         <w:tc>
           <w:tcPr>
-            <w:tcW w:type="dxa" w:w="1000"/>
-            <w:tcMar>
-              <w:top w:type="dxa" w:w="30"/>
-              <w:left w:type="dxa" w:w="60"/>
-              <w:bottom w:type="dxa" w:w="30"/>
-              <w:right w:type="dxa" w:w="60"/>
-            </w:tcMar>
-          </w:tcPr>
-          <w:p>
-            <w:hyperlink w:history="1" r:id="rIde7tcgem4ar5lrs-ovyv5u">
+            <w:tcW w:type="dxa" w:w="800"/>
+            <w:tcMar>
+              <w:top w:type="dxa" w:w="30"/>
+              <w:left w:type="dxa" w:w="60"/>
+              <w:bottom w:type="dxa" w:w="30"/>
+              <w:right w:type="dxa" w:w="60"/>
+            </w:tcMar>
+          </w:tcPr>
+          <w:p>
+            <w:hyperlink w:history="1" r:id="rIdp23czsjbtegnuuu-qheek">
               <w:r>
                 <w:rPr>
                   <w:rFonts w:ascii="Arial" w:cs="Arial" w:eastAsia="Arial" w:hAnsi="Arial"/>
@@ -7694,7 +7694,7 @@
       <w:tr>
         <w:tc>
           <w:tcPr>
-            <w:tcW w:type="dxa" w:w="2600"/>
+            <w:tcW w:type="dxa" w:w="2200"/>
             <w:tcMar>
               <w:top w:type="dxa" w:w="30"/>
               <w:left w:type="dxa" w:w="60"/>
@@ -7717,7 +7717,7 @@
         </w:tc>
         <w:tc>
           <w:tcPr>
-            <w:tcW w:type="dxa" w:w="1200"/>
+            <w:tcW w:type="dxa" w:w="900"/>
             <w:tcMar>
               <w:top w:type="dxa" w:w="30"/>
               <w:left w:type="dxa" w:w="60"/>
@@ -7740,7 +7740,7 @@
         </w:tc>
         <w:tc>
           <w:tcPr>
-            <w:tcW w:type="dxa" w:w="900"/>
+            <w:tcW w:type="dxa" w:w="700"/>
             <w:tcMar>
               <w:top w:type="dxa" w:w="30"/>
               <w:left w:type="dxa" w:w="60"/>
@@ -7763,16 +7763,16 @@
         </w:tc>
         <w:tc>
           <w:tcPr>
-            <w:tcW w:type="dxa" w:w="1000"/>
-            <w:tcMar>
-              <w:top w:type="dxa" w:w="30"/>
-              <w:left w:type="dxa" w:w="60"/>
-              <w:bottom w:type="dxa" w:w="30"/>
-              <w:right w:type="dxa" w:w="60"/>
-            </w:tcMar>
-          </w:tcPr>
-          <w:p>
-            <w:hyperlink w:history="1" r:id="rIdb7s7ra74mgeydksr7onxs">
+            <w:tcW w:type="dxa" w:w="800"/>
+            <w:tcMar>
+              <w:top w:type="dxa" w:w="30"/>
+              <w:left w:type="dxa" w:w="60"/>
+              <w:bottom w:type="dxa" w:w="30"/>
+              <w:right w:type="dxa" w:w="60"/>
+            </w:tcMar>
+          </w:tcPr>
+          <w:p>
+            <w:hyperlink w:history="1" r:id="rIdnrmiabdgokdqtwdldsbze">
               <w:r>
                 <w:rPr>
                   <w:rFonts w:ascii="Arial" w:cs="Arial" w:eastAsia="Arial" w:hAnsi="Arial"/>
@@ -7787,7 +7787,7 @@
         </w:tc>
         <w:tc>
           <w:tcPr>
-            <w:tcW w:type="dxa" w:w="2600"/>
+            <w:tcW w:type="dxa" w:w="2200"/>
             <w:tcMar>
               <w:top w:type="dxa" w:w="30"/>
               <w:left w:type="dxa" w:w="60"/>
@@ -7810,7 +7810,7 @@
         </w:tc>
         <w:tc>
           <w:tcPr>
-            <w:tcW w:type="dxa" w:w="1200"/>
+            <w:tcW w:type="dxa" w:w="900"/>
             <w:tcMar>
               <w:top w:type="dxa" w:w="30"/>
               <w:left w:type="dxa" w:w="60"/>
@@ -7833,7 +7833,7 @@
         </w:tc>
         <w:tc>
           <w:tcPr>
-            <w:tcW w:type="dxa" w:w="900"/>
+            <w:tcW w:type="dxa" w:w="700"/>
             <w:tcMar>
               <w:top w:type="dxa" w:w="30"/>
               <w:left w:type="dxa" w:w="60"/>
@@ -7856,16 +7856,16 @@
         </w:tc>
         <w:tc>
           <w:tcPr>
-            <w:tcW w:type="dxa" w:w="1000"/>
-            <w:tcMar>
-              <w:top w:type="dxa" w:w="30"/>
-              <w:left w:type="dxa" w:w="60"/>
-              <w:bottom w:type="dxa" w:w="30"/>
-              <w:right w:type="dxa" w:w="60"/>
-            </w:tcMar>
-          </w:tcPr>
-          <w:p>
-            <w:hyperlink w:history="1" r:id="rIdxc72nglnimji_m8mms-kh">
+            <w:tcW w:type="dxa" w:w="800"/>
+            <w:tcMar>
+              <w:top w:type="dxa" w:w="30"/>
+              <w:left w:type="dxa" w:w="60"/>
+              <w:bottom w:type="dxa" w:w="30"/>
+              <w:right w:type="dxa" w:w="60"/>
+            </w:tcMar>
+          </w:tcPr>
+          <w:p>
+            <w:hyperlink w:history="1" r:id="rIdeczwa0__1ynps33phkixf">
               <w:r>
                 <w:rPr>
                   <w:rFonts w:ascii="Arial" w:cs="Arial" w:eastAsia="Arial" w:hAnsi="Arial"/>
@@ -7882,7 +7882,7 @@
       <w:tr>
         <w:tc>
           <w:tcPr>
-            <w:tcW w:type="dxa" w:w="2600"/>
+            <w:tcW w:type="dxa" w:w="2200"/>
             <w:tcMar>
               <w:top w:type="dxa" w:w="30"/>
               <w:left w:type="dxa" w:w="60"/>
@@ -7905,7 +7905,7 @@
         </w:tc>
         <w:tc>
           <w:tcPr>
-            <w:tcW w:type="dxa" w:w="1200"/>
+            <w:tcW w:type="dxa" w:w="900"/>
             <w:tcMar>
               <w:top w:type="dxa" w:w="30"/>
               <w:left w:type="dxa" w:w="60"/>
@@ -7928,7 +7928,7 @@
         </w:tc>
         <w:tc>
           <w:tcPr>
-            <w:tcW w:type="dxa" w:w="900"/>
+            <w:tcW w:type="dxa" w:w="700"/>
             <w:tcMar>
               <w:top w:type="dxa" w:w="30"/>
               <w:left w:type="dxa" w:w="60"/>
@@ -7951,16 +7951,16 @@
         </w:tc>
         <w:tc>
           <w:tcPr>
-            <w:tcW w:type="dxa" w:w="1000"/>
-            <w:tcMar>
-              <w:top w:type="dxa" w:w="30"/>
-              <w:left w:type="dxa" w:w="60"/>
-              <w:bottom w:type="dxa" w:w="30"/>
-              <w:right w:type="dxa" w:w="60"/>
-            </w:tcMar>
-          </w:tcPr>
-          <w:p>
-            <w:hyperlink w:history="1" r:id="rIdvga19k-r4lz7s9lhsonc5">
+            <w:tcW w:type="dxa" w:w="800"/>
+            <w:tcMar>
+              <w:top w:type="dxa" w:w="30"/>
+              <w:left w:type="dxa" w:w="60"/>
+              <w:bottom w:type="dxa" w:w="30"/>
+              <w:right w:type="dxa" w:w="60"/>
+            </w:tcMar>
+          </w:tcPr>
+          <w:p>
+            <w:hyperlink w:history="1" r:id="rId4rhxu8kr_p1mh6imjkmuj">
               <w:r>
                 <w:rPr>
                   <w:rFonts w:ascii="Arial" w:cs="Arial" w:eastAsia="Arial" w:hAnsi="Arial"/>
@@ -7975,7 +7975,7 @@
         </w:tc>
         <w:tc>
           <w:tcPr>
-            <w:tcW w:type="dxa" w:w="2600"/>
+            <w:tcW w:type="dxa" w:w="2200"/>
             <w:tcMar>
               <w:top w:type="dxa" w:w="30"/>
               <w:left w:type="dxa" w:w="60"/>
@@ -7998,7 +7998,7 @@
         </w:tc>
         <w:tc>
           <w:tcPr>
-            <w:tcW w:type="dxa" w:w="1200"/>
+            <w:tcW w:type="dxa" w:w="900"/>
             <w:tcMar>
               <w:top w:type="dxa" w:w="30"/>
               <w:left w:type="dxa" w:w="60"/>
@@ -8021,7 +8021,7 @@
         </w:tc>
         <w:tc>
           <w:tcPr>
-            <w:tcW w:type="dxa" w:w="900"/>
+            <w:tcW w:type="dxa" w:w="700"/>
             <w:tcMar>
               <w:top w:type="dxa" w:w="30"/>
               <w:left w:type="dxa" w:w="60"/>
@@ -8044,16 +8044,16 @@
         </w:tc>
         <w:tc>
           <w:tcPr>
-            <w:tcW w:type="dxa" w:w="1000"/>
-            <w:tcMar>
-              <w:top w:type="dxa" w:w="30"/>
-              <w:left w:type="dxa" w:w="60"/>
-              <w:bottom w:type="dxa" w:w="30"/>
-              <w:right w:type="dxa" w:w="60"/>
-            </w:tcMar>
-          </w:tcPr>
-          <w:p>
-            <w:hyperlink w:history="1" r:id="rIdz3k5pskdcoxnt4aks_qil">
+            <w:tcW w:type="dxa" w:w="800"/>
+            <w:tcMar>
+              <w:top w:type="dxa" w:w="30"/>
+              <w:left w:type="dxa" w:w="60"/>
+              <w:bottom w:type="dxa" w:w="30"/>
+              <w:right w:type="dxa" w:w="60"/>
+            </w:tcMar>
+          </w:tcPr>
+          <w:p>
+            <w:hyperlink w:history="1" r:id="rIdbkg09m5vh8kr4dndrjp22">
               <w:r>
                 <w:rPr>
                   <w:rFonts w:ascii="Arial" w:cs="Arial" w:eastAsia="Arial" w:hAnsi="Arial"/>
@@ -8070,7 +8070,7 @@
       <w:tr>
         <w:tc>
           <w:tcPr>
-            <w:tcW w:type="dxa" w:w="2600"/>
+            <w:tcW w:type="dxa" w:w="2200"/>
             <w:tcMar>
               <w:top w:type="dxa" w:w="30"/>
               <w:left w:type="dxa" w:w="60"/>
@@ -8093,7 +8093,7 @@
         </w:tc>
         <w:tc>
           <w:tcPr>
-            <w:tcW w:type="dxa" w:w="1200"/>
+            <w:tcW w:type="dxa" w:w="900"/>
             <w:tcMar>
               <w:top w:type="dxa" w:w="30"/>
               <w:left w:type="dxa" w:w="60"/>
@@ -8116,7 +8116,7 @@
         </w:tc>
         <w:tc>
           <w:tcPr>
-            <w:tcW w:type="dxa" w:w="900"/>
+            <w:tcW w:type="dxa" w:w="700"/>
             <w:tcMar>
               <w:top w:type="dxa" w:w="30"/>
               <w:left w:type="dxa" w:w="60"/>
@@ -8139,16 +8139,16 @@
         </w:tc>
         <w:tc>
           <w:tcPr>
-            <w:tcW w:type="dxa" w:w="1000"/>
-            <w:tcMar>
-              <w:top w:type="dxa" w:w="30"/>
-              <w:left w:type="dxa" w:w="60"/>
-              <w:bottom w:type="dxa" w:w="30"/>
-              <w:right w:type="dxa" w:w="60"/>
-            </w:tcMar>
-          </w:tcPr>
-          <w:p>
-            <w:hyperlink w:history="1" r:id="rIdzegjimhe6me_ajftbmklr">
+            <w:tcW w:type="dxa" w:w="800"/>
+            <w:tcMar>
+              <w:top w:type="dxa" w:w="30"/>
+              <w:left w:type="dxa" w:w="60"/>
+              <w:bottom w:type="dxa" w:w="30"/>
+              <w:right w:type="dxa" w:w="60"/>
+            </w:tcMar>
+          </w:tcPr>
+          <w:p>
+            <w:hyperlink w:history="1" r:id="rIdv1zjeo0a5bruryvj-6yxg">
               <w:r>
                 <w:rPr>
                   <w:rFonts w:ascii="Arial" w:cs="Arial" w:eastAsia="Arial" w:hAnsi="Arial"/>
@@ -8163,7 +8163,7 @@
         </w:tc>
         <w:tc>
           <w:tcPr>
-            <w:tcW w:type="dxa" w:w="2600"/>
+            <w:tcW w:type="dxa" w:w="2200"/>
             <w:tcMar>
               <w:top w:type="dxa" w:w="30"/>
               <w:left w:type="dxa" w:w="60"/>
@@ -8186,7 +8186,7 @@
         </w:tc>
         <w:tc>
           <w:tcPr>
-            <w:tcW w:type="dxa" w:w="1200"/>
+            <w:tcW w:type="dxa" w:w="900"/>
             <w:tcMar>
               <w:top w:type="dxa" w:w="30"/>
               <w:left w:type="dxa" w:w="60"/>
@@ -8209,7 +8209,7 @@
         </w:tc>
         <w:tc>
           <w:tcPr>
-            <w:tcW w:type="dxa" w:w="900"/>
+            <w:tcW w:type="dxa" w:w="700"/>
             <w:tcMar>
               <w:top w:type="dxa" w:w="30"/>
               <w:left w:type="dxa" w:w="60"/>
@@ -8232,16 +8232,16 @@
         </w:tc>
         <w:tc>
           <w:tcPr>
-            <w:tcW w:type="dxa" w:w="1000"/>
-            <w:tcMar>
-              <w:top w:type="dxa" w:w="30"/>
-              <w:left w:type="dxa" w:w="60"/>
-              <w:bottom w:type="dxa" w:w="30"/>
-              <w:right w:type="dxa" w:w="60"/>
-            </w:tcMar>
-          </w:tcPr>
-          <w:p>
-            <w:hyperlink w:history="1" r:id="rIdwuco2wup2yqlyuid6scfr">
+            <w:tcW w:type="dxa" w:w="800"/>
+            <w:tcMar>
+              <w:top w:type="dxa" w:w="30"/>
+              <w:left w:type="dxa" w:w="60"/>
+              <w:bottom w:type="dxa" w:w="30"/>
+              <w:right w:type="dxa" w:w="60"/>
+            </w:tcMar>
+          </w:tcPr>
+          <w:p>
+            <w:hyperlink w:history="1" r:id="rIdr51bo_srmgzz_jpoczxqs">
               <w:r>
                 <w:rPr>
                   <w:rFonts w:ascii="Arial" w:cs="Arial" w:eastAsia="Arial" w:hAnsi="Arial"/>
@@ -8258,7 +8258,7 @@
       <w:tr>
         <w:tc>
           <w:tcPr>
-            <w:tcW w:type="dxa" w:w="2600"/>
+            <w:tcW w:type="dxa" w:w="2200"/>
             <w:tcMar>
               <w:top w:type="dxa" w:w="30"/>
               <w:left w:type="dxa" w:w="60"/>
@@ -8281,7 +8281,7 @@
         </w:tc>
         <w:tc>
           <w:tcPr>
-            <w:tcW w:type="dxa" w:w="1200"/>
+            <w:tcW w:type="dxa" w:w="900"/>
             <w:tcMar>
               <w:top w:type="dxa" w:w="30"/>
               <w:left w:type="dxa" w:w="60"/>
@@ -8304,7 +8304,7 @@
         </w:tc>
         <w:tc>
           <w:tcPr>
-            <w:tcW w:type="dxa" w:w="900"/>
+            <w:tcW w:type="dxa" w:w="700"/>
             <w:tcMar>
               <w:top w:type="dxa" w:w="30"/>
               <w:left w:type="dxa" w:w="60"/>
@@ -8327,16 +8327,16 @@
         </w:tc>
         <w:tc>
           <w:tcPr>
-            <w:tcW w:type="dxa" w:w="1000"/>
-            <w:tcMar>
-              <w:top w:type="dxa" w:w="30"/>
-              <w:left w:type="dxa" w:w="60"/>
-              <w:bottom w:type="dxa" w:w="30"/>
-              <w:right w:type="dxa" w:w="60"/>
-            </w:tcMar>
-          </w:tcPr>
-          <w:p>
-            <w:hyperlink w:history="1" r:id="rId8dmfwmgoktfk894srsopm">
+            <w:tcW w:type="dxa" w:w="800"/>
+            <w:tcMar>
+              <w:top w:type="dxa" w:w="30"/>
+              <w:left w:type="dxa" w:w="60"/>
+              <w:bottom w:type="dxa" w:w="30"/>
+              <w:right w:type="dxa" w:w="60"/>
+            </w:tcMar>
+          </w:tcPr>
+          <w:p>
+            <w:hyperlink w:history="1" r:id="rIdpxpbvphhk7tfqazpzcn7z">
               <w:r>
                 <w:rPr>
                   <w:rFonts w:ascii="Arial" w:cs="Arial" w:eastAsia="Arial" w:hAnsi="Arial"/>
@@ -8351,7 +8351,7 @@
         </w:tc>
         <w:tc>
           <w:tcPr>
-            <w:tcW w:type="dxa" w:w="2600"/>
+            <w:tcW w:type="dxa" w:w="2200"/>
             <w:tcMar>
               <w:top w:type="dxa" w:w="30"/>
               <w:left w:type="dxa" w:w="60"/>
@@ -8374,7 +8374,7 @@
         </w:tc>
         <w:tc>
           <w:tcPr>
-            <w:tcW w:type="dxa" w:w="1200"/>
+            <w:tcW w:type="dxa" w:w="900"/>
             <w:tcMar>
               <w:top w:type="dxa" w:w="30"/>
               <w:left w:type="dxa" w:w="60"/>
@@ -8397,7 +8397,7 @@
         </w:tc>
         <w:tc>
           <w:tcPr>
-            <w:tcW w:type="dxa" w:w="900"/>
+            <w:tcW w:type="dxa" w:w="700"/>
             <w:tcMar>
               <w:top w:type="dxa" w:w="30"/>
               <w:left w:type="dxa" w:w="60"/>
@@ -8420,16 +8420,16 @@
         </w:tc>
         <w:tc>
           <w:tcPr>
-            <w:tcW w:type="dxa" w:w="1000"/>
-            <w:tcMar>
-              <w:top w:type="dxa" w:w="30"/>
-              <w:left w:type="dxa" w:w="60"/>
-              <w:bottom w:type="dxa" w:w="30"/>
-              <w:right w:type="dxa" w:w="60"/>
-            </w:tcMar>
-          </w:tcPr>
-          <w:p>
-            <w:hyperlink w:history="1" r:id="rIdo5n-ssw5yukbpgfuodivu">
+            <w:tcW w:type="dxa" w:w="800"/>
+            <w:tcMar>
+              <w:top w:type="dxa" w:w="30"/>
+              <w:left w:type="dxa" w:w="60"/>
+              <w:bottom w:type="dxa" w:w="30"/>
+              <w:right w:type="dxa" w:w="60"/>
+            </w:tcMar>
+          </w:tcPr>
+          <w:p>
+            <w:hyperlink w:history="1" r:id="rIdn2al66o0lylosjw0agoqo">
               <w:r>
                 <w:rPr>
                   <w:rFonts w:ascii="Arial" w:cs="Arial" w:eastAsia="Arial" w:hAnsi="Arial"/>
@@ -8446,7 +8446,7 @@
       <w:tr>
         <w:tc>
           <w:tcPr>
-            <w:tcW w:type="dxa" w:w="2600"/>
+            <w:tcW w:type="dxa" w:w="2200"/>
             <w:tcMar>
               <w:top w:type="dxa" w:w="30"/>
               <w:left w:type="dxa" w:w="60"/>
@@ -8469,7 +8469,7 @@
         </w:tc>
         <w:tc>
           <w:tcPr>
-            <w:tcW w:type="dxa" w:w="1200"/>
+            <w:tcW w:type="dxa" w:w="900"/>
             <w:tcMar>
               <w:top w:type="dxa" w:w="30"/>
               <w:left w:type="dxa" w:w="60"/>
@@ -8492,7 +8492,7 @@
         </w:tc>
         <w:tc>
           <w:tcPr>
-            <w:tcW w:type="dxa" w:w="900"/>
+            <w:tcW w:type="dxa" w:w="700"/>
             <w:tcMar>
               <w:top w:type="dxa" w:w="30"/>
               <w:left w:type="dxa" w:w="60"/>
@@ -8515,16 +8515,16 @@
         </w:tc>
         <w:tc>
           <w:tcPr>
-            <w:tcW w:type="dxa" w:w="1000"/>
-            <w:tcMar>
-              <w:top w:type="dxa" w:w="30"/>
-              <w:left w:type="dxa" w:w="60"/>
-              <w:bottom w:type="dxa" w:w="30"/>
-              <w:right w:type="dxa" w:w="60"/>
-            </w:tcMar>
-          </w:tcPr>
-          <w:p>
-            <w:hyperlink w:history="1" r:id="rId7boosglbaxhua4r3ytxbd">
+            <w:tcW w:type="dxa" w:w="800"/>
+            <w:tcMar>
+              <w:top w:type="dxa" w:w="30"/>
+              <w:left w:type="dxa" w:w="60"/>
+              <w:bottom w:type="dxa" w:w="30"/>
+              <w:right w:type="dxa" w:w="60"/>
+            </w:tcMar>
+          </w:tcPr>
+          <w:p>
+            <w:hyperlink w:history="1" r:id="rId_dgjfcwkwbxouufpcrmjm">
               <w:r>
                 <w:rPr>
                   <w:rFonts w:ascii="Arial" w:cs="Arial" w:eastAsia="Arial" w:hAnsi="Arial"/>
@@ -8539,7 +8539,7 @@
         </w:tc>
         <w:tc>
           <w:tcPr>
-            <w:tcW w:type="dxa" w:w="2600"/>
+            <w:tcW w:type="dxa" w:w="2200"/>
             <w:tcMar>
               <w:top w:type="dxa" w:w="30"/>
               <w:left w:type="dxa" w:w="60"/>
@@ -8562,7 +8562,7 @@
         </w:tc>
         <w:tc>
           <w:tcPr>
-            <w:tcW w:type="dxa" w:w="1200"/>
+            <w:tcW w:type="dxa" w:w="900"/>
             <w:tcMar>
               <w:top w:type="dxa" w:w="30"/>
               <w:left w:type="dxa" w:w="60"/>
@@ -8585,7 +8585,7 @@
         </w:tc>
         <w:tc>
           <w:tcPr>
-            <w:tcW w:type="dxa" w:w="900"/>
+            <w:tcW w:type="dxa" w:w="700"/>
             <w:tcMar>
               <w:top w:type="dxa" w:w="30"/>
               <w:left w:type="dxa" w:w="60"/>
@@ -8608,16 +8608,16 @@
         </w:tc>
         <w:tc>
           <w:tcPr>
-            <w:tcW w:type="dxa" w:w="1000"/>
-            <w:tcMar>
-              <w:top w:type="dxa" w:w="30"/>
-              <w:left w:type="dxa" w:w="60"/>
-              <w:bottom w:type="dxa" w:w="30"/>
-              <w:right w:type="dxa" w:w="60"/>
-            </w:tcMar>
-          </w:tcPr>
-          <w:p>
-            <w:hyperlink w:history="1" r:id="rId2xd2cwlwaazqii7uprwu2">
+            <w:tcW w:type="dxa" w:w="800"/>
+            <w:tcMar>
+              <w:top w:type="dxa" w:w="30"/>
+              <w:left w:type="dxa" w:w="60"/>
+              <w:bottom w:type="dxa" w:w="30"/>
+              <w:right w:type="dxa" w:w="60"/>
+            </w:tcMar>
+          </w:tcPr>
+          <w:p>
+            <w:hyperlink w:history="1" r:id="rIdhqjhmo2s6k1ybfhgc1ogf">
               <w:r>
                 <w:rPr>
                   <w:rFonts w:ascii="Arial" w:cs="Arial" w:eastAsia="Arial" w:hAnsi="Arial"/>
@@ -8634,7 +8634,7 @@
       <w:tr>
         <w:tc>
           <w:tcPr>
-            <w:tcW w:type="dxa" w:w="2600"/>
+            <w:tcW w:type="dxa" w:w="2200"/>
             <w:tcMar>
               <w:top w:type="dxa" w:w="30"/>
               <w:left w:type="dxa" w:w="60"/>
@@ -8657,7 +8657,7 @@
         </w:tc>
         <w:tc>
           <w:tcPr>
-            <w:tcW w:type="dxa" w:w="1200"/>
+            <w:tcW w:type="dxa" w:w="900"/>
             <w:tcMar>
               <w:top w:type="dxa" w:w="30"/>
               <w:left w:type="dxa" w:w="60"/>
@@ -8680,7 +8680,7 @@
         </w:tc>
         <w:tc>
           <w:tcPr>
-            <w:tcW w:type="dxa" w:w="900"/>
+            <w:tcW w:type="dxa" w:w="700"/>
             <w:tcMar>
               <w:top w:type="dxa" w:w="30"/>
               <w:left w:type="dxa" w:w="60"/>
@@ -8703,16 +8703,16 @@
         </w:tc>
         <w:tc>
           <w:tcPr>
-            <w:tcW w:type="dxa" w:w="1000"/>
-            <w:tcMar>
-              <w:top w:type="dxa" w:w="30"/>
-              <w:left w:type="dxa" w:w="60"/>
-              <w:bottom w:type="dxa" w:w="30"/>
-              <w:right w:type="dxa" w:w="60"/>
-            </w:tcMar>
-          </w:tcPr>
-          <w:p>
-            <w:hyperlink w:history="1" r:id="rIdy_5gxz5e4hhcvx9fmavpp">
+            <w:tcW w:type="dxa" w:w="800"/>
+            <w:tcMar>
+              <w:top w:type="dxa" w:w="30"/>
+              <w:left w:type="dxa" w:w="60"/>
+              <w:bottom w:type="dxa" w:w="30"/>
+              <w:right w:type="dxa" w:w="60"/>
+            </w:tcMar>
+          </w:tcPr>
+          <w:p>
+            <w:hyperlink w:history="1" r:id="rIdh9gmz1hyekeuo6blbztxf">
               <w:r>
                 <w:rPr>
                   <w:rFonts w:ascii="Arial" w:cs="Arial" w:eastAsia="Arial" w:hAnsi="Arial"/>
@@ -8727,7 +8727,7 @@
         </w:tc>
         <w:tc>
           <w:tcPr>
-            <w:tcW w:type="dxa" w:w="2600"/>
+            <w:tcW w:type="dxa" w:w="2200"/>
             <w:tcMar>
               <w:top w:type="dxa" w:w="30"/>
               <w:left w:type="dxa" w:w="60"/>
@@ -8750,7 +8750,7 @@
         </w:tc>
         <w:tc>
           <w:tcPr>
-            <w:tcW w:type="dxa" w:w="1200"/>
+            <w:tcW w:type="dxa" w:w="900"/>
             <w:tcMar>
               <w:top w:type="dxa" w:w="30"/>
               <w:left w:type="dxa" w:w="60"/>
@@ -8773,7 +8773,7 @@
         </w:tc>
         <w:tc>
           <w:tcPr>
-            <w:tcW w:type="dxa" w:w="900"/>
+            <w:tcW w:type="dxa" w:w="700"/>
             <w:tcMar>
               <w:top w:type="dxa" w:w="30"/>
               <w:left w:type="dxa" w:w="60"/>
@@ -8796,16 +8796,16 @@
         </w:tc>
         <w:tc>
           <w:tcPr>
-            <w:tcW w:type="dxa" w:w="1000"/>
-            <w:tcMar>
-              <w:top w:type="dxa" w:w="30"/>
-              <w:left w:type="dxa" w:w="60"/>
-              <w:bottom w:type="dxa" w:w="30"/>
-              <w:right w:type="dxa" w:w="60"/>
-            </w:tcMar>
-          </w:tcPr>
-          <w:p>
-            <w:hyperlink w:history="1" r:id="rId4h6tnpfym_dnhrrfwu-t9">
+            <w:tcW w:type="dxa" w:w="800"/>
+            <w:tcMar>
+              <w:top w:type="dxa" w:w="30"/>
+              <w:left w:type="dxa" w:w="60"/>
+              <w:bottom w:type="dxa" w:w="30"/>
+              <w:right w:type="dxa" w:w="60"/>
+            </w:tcMar>
+          </w:tcPr>
+          <w:p>
+            <w:hyperlink w:history="1" r:id="rIdpm3lec-trjldwjaexokff">
               <w:r>
                 <w:rPr>
                   <w:rFonts w:ascii="Arial" w:cs="Arial" w:eastAsia="Arial" w:hAnsi="Arial"/>
@@ -8822,7 +8822,7 @@
       <w:tr>
         <w:tc>
           <w:tcPr>
-            <w:tcW w:type="dxa" w:w="2600"/>
+            <w:tcW w:type="dxa" w:w="2200"/>
             <w:tcMar>
               <w:top w:type="dxa" w:w="30"/>
               <w:left w:type="dxa" w:w="60"/>
@@ -8845,7 +8845,7 @@
         </w:tc>
         <w:tc>
           <w:tcPr>
-            <w:tcW w:type="dxa" w:w="1200"/>
+            <w:tcW w:type="dxa" w:w="900"/>
             <w:tcMar>
               <w:top w:type="dxa" w:w="30"/>
               <w:left w:type="dxa" w:w="60"/>
@@ -8868,7 +8868,7 @@
         </w:tc>
         <w:tc>
           <w:tcPr>
-            <w:tcW w:type="dxa" w:w="900"/>
+            <w:tcW w:type="dxa" w:w="700"/>
             <w:tcMar>
               <w:top w:type="dxa" w:w="30"/>
               <w:left w:type="dxa" w:w="60"/>
@@ -8891,16 +8891,16 @@
         </w:tc>
         <w:tc>
           <w:tcPr>
-            <w:tcW w:type="dxa" w:w="1000"/>
-            <w:tcMar>
-              <w:top w:type="dxa" w:w="30"/>
-              <w:left w:type="dxa" w:w="60"/>
-              <w:bottom w:type="dxa" w:w="30"/>
-              <w:right w:type="dxa" w:w="60"/>
-            </w:tcMar>
-          </w:tcPr>
-          <w:p>
-            <w:hyperlink w:history="1" r:id="rId7spsyzrrfnbtzfqbskntj">
+            <w:tcW w:type="dxa" w:w="800"/>
+            <w:tcMar>
+              <w:top w:type="dxa" w:w="30"/>
+              <w:left w:type="dxa" w:w="60"/>
+              <w:bottom w:type="dxa" w:w="30"/>
+              <w:right w:type="dxa" w:w="60"/>
+            </w:tcMar>
+          </w:tcPr>
+          <w:p>
+            <w:hyperlink w:history="1" r:id="rIdaffwycavltf0gy2u3gypc">
               <w:r>
                 <w:rPr>
                   <w:rFonts w:ascii="Arial" w:cs="Arial" w:eastAsia="Arial" w:hAnsi="Arial"/>
@@ -8915,7 +8915,7 @@
         </w:tc>
         <w:tc>
           <w:tcPr>
-            <w:tcW w:type="dxa" w:w="2600"/>
+            <w:tcW w:type="dxa" w:w="2200"/>
             <w:tcMar>
               <w:top w:type="dxa" w:w="30"/>
               <w:left w:type="dxa" w:w="60"/>
@@ -8938,7 +8938,7 @@
         </w:tc>
         <w:tc>
           <w:tcPr>
-            <w:tcW w:type="dxa" w:w="1200"/>
+            <w:tcW w:type="dxa" w:w="900"/>
             <w:tcMar>
               <w:top w:type="dxa" w:w="30"/>
               <w:left w:type="dxa" w:w="60"/>
@@ -8961,7 +8961,7 @@
         </w:tc>
         <w:tc>
           <w:tcPr>
-            <w:tcW w:type="dxa" w:w="900"/>
+            <w:tcW w:type="dxa" w:w="700"/>
             <w:tcMar>
               <w:top w:type="dxa" w:w="30"/>
               <w:left w:type="dxa" w:w="60"/>
@@ -8984,16 +8984,16 @@
         </w:tc>
         <w:tc>
           <w:tcPr>
-            <w:tcW w:type="dxa" w:w="1000"/>
-            <w:tcMar>
-              <w:top w:type="dxa" w:w="30"/>
-              <w:left w:type="dxa" w:w="60"/>
-              <w:bottom w:type="dxa" w:w="30"/>
-              <w:right w:type="dxa" w:w="60"/>
-            </w:tcMar>
-          </w:tcPr>
-          <w:p>
-            <w:hyperlink w:history="1" r:id="rIdl3yjqnkehhpqk3uq20b-m">
+            <w:tcW w:type="dxa" w:w="800"/>
+            <w:tcMar>
+              <w:top w:type="dxa" w:w="30"/>
+              <w:left w:type="dxa" w:w="60"/>
+              <w:bottom w:type="dxa" w:w="30"/>
+              <w:right w:type="dxa" w:w="60"/>
+            </w:tcMar>
+          </w:tcPr>
+          <w:p>
+            <w:hyperlink w:history="1" r:id="rId-pzht9qgbejamkzqypp8-">
               <w:r>
                 <w:rPr>
                   <w:rFonts w:ascii="Arial" w:cs="Arial" w:eastAsia="Arial" w:hAnsi="Arial"/>
@@ -9010,7 +9010,7 @@
       <w:tr>
         <w:tc>
           <w:tcPr>
-            <w:tcW w:type="dxa" w:w="2600"/>
+            <w:tcW w:type="dxa" w:w="2200"/>
             <w:tcMar>
               <w:top w:type="dxa" w:w="30"/>
               <w:left w:type="dxa" w:w="60"/>
@@ -9033,7 +9033,7 @@
         </w:tc>
         <w:tc>
           <w:tcPr>
-            <w:tcW w:type="dxa" w:w="1200"/>
+            <w:tcW w:type="dxa" w:w="900"/>
             <w:tcMar>
               <w:top w:type="dxa" w:w="30"/>
               <w:left w:type="dxa" w:w="60"/>
@@ -9056,7 +9056,7 @@
         </w:tc>
         <w:tc>
           <w:tcPr>
-            <w:tcW w:type="dxa" w:w="900"/>
+            <w:tcW w:type="dxa" w:w="700"/>
             <w:tcMar>
               <w:top w:type="dxa" w:w="30"/>
               <w:left w:type="dxa" w:w="60"/>
@@ -9079,16 +9079,16 @@
         </w:tc>
         <w:tc>
           <w:tcPr>
-            <w:tcW w:type="dxa" w:w="1000"/>
-            <w:tcMar>
-              <w:top w:type="dxa" w:w="30"/>
-              <w:left w:type="dxa" w:w="60"/>
-              <w:bottom w:type="dxa" w:w="30"/>
-              <w:right w:type="dxa" w:w="60"/>
-            </w:tcMar>
-          </w:tcPr>
-          <w:p>
-            <w:hyperlink w:history="1" r:id="rIdaup73wvsguktyu5dqoef0">
+            <w:tcW w:type="dxa" w:w="800"/>
+            <w:tcMar>
+              <w:top w:type="dxa" w:w="30"/>
+              <w:left w:type="dxa" w:w="60"/>
+              <w:bottom w:type="dxa" w:w="30"/>
+              <w:right w:type="dxa" w:w="60"/>
+            </w:tcMar>
+          </w:tcPr>
+          <w:p>
+            <w:hyperlink w:history="1" r:id="rIdpqctj8vewjrp4kgusukya">
               <w:r>
                 <w:rPr>
                   <w:rFonts w:ascii="Arial" w:cs="Arial" w:eastAsia="Arial" w:hAnsi="Arial"/>
@@ -9103,7 +9103,7 @@
         </w:tc>
         <w:tc>
           <w:tcPr>
-            <w:tcW w:type="dxa" w:w="2600"/>
+            <w:tcW w:type="dxa" w:w="2200"/>
             <w:tcMar>
               <w:top w:type="dxa" w:w="30"/>
               <w:left w:type="dxa" w:w="60"/>
@@ -9126,7 +9126,7 @@
         </w:tc>
         <w:tc>
           <w:tcPr>
-            <w:tcW w:type="dxa" w:w="1200"/>
+            <w:tcW w:type="dxa" w:w="900"/>
             <w:tcMar>
               <w:top w:type="dxa" w:w="30"/>
               <w:left w:type="dxa" w:w="60"/>
@@ -9149,7 +9149,7 @@
         </w:tc>
         <w:tc>
           <w:tcPr>
-            <w:tcW w:type="dxa" w:w="900"/>
+            <w:tcW w:type="dxa" w:w="700"/>
             <w:tcMar>
               <w:top w:type="dxa" w:w="30"/>
               <w:left w:type="dxa" w:w="60"/>
@@ -9172,16 +9172,16 @@
         </w:tc>
         <w:tc>
           <w:tcPr>
-            <w:tcW w:type="dxa" w:w="1000"/>
-            <w:tcMar>
-              <w:top w:type="dxa" w:w="30"/>
-              <w:left w:type="dxa" w:w="60"/>
-              <w:bottom w:type="dxa" w:w="30"/>
-              <w:right w:type="dxa" w:w="60"/>
-            </w:tcMar>
-          </w:tcPr>
-          <w:p>
-            <w:hyperlink w:history="1" r:id="rIdab5uhacnj-7bjwfr5r0ig">
+            <w:tcW w:type="dxa" w:w="800"/>
+            <w:tcMar>
+              <w:top w:type="dxa" w:w="30"/>
+              <w:left w:type="dxa" w:w="60"/>
+              <w:bottom w:type="dxa" w:w="30"/>
+              <w:right w:type="dxa" w:w="60"/>
+            </w:tcMar>
+          </w:tcPr>
+          <w:p>
+            <w:hyperlink w:history="1" r:id="rIdm4thzuscvrrfyrlfemya_">
               <w:r>
                 <w:rPr>
                   <w:rFonts w:ascii="Arial" w:cs="Arial" w:eastAsia="Arial" w:hAnsi="Arial"/>

</xml_diff>